<commit_message>
se suben cv y skill de appdev
</commit_message>
<xml_diff>
--- a/PLANTILLA-DE-CV.docx
+++ b/PLANTILLA-DE-CV.docx
@@ -13,13 +13,23 @@
           <w:lang w:val="es-MX"/>
         </w:rPr>
       </w:pPr>
+      <w:proofErr w:type="gramStart"/>
       <w:r>
         <w:rPr>
           <w:b/>
           <w:bCs/>
           <w:lang w:val="es-MX"/>
         </w:rPr>
-        <w:t>{{ nombre }}</w:t>
+        <w:t>{{ nombre</w:t>
+      </w:r>
+      <w:proofErr w:type="gramEnd"/>
+      <w:r>
+        <w:rPr>
+          <w:b/>
+          <w:bCs/>
+          <w:lang w:val="es-MX"/>
+        </w:rPr>
+        <w:t xml:space="preserve"> }}</w:t>
       </w:r>
     </w:p>
     <w:p>
@@ -31,13 +41,59 @@
           <w:lang w:val="es-MX"/>
         </w:rPr>
       </w:pPr>
+      <w:proofErr w:type="gramStart"/>
       <w:r>
         <w:rPr>
           <w:b/>
           <w:bCs/>
           <w:lang w:val="es-MX"/>
         </w:rPr>
-        <w:t>{{ rol_propuesto }}</w:t>
+        <w:t xml:space="preserve">{{ </w:t>
+      </w:r>
+      <w:proofErr w:type="spellStart"/>
+      <w:r>
+        <w:rPr>
+          <w:b/>
+          <w:bCs/>
+          <w:lang w:val="es-MX"/>
+        </w:rPr>
+        <w:t>rol</w:t>
+      </w:r>
+      <w:proofErr w:type="gramEnd"/>
+      <w:r>
+        <w:rPr>
+          <w:b/>
+          <w:bCs/>
+          <w:lang w:val="es-MX"/>
+        </w:rPr>
+        <w:t>_</w:t>
+      </w:r>
+      <w:proofErr w:type="gramStart"/>
+      <w:r>
+        <w:rPr>
+          <w:b/>
+          <w:bCs/>
+          <w:lang w:val="es-MX"/>
+        </w:rPr>
+        <w:t>propuesto</w:t>
+      </w:r>
+      <w:proofErr w:type="spellEnd"/>
+      <w:r>
+        <w:rPr>
+          <w:b/>
+          <w:bCs/>
+          <w:lang w:val="es-MX"/>
+        </w:rPr>
+        <w:t xml:space="preserve"> }</w:t>
+      </w:r>
+      <w:proofErr w:type="gramEnd"/>
+      <w:r>
+        <w:rPr>
+          <w:b/>
+          <w:bCs/>
+          <w:lang w:val="es-MX"/>
+        </w:rPr>
+        <w:t>}</w:t>
       </w:r>
     </w:p>
     <w:p>
@@ -183,6 +239,7 @@
                 <w:lang w:val="es-419"/>
               </w:rPr>
             </w:pPr>
+            <w:proofErr w:type="gramStart"/>
             <w:r>
               <w:rPr>
                 <w:rFonts w:ascii="Arial" w:eastAsia="Times New Roman" w:hAnsi="Arial" w:cs="Arial"/>
@@ -191,7 +248,40 @@
                 <w:szCs w:val="18"/>
                 <w:lang w:val="en-US" w:eastAsia="es-ES"/>
               </w:rPr>
-              <w:t>{{ resumen_profesional }}</w:t>
+              <w:t xml:space="preserve">{{ </w:t>
+            </w:r>
+            <w:proofErr w:type="spellStart"/>
+            <w:r>
+              <w:rPr>
+                <w:rFonts w:ascii="Arial" w:eastAsia="Times New Roman" w:hAnsi="Arial" w:cs="Arial"/>
+                <w:bCs/>
+                <w:sz w:val="18"/>
+                <w:szCs w:val="18"/>
+                <w:lang w:val="en-US" w:eastAsia="es-ES"/>
+              </w:rPr>
+              <w:t>resumen</w:t>
+            </w:r>
+            <w:proofErr w:type="gramEnd"/>
+            <w:r>
+              <w:rPr>
+                <w:rFonts w:ascii="Arial" w:eastAsia="Times New Roman" w:hAnsi="Arial" w:cs="Arial"/>
+                <w:bCs/>
+                <w:sz w:val="18"/>
+                <w:szCs w:val="18"/>
+                <w:lang w:val="en-US" w:eastAsia="es-ES"/>
+              </w:rPr>
+              <w:t>_profesional</w:t>
+            </w:r>
+            <w:proofErr w:type="spellEnd"/>
+            <w:r>
+              <w:rPr>
+                <w:rFonts w:ascii="Arial" w:eastAsia="Times New Roman" w:hAnsi="Arial" w:cs="Arial"/>
+                <w:bCs/>
+                <w:sz w:val="18"/>
+                <w:szCs w:val="18"/>
+                <w:lang w:val="en-US" w:eastAsia="es-ES"/>
+              </w:rPr>
+              <w:t xml:space="preserve"> }}</w:t>
             </w:r>
           </w:p>
         </w:tc>
@@ -257,7 +347,696 @@
           <w:szCs w:val="18"/>
           <w:lang w:val="en-US"/>
         </w:rPr>
-        <w:t>{% for exp in experiencia_laboral %}</w:t>
+        <w:t xml:space="preserve">{% for exp in </w:t>
+      </w:r>
+      <w:proofErr w:type="spellStart"/>
+      <w:r>
+        <w:rPr>
+          <w:rFonts w:ascii="Arial" w:hAnsi="Arial" w:cs="Arial"/>
+          <w:bCs/>
+          <w:sz w:val="18"/>
+          <w:szCs w:val="18"/>
+          <w:lang w:val="en-US"/>
+        </w:rPr>
+        <w:t>experiencia_</w:t>
+      </w:r>
+      <w:proofErr w:type="gramStart"/>
+      <w:r>
+        <w:rPr>
+          <w:rFonts w:ascii="Arial" w:hAnsi="Arial" w:cs="Arial"/>
+          <w:bCs/>
+          <w:sz w:val="18"/>
+          <w:szCs w:val="18"/>
+          <w:lang w:val="en-US"/>
+        </w:rPr>
+        <w:t>laboral</w:t>
+      </w:r>
+      <w:proofErr w:type="spellEnd"/>
+      <w:r>
+        <w:rPr>
+          <w:rFonts w:ascii="Arial" w:hAnsi="Arial" w:cs="Arial"/>
+          <w:bCs/>
+          <w:sz w:val="18"/>
+          <w:szCs w:val="18"/>
+          <w:lang w:val="en-US"/>
+        </w:rPr>
+        <w:t xml:space="preserve"> %}</w:t>
+      </w:r>
+      <w:proofErr w:type="gramEnd"/>
+    </w:p>
+    <w:tbl>
+      <w:tblPr>
+        <w:tblW w:w="0" w:type="auto"/>
+        <w:tblInd w:w="-75" w:type="dxa"/>
+        <w:tblBorders>
+          <w:top w:val="single" w:sz="4" w:space="0" w:color="auto"/>
+          <w:left w:val="single" w:sz="4" w:space="0" w:color="auto"/>
+          <w:bottom w:val="single" w:sz="4" w:space="0" w:color="auto"/>
+          <w:right w:val="single" w:sz="4" w:space="0" w:color="auto"/>
+          <w:insideH w:val="single" w:sz="4" w:space="0" w:color="auto"/>
+          <w:insideV w:val="single" w:sz="4" w:space="0" w:color="auto"/>
+        </w:tblBorders>
+        <w:tblLayout w:type="fixed"/>
+        <w:tblCellMar>
+          <w:left w:w="105" w:type="dxa"/>
+          <w:right w:w="105" w:type="dxa"/>
+        </w:tblCellMar>
+        <w:tblLook w:val="0000" w:firstRow="0" w:lastRow="0" w:firstColumn="0" w:lastColumn="0" w:noHBand="0" w:noVBand="0"/>
+      </w:tblPr>
+      <w:tblGrid>
+        <w:gridCol w:w="2472"/>
+        <w:gridCol w:w="2472"/>
+        <w:gridCol w:w="2472"/>
+        <w:gridCol w:w="2475"/>
+      </w:tblGrid>
+      <w:tr>
+        <w:tc>
+          <w:tcPr>
+            <w:tcW w:w="2472" w:type="dxa"/>
+          </w:tcPr>
+          <w:p>
+            <w:pPr>
+              <w:rPr>
+                <w:rFonts w:ascii="Arial" w:hAnsi="Arial" w:cs="Arial"/>
+                <w:b/>
+                <w:sz w:val="18"/>
+                <w:szCs w:val="18"/>
+                <w:lang w:val="es-MX"/>
+              </w:rPr>
+            </w:pPr>
+            <w:r>
+              <w:rPr>
+                <w:rFonts w:ascii="Arial" w:hAnsi="Arial" w:cs="Arial"/>
+                <w:b/>
+                <w:sz w:val="18"/>
+                <w:szCs w:val="18"/>
+                <w:lang w:val="es-MX"/>
+              </w:rPr>
+              <w:t>Empresa</w:t>
+            </w:r>
+          </w:p>
+          <w:p>
+            <w:pPr>
+              <w:rPr>
+                <w:rFonts w:ascii="Arial" w:hAnsi="Arial" w:cs="Arial"/>
+                <w:color w:val="0070C0"/>
+                <w:sz w:val="18"/>
+                <w:szCs w:val="18"/>
+                <w:lang w:val="es-MX"/>
+              </w:rPr>
+            </w:pPr>
+            <w:proofErr w:type="gramStart"/>
+            <w:r>
+              <w:rPr>
+                <w:rFonts w:ascii="Arial" w:hAnsi="Arial" w:cs="Arial"/>
+                <w:sz w:val="18"/>
+                <w:szCs w:val="18"/>
+                <w:lang w:val="es-MX"/>
+              </w:rPr>
+              <w:t xml:space="preserve">{{ </w:t>
+            </w:r>
+            <w:proofErr w:type="spellStart"/>
+            <w:r>
+              <w:rPr>
+                <w:rFonts w:ascii="Arial" w:hAnsi="Arial" w:cs="Arial"/>
+                <w:sz w:val="18"/>
+                <w:szCs w:val="18"/>
+                <w:lang w:val="es-MX"/>
+              </w:rPr>
+              <w:t>exp</w:t>
+            </w:r>
+            <w:proofErr w:type="gramEnd"/>
+            <w:r>
+              <w:rPr>
+                <w:rFonts w:ascii="Arial" w:hAnsi="Arial" w:cs="Arial"/>
+                <w:sz w:val="18"/>
+                <w:szCs w:val="18"/>
+                <w:lang w:val="es-MX"/>
+              </w:rPr>
+              <w:t>.empresa</w:t>
+            </w:r>
+            <w:proofErr w:type="spellEnd"/>
+            <w:r>
+              <w:rPr>
+                <w:rFonts w:ascii="Arial" w:hAnsi="Arial" w:cs="Arial"/>
+                <w:sz w:val="18"/>
+                <w:szCs w:val="18"/>
+                <w:lang w:val="es-MX"/>
+              </w:rPr>
+              <w:t xml:space="preserve"> }}</w:t>
+            </w:r>
+          </w:p>
+        </w:tc>
+        <w:tc>
+          <w:tcPr>
+            <w:tcW w:w="2472" w:type="dxa"/>
+          </w:tcPr>
+          <w:p>
+            <w:pPr>
+              <w:rPr>
+                <w:rFonts w:ascii="Arial" w:hAnsi="Arial" w:cs="Arial"/>
+                <w:b/>
+                <w:sz w:val="18"/>
+                <w:szCs w:val="18"/>
+                <w:lang w:val="es-MX"/>
+              </w:rPr>
+            </w:pPr>
+            <w:r>
+              <w:rPr>
+                <w:rFonts w:ascii="Arial" w:hAnsi="Arial" w:cs="Arial"/>
+                <w:b/>
+                <w:sz w:val="18"/>
+                <w:szCs w:val="18"/>
+                <w:lang w:val="es-MX"/>
+              </w:rPr>
+              <w:t>Puesto</w:t>
+            </w:r>
+          </w:p>
+          <w:p>
+            <w:pPr>
+              <w:rPr>
+                <w:rFonts w:ascii="Arial" w:hAnsi="Arial" w:cs="Arial"/>
+                <w:bCs/>
+                <w:sz w:val="18"/>
+                <w:szCs w:val="18"/>
+                <w:lang w:val="es-MX"/>
+              </w:rPr>
+            </w:pPr>
+            <w:proofErr w:type="gramStart"/>
+            <w:r>
+              <w:rPr>
+                <w:rFonts w:ascii="Arial" w:hAnsi="Arial" w:cs="Arial"/>
+                <w:sz w:val="18"/>
+                <w:szCs w:val="18"/>
+                <w:lang w:val="es-MX"/>
+              </w:rPr>
+              <w:t xml:space="preserve">{{ </w:t>
+            </w:r>
+            <w:proofErr w:type="spellStart"/>
+            <w:r>
+              <w:rPr>
+                <w:rFonts w:ascii="Arial" w:hAnsi="Arial" w:cs="Arial"/>
+                <w:sz w:val="18"/>
+                <w:szCs w:val="18"/>
+                <w:lang w:val="es-MX"/>
+              </w:rPr>
+              <w:t>exp</w:t>
+            </w:r>
+            <w:proofErr w:type="gramEnd"/>
+            <w:r>
+              <w:rPr>
+                <w:rFonts w:ascii="Arial" w:hAnsi="Arial" w:cs="Arial"/>
+                <w:sz w:val="18"/>
+                <w:szCs w:val="18"/>
+                <w:lang w:val="es-MX"/>
+              </w:rPr>
+              <w:t>.puesto</w:t>
+            </w:r>
+            <w:proofErr w:type="spellEnd"/>
+            <w:r>
+              <w:rPr>
+                <w:rFonts w:ascii="Arial" w:hAnsi="Arial" w:cs="Arial"/>
+                <w:sz w:val="18"/>
+                <w:szCs w:val="18"/>
+                <w:lang w:val="es-MX"/>
+              </w:rPr>
+              <w:t xml:space="preserve"> }}</w:t>
+            </w:r>
+          </w:p>
+        </w:tc>
+        <w:tc>
+          <w:tcPr>
+            <w:tcW w:w="2472" w:type="dxa"/>
+          </w:tcPr>
+          <w:p>
+            <w:pPr>
+              <w:rPr>
+                <w:rFonts w:ascii="Arial" w:hAnsi="Arial" w:cs="Arial"/>
+                <w:b/>
+                <w:sz w:val="18"/>
+                <w:szCs w:val="18"/>
+                <w:lang w:val="es-MX"/>
+              </w:rPr>
+            </w:pPr>
+            <w:r>
+              <w:rPr>
+                <w:rFonts w:ascii="Arial" w:hAnsi="Arial" w:cs="Arial"/>
+                <w:b/>
+                <w:sz w:val="18"/>
+                <w:szCs w:val="18"/>
+                <w:lang w:val="es-MX"/>
+              </w:rPr>
+              <w:t>Desde:</w:t>
+            </w:r>
+          </w:p>
+          <w:p>
+            <w:pPr>
+              <w:rPr>
+                <w:rFonts w:ascii="Arial" w:hAnsi="Arial" w:cs="Arial"/>
+                <w:bCs/>
+                <w:sz w:val="18"/>
+                <w:szCs w:val="18"/>
+                <w:lang w:val="es-MX"/>
+              </w:rPr>
+            </w:pPr>
+            <w:proofErr w:type="gramStart"/>
+            <w:r>
+              <w:rPr>
+                <w:rFonts w:ascii="Arial" w:hAnsi="Arial" w:cs="Arial"/>
+                <w:sz w:val="18"/>
+                <w:szCs w:val="18"/>
+                <w:lang w:val="es-MX"/>
+              </w:rPr>
+              <w:t xml:space="preserve">{{ </w:t>
+            </w:r>
+            <w:proofErr w:type="spellStart"/>
+            <w:r>
+              <w:rPr>
+                <w:rFonts w:ascii="Arial" w:hAnsi="Arial" w:cs="Arial"/>
+                <w:sz w:val="18"/>
+                <w:szCs w:val="18"/>
+                <w:lang w:val="es-MX"/>
+              </w:rPr>
+              <w:t>exp</w:t>
+            </w:r>
+            <w:proofErr w:type="gramEnd"/>
+            <w:r>
+              <w:rPr>
+                <w:rFonts w:ascii="Arial" w:hAnsi="Arial" w:cs="Arial"/>
+                <w:sz w:val="18"/>
+                <w:szCs w:val="18"/>
+                <w:lang w:val="es-MX"/>
+              </w:rPr>
+              <w:t>.fecha_inicio</w:t>
+            </w:r>
+            <w:proofErr w:type="spellEnd"/>
+            <w:r>
+              <w:rPr>
+                <w:rFonts w:ascii="Arial" w:hAnsi="Arial" w:cs="Arial"/>
+                <w:sz w:val="18"/>
+                <w:szCs w:val="18"/>
+                <w:lang w:val="es-MX"/>
+              </w:rPr>
+              <w:t xml:space="preserve"> }}</w:t>
+            </w:r>
+          </w:p>
+        </w:tc>
+        <w:tc>
+          <w:tcPr>
+            <w:tcW w:w="2475" w:type="dxa"/>
+          </w:tcPr>
+          <w:p>
+            <w:pPr>
+              <w:pStyle w:val="Heading2"/>
+              <w:rPr>
+                <w:bCs w:val="0"/>
+                <w:szCs w:val="18"/>
+                <w:lang w:val="es-MX"/>
+              </w:rPr>
+            </w:pPr>
+            <w:r>
+              <w:rPr>
+                <w:bCs w:val="0"/>
+                <w:szCs w:val="18"/>
+                <w:lang w:val="es-MX"/>
+              </w:rPr>
+              <w:t xml:space="preserve">Hasta: </w:t>
+            </w:r>
+          </w:p>
+          <w:p>
+            <w:pPr>
+              <w:rPr>
+                <w:rFonts w:ascii="Arial" w:hAnsi="Arial" w:cs="Arial"/>
+                <w:sz w:val="18"/>
+                <w:szCs w:val="18"/>
+                <w:lang w:val="es-MX"/>
+              </w:rPr>
+            </w:pPr>
+            <w:proofErr w:type="gramStart"/>
+            <w:r>
+              <w:rPr>
+                <w:rFonts w:ascii="Arial" w:hAnsi="Arial" w:cs="Arial"/>
+                <w:sz w:val="18"/>
+                <w:szCs w:val="18"/>
+                <w:lang w:val="es-MX"/>
+              </w:rPr>
+              <w:t xml:space="preserve">{{ </w:t>
+            </w:r>
+            <w:proofErr w:type="spellStart"/>
+            <w:r>
+              <w:rPr>
+                <w:rFonts w:ascii="Arial" w:hAnsi="Arial" w:cs="Arial"/>
+                <w:sz w:val="18"/>
+                <w:szCs w:val="18"/>
+                <w:lang w:val="es-MX"/>
+              </w:rPr>
+              <w:t>exp</w:t>
+            </w:r>
+            <w:proofErr w:type="gramEnd"/>
+            <w:r>
+              <w:rPr>
+                <w:rFonts w:ascii="Arial" w:hAnsi="Arial" w:cs="Arial"/>
+                <w:sz w:val="18"/>
+                <w:szCs w:val="18"/>
+                <w:lang w:val="es-MX"/>
+              </w:rPr>
+              <w:t>.fecha_fin</w:t>
+            </w:r>
+            <w:proofErr w:type="spellEnd"/>
+            <w:r>
+              <w:rPr>
+                <w:rFonts w:ascii="Arial" w:hAnsi="Arial" w:cs="Arial"/>
+                <w:sz w:val="18"/>
+                <w:szCs w:val="18"/>
+                <w:lang w:val="es-MX"/>
+              </w:rPr>
+              <w:t xml:space="preserve"> }}</w:t>
+            </w:r>
+          </w:p>
+        </w:tc>
+      </w:tr>
+    </w:tbl>
+    <w:p>
+      <w:pPr>
+        <w:rPr>
+          <w:rFonts w:ascii="Arial" w:hAnsi="Arial" w:cs="Arial"/>
+          <w:bCs/>
+          <w:sz w:val="18"/>
+          <w:szCs w:val="18"/>
+          <w:lang w:val="en-US"/>
+        </w:rPr>
+      </w:pPr>
+    </w:p>
+    <w:tbl>
+      <w:tblPr>
+        <w:tblW w:w="0" w:type="auto"/>
+        <w:tblInd w:w="-75" w:type="dxa"/>
+        <w:tblBorders>
+          <w:top w:val="single" w:sz="4" w:space="0" w:color="auto"/>
+          <w:left w:val="single" w:sz="4" w:space="0" w:color="auto"/>
+          <w:bottom w:val="single" w:sz="4" w:space="0" w:color="auto"/>
+          <w:right w:val="single" w:sz="4" w:space="0" w:color="auto"/>
+          <w:insideH w:val="single" w:sz="4" w:space="0" w:color="auto"/>
+          <w:insideV w:val="single" w:sz="4" w:space="0" w:color="auto"/>
+        </w:tblBorders>
+        <w:tblLayout w:type="fixed"/>
+        <w:tblCellMar>
+          <w:left w:w="105" w:type="dxa"/>
+          <w:right w:w="105" w:type="dxa"/>
+        </w:tblCellMar>
+        <w:tblLook w:val="0000" w:firstRow="0" w:lastRow="0" w:firstColumn="0" w:lastColumn="0" w:noHBand="0" w:noVBand="0"/>
+      </w:tblPr>
+      <w:tblGrid>
+        <w:gridCol w:w="2070"/>
+        <w:gridCol w:w="7821"/>
+      </w:tblGrid>
+      <w:tr>
+        <w:tc>
+          <w:tcPr>
+            <w:tcW w:w="2070" w:type="dxa"/>
+          </w:tcPr>
+          <w:p>
+            <w:pPr>
+              <w:rPr>
+                <w:rFonts w:ascii="Arial" w:hAnsi="Arial" w:cs="Arial"/>
+                <w:b/>
+                <w:bCs/>
+                <w:sz w:val="18"/>
+                <w:szCs w:val="18"/>
+              </w:rPr>
+            </w:pPr>
+            <w:r>
+              <w:rPr>
+                <w:rFonts w:ascii="Arial" w:hAnsi="Arial" w:cs="Arial"/>
+                <w:b/>
+                <w:bCs/>
+                <w:sz w:val="18"/>
+                <w:szCs w:val="18"/>
+                <w:lang w:val="es-MX"/>
+              </w:rPr>
+              <w:t>Actividades Principales</w:t>
+            </w:r>
+          </w:p>
+        </w:tc>
+        <w:tc>
+          <w:tcPr>
+            <w:tcW w:w="7821" w:type="dxa"/>
+          </w:tcPr>
+          <w:p>
+            <w:pPr>
+              <w:pStyle w:val="NoSpacing"/>
+              <w:ind w:left="0"/>
+              <w:jc w:val="both"/>
+              <w:rPr>
+                <w:sz w:val="18"/>
+                <w:szCs w:val="20"/>
+              </w:rPr>
+            </w:pPr>
+            <w:r>
+              <w:rPr>
+                <w:sz w:val="18"/>
+                <w:szCs w:val="20"/>
+              </w:rPr>
+              <w:t xml:space="preserve">{% for act in </w:t>
+            </w:r>
+            <w:proofErr w:type="spellStart"/>
+            <w:proofErr w:type="gramStart"/>
+            <w:r>
+              <w:rPr>
+                <w:sz w:val="18"/>
+                <w:szCs w:val="20"/>
+              </w:rPr>
+              <w:t>exp.actividades</w:t>
+            </w:r>
+            <w:proofErr w:type="spellEnd"/>
+            <w:proofErr w:type="gramEnd"/>
+            <w:r>
+              <w:rPr>
+                <w:sz w:val="18"/>
+                <w:szCs w:val="20"/>
+              </w:rPr>
+              <w:t xml:space="preserve"> </w:t>
+            </w:r>
+            <w:proofErr w:type="gramStart"/>
+            <w:r>
+              <w:rPr>
+                <w:sz w:val="18"/>
+                <w:szCs w:val="20"/>
+              </w:rPr>
+              <w:t>%}•</w:t>
+            </w:r>
+            <w:proofErr w:type="gramEnd"/>
+            <w:r>
+              <w:rPr>
+                <w:sz w:val="18"/>
+                <w:szCs w:val="20"/>
+              </w:rPr>
+              <w:t xml:space="preserve"> </w:t>
+            </w:r>
+            <w:proofErr w:type="gramStart"/>
+            <w:r>
+              <w:rPr>
+                <w:sz w:val="18"/>
+                <w:szCs w:val="20"/>
+              </w:rPr>
+              <w:t>{{ act</w:t>
+            </w:r>
+            <w:proofErr w:type="gramEnd"/>
+            <w:r>
+              <w:rPr>
+                <w:sz w:val="18"/>
+                <w:szCs w:val="20"/>
+              </w:rPr>
+              <w:t xml:space="preserve"> }}</w:t>
+            </w:r>
+          </w:p>
+          <w:p>
+            <w:pPr>
+              <w:pStyle w:val="NoSpacing"/>
+              <w:ind w:left="0"/>
+              <w:jc w:val="both"/>
+              <w:rPr>
+                <w:szCs w:val="22"/>
+              </w:rPr>
+            </w:pPr>
+            <w:r>
+              <w:rPr>
+                <w:sz w:val="18"/>
+                <w:szCs w:val="20"/>
+              </w:rPr>
+              <w:t xml:space="preserve">{% </w:t>
+            </w:r>
+            <w:proofErr w:type="spellStart"/>
+            <w:r>
+              <w:rPr>
+                <w:sz w:val="18"/>
+                <w:szCs w:val="20"/>
+              </w:rPr>
+              <w:t>endfor</w:t>
+            </w:r>
+            <w:proofErr w:type="spellEnd"/>
+            <w:r>
+              <w:rPr>
+                <w:sz w:val="18"/>
+                <w:szCs w:val="20"/>
+              </w:rPr>
+              <w:t xml:space="preserve"> %}</w:t>
+            </w:r>
+          </w:p>
+        </w:tc>
+      </w:tr>
+    </w:tbl>
+    <w:p>
+      <w:pPr>
+        <w:rPr>
+          <w:rFonts w:ascii="Arial" w:hAnsi="Arial" w:cs="Arial"/>
+          <w:bCs/>
+          <w:sz w:val="18"/>
+          <w:szCs w:val="18"/>
+          <w:lang w:val="es-419"/>
+        </w:rPr>
+      </w:pPr>
+      <w:r>
+        <w:rPr>
+          <w:rFonts w:ascii="Arial" w:hAnsi="Arial" w:cs="Arial"/>
+          <w:bCs/>
+          <w:sz w:val="18"/>
+          <w:szCs w:val="18"/>
+          <w:lang w:val="es-419"/>
+        </w:rPr>
+        <w:t xml:space="preserve">{% </w:t>
+      </w:r>
+      <w:proofErr w:type="spellStart"/>
+      <w:r>
+        <w:rPr>
+          <w:rFonts w:ascii="Arial" w:hAnsi="Arial" w:cs="Arial"/>
+          <w:bCs/>
+          <w:sz w:val="18"/>
+          <w:szCs w:val="18"/>
+          <w:lang w:val="es-419"/>
+        </w:rPr>
+        <w:t>endfor</w:t>
+      </w:r>
+      <w:proofErr w:type="spellEnd"/>
+      <w:r>
+        <w:rPr>
+          <w:rFonts w:ascii="Arial" w:hAnsi="Arial" w:cs="Arial"/>
+          <w:bCs/>
+          <w:sz w:val="18"/>
+          <w:szCs w:val="18"/>
+          <w:lang w:val="es-419"/>
+        </w:rPr>
+        <w:t xml:space="preserve"> </w:t>
+      </w:r>
+      <w:proofErr w:type="gramStart"/>
+      <w:r>
+        <w:rPr>
+          <w:rFonts w:ascii="Arial" w:hAnsi="Arial" w:cs="Arial"/>
+          <w:bCs/>
+          <w:sz w:val="18"/>
+          <w:szCs w:val="18"/>
+          <w:lang w:val="es-419"/>
+        </w:rPr>
+        <w:t>%}</w:t>
+      </w:r>
+      <w:r>
+        <w:rPr>
+          <w:rFonts w:ascii="Arial" w:hAnsi="Arial" w:cs="Arial"/>
+          <w:bCs/>
+          <w:sz w:val="18"/>
+          <w:szCs w:val="18"/>
+          <w:lang w:val="es-MX"/>
+        </w:rPr>
+        <w:t>{</w:t>
+      </w:r>
+      <w:proofErr w:type="gramEnd"/>
+      <w:r>
+        <w:rPr>
+          <w:rFonts w:ascii="Arial" w:hAnsi="Arial" w:cs="Arial"/>
+          <w:bCs/>
+          <w:sz w:val="18"/>
+          <w:szCs w:val="18"/>
+          <w:lang w:val="es-MX"/>
+        </w:rPr>
+        <w:t xml:space="preserve">% </w:t>
+      </w:r>
+      <w:proofErr w:type="spellStart"/>
+      <w:r>
+        <w:rPr>
+          <w:rFonts w:ascii="Arial" w:hAnsi="Arial" w:cs="Arial"/>
+          <w:bCs/>
+          <w:sz w:val="18"/>
+          <w:szCs w:val="18"/>
+          <w:lang w:val="es-MX"/>
+        </w:rPr>
+        <w:t>if</w:t>
+      </w:r>
+      <w:proofErr w:type="spellEnd"/>
+      <w:r>
+        <w:rPr>
+          <w:rFonts w:ascii="Arial" w:hAnsi="Arial" w:cs="Arial"/>
+          <w:bCs/>
+          <w:sz w:val="18"/>
+          <w:szCs w:val="18"/>
+          <w:lang w:val="es-MX"/>
+        </w:rPr>
+        <w:t xml:space="preserve"> </w:t>
+      </w:r>
+      <w:proofErr w:type="spellStart"/>
+      <w:r>
+        <w:rPr>
+          <w:rFonts w:ascii="Arial" w:hAnsi="Arial" w:cs="Arial"/>
+          <w:bCs/>
+          <w:sz w:val="18"/>
+          <w:szCs w:val="18"/>
+          <w:lang w:val="es-MX"/>
+        </w:rPr>
+        <w:t>ajuste_puesto_liderazgo</w:t>
+      </w:r>
+      <w:proofErr w:type="spellEnd"/>
+      <w:r>
+        <w:rPr>
+          <w:rFonts w:ascii="Arial" w:hAnsi="Arial" w:cs="Arial"/>
+          <w:bCs/>
+          <w:sz w:val="18"/>
+          <w:szCs w:val="18"/>
+          <w:lang w:val="es-MX"/>
+        </w:rPr>
+        <w:t xml:space="preserve"> and </w:t>
+      </w:r>
+      <w:proofErr w:type="spellStart"/>
+      <w:r>
+        <w:rPr>
+          <w:rFonts w:ascii="Arial" w:hAnsi="Arial" w:cs="Arial"/>
+          <w:bCs/>
+          <w:sz w:val="18"/>
+          <w:szCs w:val="18"/>
+          <w:lang w:val="es-MX"/>
+        </w:rPr>
+        <w:t>ajuste_puesto_</w:t>
+      </w:r>
+      <w:proofErr w:type="gramStart"/>
+      <w:r>
+        <w:rPr>
+          <w:rFonts w:ascii="Arial" w:hAnsi="Arial" w:cs="Arial"/>
+          <w:bCs/>
+          <w:sz w:val="18"/>
+          <w:szCs w:val="18"/>
+          <w:lang w:val="es-MX"/>
+        </w:rPr>
+        <w:t>liderazgo.puesto</w:t>
+      </w:r>
+      <w:proofErr w:type="spellEnd"/>
+      <w:proofErr w:type="gramEnd"/>
+      <w:r>
+        <w:rPr>
+          <w:rFonts w:ascii="Arial" w:hAnsi="Arial" w:cs="Arial"/>
+          <w:bCs/>
+          <w:sz w:val="18"/>
+          <w:szCs w:val="18"/>
+          <w:lang w:val="es-MX"/>
+        </w:rPr>
+        <w:t xml:space="preserve"> %}</w:t>
       </w:r>
     </w:p>
     <w:tbl>
@@ -321,14 +1100,56 @@
                 <w:lang w:val="es-MX"/>
               </w:rPr>
             </w:pPr>
-            <w:r>
-              <w:rPr>
-                <w:rFonts w:ascii="Arial" w:hAnsi="Arial" w:cs="Arial"/>
-                <w:sz w:val="18"/>
-                <w:szCs w:val="18"/>
-                <w:lang w:val="es-MX"/>
-              </w:rPr>
-              <w:t>{{ exp.empresa }}</w:t>
+            <w:proofErr w:type="gramStart"/>
+            <w:r>
+              <w:rPr>
+                <w:rFonts w:ascii="Arial" w:hAnsi="Arial" w:cs="Arial"/>
+                <w:sz w:val="18"/>
+                <w:szCs w:val="18"/>
+                <w:lang w:val="es-MX"/>
+              </w:rPr>
+              <w:t xml:space="preserve">{{ </w:t>
+            </w:r>
+            <w:proofErr w:type="spellStart"/>
+            <w:r>
+              <w:rPr>
+                <w:rFonts w:ascii="Arial" w:hAnsi="Arial" w:cs="Arial"/>
+                <w:sz w:val="18"/>
+                <w:szCs w:val="18"/>
+                <w:lang w:val="es-MX"/>
+              </w:rPr>
+              <w:t>ajuste</w:t>
+            </w:r>
+            <w:proofErr w:type="gramEnd"/>
+            <w:r>
+              <w:rPr>
+                <w:rFonts w:ascii="Arial" w:hAnsi="Arial" w:cs="Arial"/>
+                <w:sz w:val="18"/>
+                <w:szCs w:val="18"/>
+                <w:lang w:val="es-MX"/>
+              </w:rPr>
+              <w:t>_puesto_</w:t>
+            </w:r>
+            <w:proofErr w:type="gramStart"/>
+            <w:r>
+              <w:rPr>
+                <w:rFonts w:ascii="Arial" w:hAnsi="Arial" w:cs="Arial"/>
+                <w:sz w:val="18"/>
+                <w:szCs w:val="18"/>
+                <w:lang w:val="es-MX"/>
+              </w:rPr>
+              <w:t>liderazgo.empresa</w:t>
+            </w:r>
+            <w:proofErr w:type="spellEnd"/>
+            <w:proofErr w:type="gramEnd"/>
+            <w:r>
+              <w:rPr>
+                <w:rFonts w:ascii="Arial" w:hAnsi="Arial" w:cs="Arial"/>
+                <w:sz w:val="18"/>
+                <w:szCs w:val="18"/>
+                <w:lang w:val="es-MX"/>
+              </w:rPr>
+              <w:t xml:space="preserve"> }}</w:t>
             </w:r>
           </w:p>
         </w:tc>
@@ -367,14 +1188,56 @@
                 <w:lang w:val="es-MX"/>
               </w:rPr>
             </w:pPr>
-            <w:r>
-              <w:rPr>
-                <w:rFonts w:ascii="Arial" w:hAnsi="Arial" w:cs="Arial"/>
-                <w:sz w:val="18"/>
-                <w:szCs w:val="18"/>
-                <w:lang w:val="es-MX"/>
-              </w:rPr>
-              <w:t>{{ exp.puesto }}</w:t>
+            <w:proofErr w:type="gramStart"/>
+            <w:r>
+              <w:rPr>
+                <w:rFonts w:ascii="Arial" w:hAnsi="Arial" w:cs="Arial"/>
+                <w:sz w:val="18"/>
+                <w:szCs w:val="18"/>
+                <w:lang w:val="es-MX"/>
+              </w:rPr>
+              <w:t xml:space="preserve">{{ </w:t>
+            </w:r>
+            <w:proofErr w:type="spellStart"/>
+            <w:r>
+              <w:rPr>
+                <w:rFonts w:ascii="Arial" w:hAnsi="Arial" w:cs="Arial"/>
+                <w:sz w:val="18"/>
+                <w:szCs w:val="18"/>
+                <w:lang w:val="es-MX"/>
+              </w:rPr>
+              <w:t>ajuste</w:t>
+            </w:r>
+            <w:proofErr w:type="gramEnd"/>
+            <w:r>
+              <w:rPr>
+                <w:rFonts w:ascii="Arial" w:hAnsi="Arial" w:cs="Arial"/>
+                <w:sz w:val="18"/>
+                <w:szCs w:val="18"/>
+                <w:lang w:val="es-MX"/>
+              </w:rPr>
+              <w:t>_puesto_</w:t>
+            </w:r>
+            <w:proofErr w:type="gramStart"/>
+            <w:r>
+              <w:rPr>
+                <w:rFonts w:ascii="Arial" w:hAnsi="Arial" w:cs="Arial"/>
+                <w:sz w:val="18"/>
+                <w:szCs w:val="18"/>
+                <w:lang w:val="es-MX"/>
+              </w:rPr>
+              <w:t>liderazgo.puesto</w:t>
+            </w:r>
+            <w:proofErr w:type="spellEnd"/>
+            <w:proofErr w:type="gramEnd"/>
+            <w:r>
+              <w:rPr>
+                <w:rFonts w:ascii="Arial" w:hAnsi="Arial" w:cs="Arial"/>
+                <w:sz w:val="18"/>
+                <w:szCs w:val="18"/>
+                <w:lang w:val="es-MX"/>
+              </w:rPr>
+              <w:t xml:space="preserve"> }}</w:t>
             </w:r>
           </w:p>
         </w:tc>
@@ -413,14 +1276,74 @@
                 <w:lang w:val="es-MX"/>
               </w:rPr>
             </w:pPr>
-            <w:r>
-              <w:rPr>
-                <w:rFonts w:ascii="Arial" w:hAnsi="Arial" w:cs="Arial"/>
-                <w:sz w:val="18"/>
-                <w:szCs w:val="18"/>
-                <w:lang w:val="es-MX"/>
-              </w:rPr>
-              <w:t>{{ exp.fecha_inicio }}</w:t>
+            <w:proofErr w:type="gramStart"/>
+            <w:r>
+              <w:rPr>
+                <w:rFonts w:ascii="Arial" w:hAnsi="Arial" w:cs="Arial"/>
+                <w:sz w:val="18"/>
+                <w:szCs w:val="18"/>
+                <w:lang w:val="es-MX"/>
+              </w:rPr>
+              <w:t xml:space="preserve">{{ </w:t>
+            </w:r>
+            <w:proofErr w:type="spellStart"/>
+            <w:r>
+              <w:rPr>
+                <w:rFonts w:ascii="Arial" w:hAnsi="Arial" w:cs="Arial"/>
+                <w:sz w:val="18"/>
+                <w:szCs w:val="18"/>
+                <w:lang w:val="es-MX"/>
+              </w:rPr>
+              <w:t>ajuste</w:t>
+            </w:r>
+            <w:proofErr w:type="gramEnd"/>
+            <w:r>
+              <w:rPr>
+                <w:rFonts w:ascii="Arial" w:hAnsi="Arial" w:cs="Arial"/>
+                <w:sz w:val="18"/>
+                <w:szCs w:val="18"/>
+                <w:lang w:val="es-MX"/>
+              </w:rPr>
+              <w:t>_puesto_</w:t>
+            </w:r>
+            <w:proofErr w:type="gramStart"/>
+            <w:r>
+              <w:rPr>
+                <w:rFonts w:ascii="Arial" w:hAnsi="Arial" w:cs="Arial"/>
+                <w:sz w:val="18"/>
+                <w:szCs w:val="18"/>
+                <w:lang w:val="es-MX"/>
+              </w:rPr>
+              <w:t>liderazgo.</w:t>
+            </w:r>
+            <w:r>
+              <w:rPr>
+                <w:rFonts w:ascii="Arial" w:hAnsi="Arial" w:cs="Arial"/>
+                <w:sz w:val="18"/>
+                <w:szCs w:val="18"/>
+                <w:lang w:val="es-MX"/>
+              </w:rPr>
+              <w:t>fecha</w:t>
+            </w:r>
+            <w:proofErr w:type="gramEnd"/>
+            <w:r>
+              <w:rPr>
+                <w:rFonts w:ascii="Arial" w:hAnsi="Arial" w:cs="Arial"/>
+                <w:sz w:val="18"/>
+                <w:szCs w:val="18"/>
+                <w:lang w:val="es-MX"/>
+              </w:rPr>
+              <w:t>_inicio</w:t>
+            </w:r>
+            <w:proofErr w:type="spellEnd"/>
+            <w:r>
+              <w:rPr>
+                <w:rFonts w:ascii="Arial" w:hAnsi="Arial" w:cs="Arial"/>
+                <w:sz w:val="18"/>
+                <w:szCs w:val="18"/>
+                <w:lang w:val="es-MX"/>
+              </w:rPr>
+              <w:t xml:space="preserve"> }}</w:t>
             </w:r>
           </w:p>
         </w:tc>
@@ -455,394 +1378,66 @@
                 <w:lang w:val="es-MX"/>
               </w:rPr>
             </w:pPr>
-            <w:r>
-              <w:rPr>
-                <w:rFonts w:ascii="Arial" w:hAnsi="Arial" w:cs="Arial"/>
-                <w:sz w:val="18"/>
-                <w:szCs w:val="18"/>
-                <w:lang w:val="es-MX"/>
-              </w:rPr>
-              <w:t>{{ exp.fecha_fin }}</w:t>
-            </w:r>
-          </w:p>
-        </w:tc>
-      </w:tr>
-    </w:tbl>
-    <w:p>
-      <w:pPr>
-        <w:rPr>
-          <w:rFonts w:ascii="Arial" w:hAnsi="Arial" w:cs="Arial"/>
-          <w:bCs/>
-          <w:sz w:val="18"/>
-          <w:szCs w:val="18"/>
-          <w:lang w:val="en-US"/>
-        </w:rPr>
-      </w:pPr>
-    </w:p>
-    <w:tbl>
-      <w:tblPr>
-        <w:tblW w:w="0" w:type="auto"/>
-        <w:tblInd w:w="-75" w:type="dxa"/>
-        <w:tblBorders>
-          <w:top w:val="single" w:sz="4" w:space="0" w:color="auto"/>
-          <w:left w:val="single" w:sz="4" w:space="0" w:color="auto"/>
-          <w:bottom w:val="single" w:sz="4" w:space="0" w:color="auto"/>
-          <w:right w:val="single" w:sz="4" w:space="0" w:color="auto"/>
-          <w:insideH w:val="single" w:sz="4" w:space="0" w:color="auto"/>
-          <w:insideV w:val="single" w:sz="4" w:space="0" w:color="auto"/>
-        </w:tblBorders>
-        <w:tblLayout w:type="fixed"/>
-        <w:tblCellMar>
-          <w:left w:w="105" w:type="dxa"/>
-          <w:right w:w="105" w:type="dxa"/>
-        </w:tblCellMar>
-        <w:tblLook w:val="0000" w:firstRow="0" w:lastRow="0" w:firstColumn="0" w:lastColumn="0" w:noHBand="0" w:noVBand="0"/>
-      </w:tblPr>
-      <w:tblGrid>
-        <w:gridCol w:w="2070"/>
-        <w:gridCol w:w="7821"/>
-      </w:tblGrid>
-      <w:tr>
-        <w:tc>
-          <w:tcPr>
-            <w:tcW w:w="2070" w:type="dxa"/>
-          </w:tcPr>
-          <w:p>
-            <w:pPr>
-              <w:rPr>
-                <w:rFonts w:ascii="Arial" w:hAnsi="Arial" w:cs="Arial"/>
-                <w:b/>
-                <w:bCs/>
-                <w:sz w:val="18"/>
-                <w:szCs w:val="18"/>
-              </w:rPr>
-            </w:pPr>
-            <w:r>
-              <w:rPr>
-                <w:rFonts w:ascii="Arial" w:hAnsi="Arial" w:cs="Arial"/>
-                <w:b/>
-                <w:bCs/>
-                <w:sz w:val="18"/>
-                <w:szCs w:val="18"/>
-                <w:lang w:val="es-MX"/>
-              </w:rPr>
-              <w:t>Actividades Principales</w:t>
-            </w:r>
-          </w:p>
-        </w:tc>
-        <w:tc>
-          <w:tcPr>
-            <w:tcW w:w="7821" w:type="dxa"/>
-          </w:tcPr>
-          <w:p>
-            <w:pPr>
-              <w:pStyle w:val="NoSpacing"/>
-              <w:ind w:left="0"/>
-              <w:jc w:val="both"/>
-              <w:rPr>
-                <w:sz w:val="18"/>
-                <w:szCs w:val="20"/>
-              </w:rPr>
-            </w:pPr>
-            <w:r>
-              <w:rPr>
-                <w:sz w:val="18"/>
-                <w:szCs w:val="20"/>
-              </w:rPr>
-              <w:t>{% for act in exp.actividades %}• {{ act }}</w:t>
-            </w:r>
-          </w:p>
-          <w:p>
-            <w:pPr>
-              <w:pStyle w:val="NoSpacing"/>
-              <w:ind w:left="0"/>
-              <w:jc w:val="both"/>
-              <w:rPr>
-                <w:szCs w:val="22"/>
-              </w:rPr>
-            </w:pPr>
-            <w:r>
-              <w:rPr>
-                <w:sz w:val="18"/>
-                <w:szCs w:val="20"/>
-              </w:rPr>
-              <w:t>{% endfor %}</w:t>
-            </w:r>
-          </w:p>
-        </w:tc>
-      </w:tr>
-    </w:tbl>
-    <w:p>
-      <w:pPr>
-        <w:rPr>
-          <w:rFonts w:ascii="Arial" w:hAnsi="Arial" w:cs="Arial"/>
-          <w:bCs/>
-          <w:sz w:val="18"/>
-          <w:szCs w:val="18"/>
-          <w:lang w:val="es-419"/>
-        </w:rPr>
-      </w:pPr>
-      <w:r>
-        <w:rPr>
-          <w:rFonts w:ascii="Arial" w:hAnsi="Arial" w:cs="Arial"/>
-          <w:bCs/>
-          <w:sz w:val="18"/>
-          <w:szCs w:val="18"/>
-          <w:lang w:val="es-419"/>
-        </w:rPr>
-        <w:t>{% endfor %}</w:t>
-      </w:r>
-      <w:r>
-        <w:rPr>
-          <w:rFonts w:ascii="Arial" w:hAnsi="Arial" w:cs="Arial"/>
-          <w:bCs/>
-          <w:sz w:val="18"/>
-          <w:szCs w:val="18"/>
-          <w:lang w:val="es-MX"/>
-        </w:rPr>
-        <w:t>{% if ajuste_puesto_liderazgo and ajuste_puesto_liderazgo.puesto %}</w:t>
-      </w:r>
-    </w:p>
-    <w:tbl>
-      <w:tblPr>
-        <w:tblW w:w="0" w:type="auto"/>
-        <w:tblInd w:w="-75" w:type="dxa"/>
-        <w:tblBorders>
-          <w:top w:val="single" w:sz="4" w:space="0" w:color="auto"/>
-          <w:left w:val="single" w:sz="4" w:space="0" w:color="auto"/>
-          <w:bottom w:val="single" w:sz="4" w:space="0" w:color="auto"/>
-          <w:right w:val="single" w:sz="4" w:space="0" w:color="auto"/>
-          <w:insideH w:val="single" w:sz="4" w:space="0" w:color="auto"/>
-          <w:insideV w:val="single" w:sz="4" w:space="0" w:color="auto"/>
-        </w:tblBorders>
-        <w:tblLayout w:type="fixed"/>
-        <w:tblCellMar>
-          <w:left w:w="105" w:type="dxa"/>
-          <w:right w:w="105" w:type="dxa"/>
-        </w:tblCellMar>
-        <w:tblLook w:val="0000" w:firstRow="0" w:lastRow="0" w:firstColumn="0" w:lastColumn="0" w:noHBand="0" w:noVBand="0"/>
-      </w:tblPr>
-      <w:tblGrid>
-        <w:gridCol w:w="2472"/>
-        <w:gridCol w:w="2472"/>
-        <w:gridCol w:w="2472"/>
-        <w:gridCol w:w="2475"/>
-      </w:tblGrid>
-      <w:tr>
-        <w:tc>
-          <w:tcPr>
-            <w:tcW w:w="2472" w:type="dxa"/>
-          </w:tcPr>
-          <w:p>
-            <w:pPr>
-              <w:rPr>
-                <w:rFonts w:ascii="Arial" w:hAnsi="Arial" w:cs="Arial"/>
-                <w:b/>
-                <w:sz w:val="18"/>
-                <w:szCs w:val="18"/>
-                <w:lang w:val="es-MX"/>
-              </w:rPr>
-            </w:pPr>
-            <w:r>
-              <w:rPr>
-                <w:rFonts w:ascii="Arial" w:hAnsi="Arial" w:cs="Arial"/>
-                <w:b/>
-                <w:sz w:val="18"/>
-                <w:szCs w:val="18"/>
-                <w:lang w:val="es-MX"/>
-              </w:rPr>
-              <w:t>Empresa</w:t>
-            </w:r>
-          </w:p>
-          <w:p>
-            <w:pPr>
-              <w:rPr>
-                <w:rFonts w:ascii="Arial" w:hAnsi="Arial" w:cs="Arial"/>
-                <w:color w:val="0070C0"/>
-                <w:sz w:val="18"/>
-                <w:szCs w:val="18"/>
-                <w:lang w:val="es-MX"/>
-              </w:rPr>
-            </w:pPr>
-            <w:r>
-              <w:rPr>
-                <w:rFonts w:ascii="Arial" w:hAnsi="Arial" w:cs="Arial"/>
-                <w:sz w:val="18"/>
-                <w:szCs w:val="18"/>
-                <w:lang w:val="es-MX"/>
-              </w:rPr>
-              <w:t>{{ ajuste_puesto_liderazgo.empresa }}</w:t>
-            </w:r>
-          </w:p>
-        </w:tc>
-        <w:tc>
-          <w:tcPr>
-            <w:tcW w:w="2472" w:type="dxa"/>
-          </w:tcPr>
-          <w:p>
-            <w:pPr>
-              <w:rPr>
-                <w:rFonts w:ascii="Arial" w:hAnsi="Arial" w:cs="Arial"/>
-                <w:b/>
-                <w:sz w:val="18"/>
-                <w:szCs w:val="18"/>
-                <w:lang w:val="es-MX"/>
-              </w:rPr>
-            </w:pPr>
-            <w:r>
-              <w:rPr>
-                <w:rFonts w:ascii="Arial" w:hAnsi="Arial" w:cs="Arial"/>
-                <w:b/>
-                <w:sz w:val="18"/>
-                <w:szCs w:val="18"/>
-                <w:lang w:val="es-MX"/>
-              </w:rPr>
-              <w:t>Puesto</w:t>
-            </w:r>
-          </w:p>
-          <w:p>
-            <w:pPr>
-              <w:rPr>
-                <w:rFonts w:ascii="Arial" w:hAnsi="Arial" w:cs="Arial"/>
-                <w:bCs/>
-                <w:sz w:val="18"/>
-                <w:szCs w:val="18"/>
-                <w:lang w:val="es-MX"/>
-              </w:rPr>
-            </w:pPr>
-            <w:r>
-              <w:rPr>
-                <w:rFonts w:ascii="Arial" w:hAnsi="Arial" w:cs="Arial"/>
-                <w:sz w:val="18"/>
-                <w:szCs w:val="18"/>
-                <w:lang w:val="es-MX"/>
-              </w:rPr>
-              <w:t>{{ ajuste_puesto_liderazgo.puesto }}</w:t>
-            </w:r>
-          </w:p>
-        </w:tc>
-        <w:tc>
-          <w:tcPr>
-            <w:tcW w:w="2472" w:type="dxa"/>
-          </w:tcPr>
-          <w:p>
-            <w:pPr>
-              <w:rPr>
-                <w:rFonts w:ascii="Arial" w:hAnsi="Arial" w:cs="Arial"/>
-                <w:b/>
-                <w:sz w:val="18"/>
-                <w:szCs w:val="18"/>
-                <w:lang w:val="es-MX"/>
-              </w:rPr>
-            </w:pPr>
-            <w:r>
-              <w:rPr>
-                <w:rFonts w:ascii="Arial" w:hAnsi="Arial" w:cs="Arial"/>
-                <w:b/>
-                <w:sz w:val="18"/>
-                <w:szCs w:val="18"/>
-                <w:lang w:val="es-MX"/>
-              </w:rPr>
-              <w:t>Desde:</w:t>
-            </w:r>
-          </w:p>
-          <w:p>
-            <w:pPr>
-              <w:rPr>
-                <w:rFonts w:ascii="Arial" w:hAnsi="Arial" w:cs="Arial"/>
-                <w:bCs/>
-                <w:sz w:val="18"/>
-                <w:szCs w:val="18"/>
-                <w:lang w:val="es-MX"/>
-              </w:rPr>
-            </w:pPr>
-            <w:r>
-              <w:rPr>
-                <w:rFonts w:ascii="Arial" w:hAnsi="Arial" w:cs="Arial"/>
-                <w:sz w:val="18"/>
-                <w:szCs w:val="18"/>
-                <w:lang w:val="es-MX"/>
-              </w:rPr>
-              <w:t>{{ ajuste_puesto_liderazgo.</w:t>
-            </w:r>
-            <w:r>
-              <w:rPr>
-                <w:rFonts w:ascii="Arial" w:hAnsi="Arial" w:cs="Arial"/>
-                <w:sz w:val="18"/>
-                <w:szCs w:val="18"/>
-                <w:lang w:val="es-MX"/>
-              </w:rPr>
-              <w:t>fecha_inicio</w:t>
-            </w:r>
-            <w:r>
-              <w:rPr>
-                <w:rFonts w:ascii="Arial" w:hAnsi="Arial" w:cs="Arial"/>
-                <w:sz w:val="18"/>
-                <w:szCs w:val="18"/>
-                <w:lang w:val="es-MX"/>
-              </w:rPr>
-              <w:t xml:space="preserve"> }}</w:t>
-            </w:r>
-          </w:p>
-        </w:tc>
-        <w:tc>
-          <w:tcPr>
-            <w:tcW w:w="2475" w:type="dxa"/>
-          </w:tcPr>
-          <w:p>
-            <w:pPr>
-              <w:pStyle w:val="Heading2"/>
-              <w:rPr>
-                <w:bCs w:val="0"/>
-                <w:szCs w:val="18"/>
-                <w:lang w:val="es-MX"/>
-              </w:rPr>
-            </w:pPr>
-            <w:r>
-              <w:rPr>
-                <w:bCs w:val="0"/>
-                <w:szCs w:val="18"/>
-                <w:lang w:val="es-MX"/>
-              </w:rPr>
-              <w:t xml:space="preserve">Hasta: </w:t>
-            </w:r>
-          </w:p>
-          <w:p>
-            <w:pPr>
-              <w:rPr>
-                <w:rFonts w:ascii="Arial" w:hAnsi="Arial" w:cs="Arial"/>
-                <w:sz w:val="18"/>
-                <w:szCs w:val="18"/>
-                <w:lang w:val="es-MX"/>
-              </w:rPr>
-            </w:pPr>
-            <w:r>
-              <w:rPr>
-                <w:rFonts w:ascii="Arial" w:hAnsi="Arial" w:cs="Arial"/>
-                <w:sz w:val="18"/>
-                <w:szCs w:val="18"/>
-                <w:lang w:val="es-MX"/>
-              </w:rPr>
-              <w:t>{{ ajuste_puesto_liderazgo.</w:t>
-            </w:r>
-            <w:r>
-              <w:rPr>
-                <w:rFonts w:ascii="Arial" w:hAnsi="Arial" w:cs="Arial"/>
-                <w:sz w:val="18"/>
-                <w:szCs w:val="18"/>
-                <w:lang w:val="es-MX"/>
-              </w:rPr>
-              <w:t>fecha_</w:t>
-            </w:r>
-            <w:r>
-              <w:rPr>
-                <w:rFonts w:ascii="Arial" w:hAnsi="Arial" w:cs="Arial"/>
-                <w:sz w:val="18"/>
-                <w:szCs w:val="18"/>
-                <w:lang w:val="es-MX"/>
-              </w:rPr>
-              <w:t>fin</w:t>
-            </w:r>
+            <w:proofErr w:type="gramStart"/>
+            <w:r>
+              <w:rPr>
+                <w:rFonts w:ascii="Arial" w:hAnsi="Arial" w:cs="Arial"/>
+                <w:sz w:val="18"/>
+                <w:szCs w:val="18"/>
+                <w:lang w:val="es-MX"/>
+              </w:rPr>
+              <w:t xml:space="preserve">{{ </w:t>
+            </w:r>
+            <w:proofErr w:type="spellStart"/>
+            <w:r>
+              <w:rPr>
+                <w:rFonts w:ascii="Arial" w:hAnsi="Arial" w:cs="Arial"/>
+                <w:sz w:val="18"/>
+                <w:szCs w:val="18"/>
+                <w:lang w:val="es-MX"/>
+              </w:rPr>
+              <w:t>ajuste</w:t>
+            </w:r>
+            <w:proofErr w:type="gramEnd"/>
+            <w:r>
+              <w:rPr>
+                <w:rFonts w:ascii="Arial" w:hAnsi="Arial" w:cs="Arial"/>
+                <w:sz w:val="18"/>
+                <w:szCs w:val="18"/>
+                <w:lang w:val="es-MX"/>
+              </w:rPr>
+              <w:t>_puesto_</w:t>
+            </w:r>
+            <w:proofErr w:type="gramStart"/>
+            <w:r>
+              <w:rPr>
+                <w:rFonts w:ascii="Arial" w:hAnsi="Arial" w:cs="Arial"/>
+                <w:sz w:val="18"/>
+                <w:szCs w:val="18"/>
+                <w:lang w:val="es-MX"/>
+              </w:rPr>
+              <w:t>liderazgo.</w:t>
+            </w:r>
+            <w:r>
+              <w:rPr>
+                <w:rFonts w:ascii="Arial" w:hAnsi="Arial" w:cs="Arial"/>
+                <w:sz w:val="18"/>
+                <w:szCs w:val="18"/>
+                <w:lang w:val="es-MX"/>
+              </w:rPr>
+              <w:t>fecha</w:t>
+            </w:r>
+            <w:proofErr w:type="gramEnd"/>
+            <w:r>
+              <w:rPr>
+                <w:rFonts w:ascii="Arial" w:hAnsi="Arial" w:cs="Arial"/>
+                <w:sz w:val="18"/>
+                <w:szCs w:val="18"/>
+                <w:lang w:val="es-MX"/>
+              </w:rPr>
+              <w:t>_fin</w:t>
+            </w:r>
+            <w:proofErr w:type="spellEnd"/>
             <w:r>
               <w:rPr>
                 <w:rFonts w:ascii="Arial" w:hAnsi="Arial" w:cs="Arial"/>
@@ -937,14 +1532,71 @@
                 <w:sz w:val="18"/>
                 <w:szCs w:val="20"/>
               </w:rPr>
-              <w:t>{% for act in ajuste_puesto_liderazgo.actividades %}</w:t>
-            </w:r>
+              <w:t xml:space="preserve">{% for act in </w:t>
+            </w:r>
+            <w:proofErr w:type="spellStart"/>
             <w:r>
               <w:rPr>
                 <w:sz w:val="18"/>
                 <w:szCs w:val="20"/>
               </w:rPr>
-              <w:t>• {{ act }}</w:t>
+              <w:t>ajuste_puesto_</w:t>
+            </w:r>
+            <w:proofErr w:type="gramStart"/>
+            <w:r>
+              <w:rPr>
+                <w:sz w:val="18"/>
+                <w:szCs w:val="20"/>
+              </w:rPr>
+              <w:t>liderazgo.actividades</w:t>
+            </w:r>
+            <w:proofErr w:type="spellEnd"/>
+            <w:proofErr w:type="gramEnd"/>
+            <w:r>
+              <w:rPr>
+                <w:sz w:val="18"/>
+                <w:szCs w:val="20"/>
+              </w:rPr>
+              <w:t xml:space="preserve"> </w:t>
+            </w:r>
+            <w:proofErr w:type="gramStart"/>
+            <w:r>
+              <w:rPr>
+                <w:sz w:val="18"/>
+                <w:szCs w:val="20"/>
+              </w:rPr>
+              <w:t>%}</w:t>
+            </w:r>
+            <w:r>
+              <w:rPr>
+                <w:sz w:val="18"/>
+                <w:szCs w:val="20"/>
+              </w:rPr>
+              <w:t>•</w:t>
+            </w:r>
+            <w:proofErr w:type="gramEnd"/>
+            <w:r>
+              <w:rPr>
+                <w:sz w:val="18"/>
+                <w:szCs w:val="20"/>
+              </w:rPr>
+              <w:t xml:space="preserve"> </w:t>
+            </w:r>
+            <w:proofErr w:type="gramStart"/>
+            <w:r>
+              <w:rPr>
+                <w:sz w:val="18"/>
+                <w:szCs w:val="20"/>
+              </w:rPr>
+              <w:t>{{ act</w:t>
+            </w:r>
+            <w:proofErr w:type="gramEnd"/>
+            <w:r>
+              <w:rPr>
+                <w:sz w:val="18"/>
+                <w:szCs w:val="20"/>
+              </w:rPr>
+              <w:t xml:space="preserve"> }}</w:t>
             </w:r>
           </w:p>
           <w:p>
@@ -961,7 +1613,23 @@
                 <w:sz w:val="18"/>
                 <w:szCs w:val="20"/>
               </w:rPr>
-              <w:t>{% endfor %}</w:t>
+              <w:t xml:space="preserve">{% </w:t>
+            </w:r>
+            <w:proofErr w:type="spellStart"/>
+            <w:r>
+              <w:rPr>
+                <w:sz w:val="18"/>
+                <w:szCs w:val="20"/>
+              </w:rPr>
+              <w:t>endfor</w:t>
+            </w:r>
+            <w:proofErr w:type="spellEnd"/>
+            <w:r>
+              <w:rPr>
+                <w:sz w:val="18"/>
+                <w:szCs w:val="20"/>
+              </w:rPr>
+              <w:t xml:space="preserve"> %}</w:t>
             </w:r>
           </w:p>
         </w:tc>
@@ -1028,7 +1696,84 @@
           <w:szCs w:val="18"/>
           <w:lang w:val="en-US"/>
         </w:rPr>
-        <w:t>{% if resumen_laboral_text|default('')|trim %}</w:t>
+        <w:t xml:space="preserve">{% if </w:t>
+      </w:r>
+      <w:proofErr w:type="spellStart"/>
+      <w:r>
+        <w:rPr>
+          <w:rFonts w:ascii="Arial" w:hAnsi="Arial" w:cs="Arial"/>
+          <w:bCs/>
+          <w:sz w:val="18"/>
+          <w:szCs w:val="18"/>
+          <w:lang w:val="en-US"/>
+        </w:rPr>
+        <w:t>resumen_laboral_text|</w:t>
+      </w:r>
+      <w:proofErr w:type="gramStart"/>
+      <w:r>
+        <w:rPr>
+          <w:rFonts w:ascii="Arial" w:hAnsi="Arial" w:cs="Arial"/>
+          <w:bCs/>
+          <w:sz w:val="18"/>
+          <w:szCs w:val="18"/>
+          <w:lang w:val="en-US"/>
+        </w:rPr>
+        <w:t>default</w:t>
+      </w:r>
+      <w:proofErr w:type="spellEnd"/>
+      <w:r>
+        <w:rPr>
+          <w:rFonts w:ascii="Arial" w:hAnsi="Arial" w:cs="Arial"/>
+          <w:bCs/>
+          <w:sz w:val="18"/>
+          <w:szCs w:val="18"/>
+          <w:lang w:val="en-US"/>
+        </w:rPr>
+        <w:t>(</w:t>
+      </w:r>
+      <w:proofErr w:type="gramEnd"/>
+      <w:r>
+        <w:rPr>
+          <w:rFonts w:ascii="Arial" w:hAnsi="Arial" w:cs="Arial"/>
+          <w:bCs/>
+          <w:sz w:val="18"/>
+          <w:szCs w:val="18"/>
+          <w:lang w:val="en-US"/>
+        </w:rPr>
+        <w:t>'</w:t>
+      </w:r>
+      <w:proofErr w:type="gramStart"/>
+      <w:r>
+        <w:rPr>
+          <w:rFonts w:ascii="Arial" w:hAnsi="Arial" w:cs="Arial"/>
+          <w:bCs/>
+          <w:sz w:val="18"/>
+          <w:szCs w:val="18"/>
+          <w:lang w:val="en-US"/>
+        </w:rPr>
+        <w:t>')|</w:t>
+      </w:r>
+      <w:proofErr w:type="gramEnd"/>
+      <w:r>
+        <w:rPr>
+          <w:rFonts w:ascii="Arial" w:hAnsi="Arial" w:cs="Arial"/>
+          <w:bCs/>
+          <w:sz w:val="18"/>
+          <w:szCs w:val="18"/>
+          <w:lang w:val="en-US"/>
+        </w:rPr>
+        <w:t xml:space="preserve">trim </w:t>
+      </w:r>
+      <w:proofErr w:type="gramStart"/>
+      <w:r>
+        <w:rPr>
+          <w:rFonts w:ascii="Arial" w:hAnsi="Arial" w:cs="Arial"/>
+          <w:bCs/>
+          <w:sz w:val="18"/>
+          <w:szCs w:val="18"/>
+          <w:lang w:val="en-US"/>
+        </w:rPr>
+        <w:t>%}</w:t>
       </w:r>
       <w:r>
         <w:rPr>
@@ -1039,7 +1784,19 @@
           <w:u w:val="single"/>
           <w:lang w:val="en-US"/>
         </w:rPr>
-        <w:t>HISTORIAL PROFESIONAL ADICIONAL</w:t>
+        <w:t>HISTORIAL</w:t>
+      </w:r>
+      <w:proofErr w:type="gramEnd"/>
+      <w:r>
+        <w:rPr>
+          <w:rFonts w:ascii="Arial" w:hAnsi="Arial" w:cs="Arial"/>
+          <w:b/>
+          <w:sz w:val="18"/>
+          <w:szCs w:val="18"/>
+          <w:u w:val="single"/>
+          <w:lang w:val="en-US"/>
+        </w:rPr>
+        <w:t xml:space="preserve"> PROFESIONAL ADICIONAL</w:t>
       </w:r>
     </w:p>
     <w:p>
@@ -1063,6 +1820,7 @@
           <w:lang w:val="es-MX"/>
         </w:rPr>
       </w:pPr>
+      <w:proofErr w:type="gramStart"/>
       <w:r>
         <w:rPr>
           <w:rFonts w:ascii="Arial" w:hAnsi="Arial" w:cs="Arial"/>
@@ -1071,7 +1829,62 @@
           <w:szCs w:val="18"/>
           <w:lang w:val="es-MX"/>
         </w:rPr>
-        <w:t>{{ periodo_resumen_laboral }}</w:t>
+        <w:t xml:space="preserve">{{ </w:t>
+      </w:r>
+      <w:proofErr w:type="spellStart"/>
+      <w:r>
+        <w:rPr>
+          <w:rFonts w:ascii="Arial" w:hAnsi="Arial" w:cs="Arial"/>
+          <w:bCs/>
+          <w:sz w:val="18"/>
+          <w:szCs w:val="18"/>
+          <w:lang w:val="es-MX"/>
+        </w:rPr>
+        <w:t>periodo</w:t>
+      </w:r>
+      <w:proofErr w:type="gramEnd"/>
+      <w:r>
+        <w:rPr>
+          <w:rFonts w:ascii="Arial" w:hAnsi="Arial" w:cs="Arial"/>
+          <w:bCs/>
+          <w:sz w:val="18"/>
+          <w:szCs w:val="18"/>
+          <w:lang w:val="es-MX"/>
+        </w:rPr>
+        <w:t>_resumen_</w:t>
+      </w:r>
+      <w:proofErr w:type="gramStart"/>
+      <w:r>
+        <w:rPr>
+          <w:rFonts w:ascii="Arial" w:hAnsi="Arial" w:cs="Arial"/>
+          <w:bCs/>
+          <w:sz w:val="18"/>
+          <w:szCs w:val="18"/>
+          <w:lang w:val="es-MX"/>
+        </w:rPr>
+        <w:t>laboral</w:t>
+      </w:r>
+      <w:proofErr w:type="spellEnd"/>
+      <w:r>
+        <w:rPr>
+          <w:rFonts w:ascii="Arial" w:hAnsi="Arial" w:cs="Arial"/>
+          <w:bCs/>
+          <w:sz w:val="18"/>
+          <w:szCs w:val="18"/>
+          <w:lang w:val="es-MX"/>
+        </w:rPr>
+        <w:t xml:space="preserve"> }</w:t>
+      </w:r>
+      <w:proofErr w:type="gramEnd"/>
+      <w:r>
+        <w:rPr>
+          <w:rFonts w:ascii="Arial" w:hAnsi="Arial" w:cs="Arial"/>
+          <w:bCs/>
+          <w:sz w:val="18"/>
+          <w:szCs w:val="18"/>
+          <w:lang w:val="es-MX"/>
+        </w:rPr>
+        <w:t>}</w:t>
       </w:r>
     </w:p>
     <w:p>
@@ -1096,6 +1909,7 @@
           <w:lang w:val="es-MX"/>
         </w:rPr>
       </w:pPr>
+      <w:proofErr w:type="gramStart"/>
       <w:r>
         <w:rPr>
           <w:rFonts w:ascii="Arial" w:hAnsi="Arial" w:cs="Arial"/>
@@ -1104,7 +1918,62 @@
           <w:szCs w:val="18"/>
           <w:lang w:val="es-MX"/>
         </w:rPr>
-        <w:t>{{ resumen_laboral_text }}</w:t>
+        <w:t xml:space="preserve">{{ </w:t>
+      </w:r>
+      <w:proofErr w:type="spellStart"/>
+      <w:r>
+        <w:rPr>
+          <w:rFonts w:ascii="Arial" w:hAnsi="Arial" w:cs="Arial"/>
+          <w:bCs/>
+          <w:sz w:val="18"/>
+          <w:szCs w:val="18"/>
+          <w:lang w:val="es-MX"/>
+        </w:rPr>
+        <w:t>resumen</w:t>
+      </w:r>
+      <w:proofErr w:type="gramEnd"/>
+      <w:r>
+        <w:rPr>
+          <w:rFonts w:ascii="Arial" w:hAnsi="Arial" w:cs="Arial"/>
+          <w:bCs/>
+          <w:sz w:val="18"/>
+          <w:szCs w:val="18"/>
+          <w:lang w:val="es-MX"/>
+        </w:rPr>
+        <w:t>_laboral_</w:t>
+      </w:r>
+      <w:proofErr w:type="gramStart"/>
+      <w:r>
+        <w:rPr>
+          <w:rFonts w:ascii="Arial" w:hAnsi="Arial" w:cs="Arial"/>
+          <w:bCs/>
+          <w:sz w:val="18"/>
+          <w:szCs w:val="18"/>
+          <w:lang w:val="es-MX"/>
+        </w:rPr>
+        <w:t>text</w:t>
+      </w:r>
+      <w:proofErr w:type="spellEnd"/>
+      <w:r>
+        <w:rPr>
+          <w:rFonts w:ascii="Arial" w:hAnsi="Arial" w:cs="Arial"/>
+          <w:bCs/>
+          <w:sz w:val="18"/>
+          <w:szCs w:val="18"/>
+          <w:lang w:val="es-MX"/>
+        </w:rPr>
+        <w:t xml:space="preserve"> }</w:t>
+      </w:r>
+      <w:proofErr w:type="gramEnd"/>
+      <w:r>
+        <w:rPr>
+          <w:rFonts w:ascii="Arial" w:hAnsi="Arial" w:cs="Arial"/>
+          <w:bCs/>
+          <w:sz w:val="18"/>
+          <w:szCs w:val="18"/>
+          <w:lang w:val="es-MX"/>
+        </w:rPr>
+        <w:t>}</w:t>
       </w:r>
     </w:p>
     <w:p>
@@ -1251,7 +2120,7 @@
       <w:tr>
         <w:tc>
           <w:tcPr>
-            <w:tcW w:w="5688" w:type="dxa"/>
+            <w:tcW w:w="5649" w:type="dxa"/>
           </w:tcPr>
           <w:p>
             <w:pPr>
@@ -1262,6 +2131,7 @@
                 <w:lang w:val="es-MX"/>
               </w:rPr>
             </w:pPr>
+            <w:proofErr w:type="gramStart"/>
             <w:r>
               <w:rPr>
                 <w:rFonts w:ascii="Arial" w:hAnsi="Arial" w:cs="Arial"/>
@@ -1270,13 +2140,46 @@
                 <w:szCs w:val="18"/>
                 <w:lang w:val="es-MX"/>
               </w:rPr>
-              <w:t>{{ estudios_titulo }}</w:t>
+              <w:t xml:space="preserve">{{ </w:t>
+            </w:r>
+            <w:proofErr w:type="spellStart"/>
+            <w:r>
+              <w:rPr>
+                <w:rFonts w:ascii="Arial" w:hAnsi="Arial" w:cs="Arial"/>
+                <w:bCs/>
+                <w:sz w:val="18"/>
+                <w:szCs w:val="18"/>
+                <w:lang w:val="es-MX"/>
+              </w:rPr>
+              <w:t>estudios</w:t>
+            </w:r>
+            <w:proofErr w:type="gramEnd"/>
+            <w:r>
+              <w:rPr>
+                <w:rFonts w:ascii="Arial" w:hAnsi="Arial" w:cs="Arial"/>
+                <w:bCs/>
+                <w:sz w:val="18"/>
+                <w:szCs w:val="18"/>
+                <w:lang w:val="es-MX"/>
+              </w:rPr>
+              <w:t>_titulo</w:t>
+            </w:r>
+            <w:proofErr w:type="spellEnd"/>
+            <w:r>
+              <w:rPr>
+                <w:rFonts w:ascii="Arial" w:hAnsi="Arial" w:cs="Arial"/>
+                <w:bCs/>
+                <w:sz w:val="18"/>
+                <w:szCs w:val="18"/>
+                <w:lang w:val="es-MX"/>
+              </w:rPr>
+              <w:t xml:space="preserve"> }}</w:t>
             </w:r>
           </w:p>
         </w:tc>
         <w:tc>
           <w:tcPr>
-            <w:tcW w:w="1980" w:type="dxa"/>
+            <w:tcW w:w="1975" w:type="dxa"/>
           </w:tcPr>
           <w:p>
             <w:pPr>
@@ -1287,6 +2190,7 @@
                 <w:lang w:val="es-MX"/>
               </w:rPr>
             </w:pPr>
+            <w:proofErr w:type="gramStart"/>
             <w:r>
               <w:rPr>
                 <w:rFonts w:ascii="Arial" w:hAnsi="Arial" w:cs="Arial"/>
@@ -1295,7 +2199,62 @@
                 <w:szCs w:val="18"/>
                 <w:lang w:val="es-MX"/>
               </w:rPr>
-              <w:t>{{ estudios_lugar }}</w:t>
+              <w:t xml:space="preserve">{{ </w:t>
+            </w:r>
+            <w:proofErr w:type="spellStart"/>
+            <w:r>
+              <w:rPr>
+                <w:rFonts w:ascii="Arial" w:hAnsi="Arial" w:cs="Arial"/>
+                <w:bCs/>
+                <w:sz w:val="18"/>
+                <w:szCs w:val="18"/>
+                <w:lang w:val="es-MX"/>
+              </w:rPr>
+              <w:t>estudios</w:t>
+            </w:r>
+            <w:proofErr w:type="gramEnd"/>
+            <w:r>
+              <w:rPr>
+                <w:rFonts w:ascii="Arial" w:hAnsi="Arial" w:cs="Arial"/>
+                <w:bCs/>
+                <w:sz w:val="18"/>
+                <w:szCs w:val="18"/>
+                <w:lang w:val="es-MX"/>
+              </w:rPr>
+              <w:t>_</w:t>
+            </w:r>
+            <w:proofErr w:type="gramStart"/>
+            <w:r>
+              <w:rPr>
+                <w:rFonts w:ascii="Arial" w:hAnsi="Arial" w:cs="Arial"/>
+                <w:bCs/>
+                <w:sz w:val="18"/>
+                <w:szCs w:val="18"/>
+                <w:lang w:val="es-MX"/>
+              </w:rPr>
+              <w:t>lugar</w:t>
+            </w:r>
+            <w:proofErr w:type="spellEnd"/>
+            <w:r>
+              <w:rPr>
+                <w:rFonts w:ascii="Arial" w:hAnsi="Arial" w:cs="Arial"/>
+                <w:bCs/>
+                <w:sz w:val="18"/>
+                <w:szCs w:val="18"/>
+                <w:lang w:val="es-MX"/>
+              </w:rPr>
+              <w:t xml:space="preserve"> }</w:t>
+            </w:r>
+            <w:proofErr w:type="gramEnd"/>
+            <w:r>
+              <w:rPr>
+                <w:rFonts w:ascii="Arial" w:hAnsi="Arial" w:cs="Arial"/>
+                <w:bCs/>
+                <w:sz w:val="18"/>
+                <w:szCs w:val="18"/>
+                <w:lang w:val="es-MX"/>
+              </w:rPr>
+              <w:t>}</w:t>
             </w:r>
           </w:p>
           <w:p>
@@ -1312,7 +2271,7 @@
         </w:tc>
         <w:tc>
           <w:tcPr>
-            <w:tcW w:w="2232" w:type="dxa"/>
+            <w:tcW w:w="2226" w:type="dxa"/>
           </w:tcPr>
           <w:p>
             <w:pPr>
@@ -1324,6 +2283,7 @@
                 <w:lang w:val="es-MX"/>
               </w:rPr>
             </w:pPr>
+            <w:proofErr w:type="gramStart"/>
             <w:r>
               <w:rPr>
                 <w:rFonts w:ascii="Arial" w:hAnsi="Arial" w:cs="Arial"/>
@@ -1332,7 +2292,40 @@
                 <w:szCs w:val="18"/>
                 <w:lang w:val="es-MX"/>
               </w:rPr>
-              <w:t>{{ estudios_periodo }}</w:t>
+              <w:t xml:space="preserve">{{ </w:t>
+            </w:r>
+            <w:proofErr w:type="spellStart"/>
+            <w:r>
+              <w:rPr>
+                <w:rFonts w:ascii="Arial" w:hAnsi="Arial" w:cs="Arial"/>
+                <w:bCs/>
+                <w:sz w:val="18"/>
+                <w:szCs w:val="18"/>
+                <w:lang w:val="es-MX"/>
+              </w:rPr>
+              <w:t>estudios</w:t>
+            </w:r>
+            <w:proofErr w:type="gramEnd"/>
+            <w:r>
+              <w:rPr>
+                <w:rFonts w:ascii="Arial" w:hAnsi="Arial" w:cs="Arial"/>
+                <w:bCs/>
+                <w:sz w:val="18"/>
+                <w:szCs w:val="18"/>
+                <w:lang w:val="es-MX"/>
+              </w:rPr>
+              <w:t>_periodo</w:t>
+            </w:r>
+            <w:proofErr w:type="spellEnd"/>
+            <w:r>
+              <w:rPr>
+                <w:rFonts w:ascii="Arial" w:hAnsi="Arial" w:cs="Arial"/>
+                <w:bCs/>
+                <w:sz w:val="18"/>
+                <w:szCs w:val="18"/>
+                <w:lang w:val="es-MX"/>
+              </w:rPr>
+              <w:t xml:space="preserve"> }}</w:t>
             </w:r>
           </w:p>
         </w:tc>
@@ -1343,7 +2336,6 @@
         <w:rPr>
           <w:rFonts w:ascii="Arial" w:hAnsi="Arial" w:cs="Arial"/>
           <w:bCs/>
-          <w:color w:val="00FF00"/>
           <w:sz w:val="18"/>
           <w:szCs w:val="18"/>
           <w:lang w:val="es-MX"/>
@@ -1352,21 +2344,91 @@
     </w:p>
     <w:p>
       <w:pPr>
-        <w:pStyle w:val="Heading2"/>
-        <w:rPr>
+        <w:rPr>
+          <w:rFonts w:ascii="Arial" w:hAnsi="Arial" w:cs="Arial"/>
+          <w:bCs/>
+          <w:color w:val="00FF00"/>
+          <w:sz w:val="18"/>
+          <w:szCs w:val="18"/>
+          <w:lang w:val="es-MX"/>
+        </w:rPr>
+      </w:pPr>
+      <w:r>
+        <w:rPr>
+          <w:rFonts w:ascii="Arial" w:hAnsi="Arial" w:cs="Arial"/>
+          <w:bCs/>
+          <w:sz w:val="18"/>
+          <w:szCs w:val="18"/>
+          <w:lang w:val="es-MX"/>
+        </w:rPr>
+        <w:t xml:space="preserve">{% </w:t>
+      </w:r>
+      <w:proofErr w:type="spellStart"/>
+      <w:r>
+        <w:rPr>
+          <w:rFonts w:ascii="Arial" w:hAnsi="Arial" w:cs="Arial"/>
+          <w:bCs/>
+          <w:sz w:val="18"/>
+          <w:szCs w:val="18"/>
+          <w:lang w:val="es-MX"/>
+        </w:rPr>
+        <w:t>if</w:t>
+      </w:r>
+      <w:proofErr w:type="spellEnd"/>
+      <w:r>
+        <w:rPr>
+          <w:rFonts w:ascii="Arial" w:hAnsi="Arial" w:cs="Arial"/>
+          <w:bCs/>
+          <w:sz w:val="18"/>
+          <w:szCs w:val="18"/>
+          <w:lang w:val="es-MX"/>
+        </w:rPr>
+        <w:t xml:space="preserve"> </w:t>
+      </w:r>
+      <w:r>
+        <w:rPr>
+          <w:rFonts w:ascii="Arial" w:hAnsi="Arial" w:cs="Arial"/>
+          <w:bCs/>
+          <w:sz w:val="18"/>
+          <w:szCs w:val="18"/>
+          <w:lang w:val="es-MX"/>
+        </w:rPr>
+        <w:t>certificaciones</w:t>
+      </w:r>
+      <w:r>
+        <w:rPr>
+          <w:rFonts w:ascii="Arial" w:hAnsi="Arial" w:cs="Arial"/>
+          <w:bCs/>
+          <w:sz w:val="18"/>
+          <w:szCs w:val="18"/>
+          <w:lang w:val="es-MX"/>
+        </w:rPr>
+        <w:t xml:space="preserve"> </w:t>
+      </w:r>
+      <w:proofErr w:type="gramStart"/>
+      <w:r>
+        <w:rPr>
+          <w:rFonts w:ascii="Arial" w:hAnsi="Arial" w:cs="Arial"/>
+          <w:bCs/>
+          <w:sz w:val="18"/>
+          <w:szCs w:val="18"/>
+          <w:lang w:val="es-MX"/>
+        </w:rPr>
+        <w:t>%}</w:t>
+      </w:r>
+      <w:r>
+        <w:rPr>
+          <w:rFonts w:ascii="Arial" w:hAnsi="Arial" w:cs="Arial"/>
+          <w:b/>
+          <w:bCs/>
+          <w:sz w:val="18"/>
           <w:szCs w:val="18"/>
           <w:u w:val="single"/>
           <w:lang w:val="es-MX"/>
         </w:rPr>
-      </w:pPr>
-      <w:r>
-        <w:rPr>
-          <w:szCs w:val="18"/>
-          <w:u w:val="single"/>
-          <w:lang w:val="es-MX"/>
-        </w:rPr>
         <w:t>CERTIFICACIONES</w:t>
       </w:r>
+      <w:proofErr w:type="gramEnd"/>
     </w:p>
     <w:p>
       <w:pPr>
@@ -1390,8 +2452,8 @@
         <w:tblLook w:val="0000" w:firstRow="0" w:lastRow="0" w:firstColumn="0" w:lastColumn="0" w:noHBand="0" w:noVBand="0"/>
       </w:tblPr>
       <w:tblGrid>
-        <w:gridCol w:w="7604"/>
-        <w:gridCol w:w="2246"/>
+        <w:gridCol w:w="7602"/>
+        <w:gridCol w:w="2248"/>
       </w:tblGrid>
       <w:tr>
         <w:trPr>
@@ -1399,7 +2461,7 @@
         </w:trPr>
         <w:tc>
           <w:tcPr>
-            <w:tcW w:w="7693" w:type="dxa"/>
+            <w:tcW w:w="7602" w:type="dxa"/>
           </w:tcPr>
           <w:p>
             <w:pPr>
@@ -1411,7 +2473,7 @@
                 <w:bCs/>
                 <w:sz w:val="18"/>
                 <w:szCs w:val="18"/>
-                <w:lang w:val="es-MX" w:eastAsia="es-ES"/>
+                <w:lang w:val="en-US" w:eastAsia="es-ES"/>
               </w:rPr>
             </w:pPr>
             <w:r>
@@ -1420,15 +2482,37 @@
                 <w:bCs/>
                 <w:sz w:val="18"/>
                 <w:szCs w:val="18"/>
-                <w:lang w:val="es-MX" w:eastAsia="es-ES"/>
-              </w:rPr>
-              <w:t>{%tr for cert in certificaciones_y_cursos %}</w:t>
+                <w:lang w:val="en-US" w:eastAsia="es-ES"/>
+              </w:rPr>
+              <w:t xml:space="preserve">{%tr for cert in </w:t>
+            </w:r>
+            <w:proofErr w:type="spellStart"/>
+            <w:r>
+              <w:rPr>
+                <w:rFonts w:ascii="Arial" w:eastAsia="Times New Roman" w:hAnsi="Arial" w:cs="Arial"/>
+                <w:bCs/>
+                <w:sz w:val="18"/>
+                <w:szCs w:val="18"/>
+                <w:lang w:val="en-US" w:eastAsia="es-ES"/>
+              </w:rPr>
+              <w:t>certificaciones</w:t>
+            </w:r>
+            <w:proofErr w:type="spellEnd"/>
+            <w:r>
+              <w:rPr>
+                <w:rFonts w:ascii="Arial" w:eastAsia="Times New Roman" w:hAnsi="Arial" w:cs="Arial"/>
+                <w:bCs/>
+                <w:sz w:val="18"/>
+                <w:szCs w:val="18"/>
+                <w:lang w:val="en-US" w:eastAsia="es-ES"/>
+              </w:rPr>
+              <w:t xml:space="preserve"> %}</w:t>
             </w:r>
           </w:p>
         </w:tc>
         <w:tc>
           <w:tcPr>
-            <w:tcW w:w="2268" w:type="dxa"/>
+            <w:tcW w:w="2248" w:type="dxa"/>
           </w:tcPr>
           <w:p>
             <w:pPr>
@@ -1436,7 +2520,7 @@
                 <w:rFonts w:ascii="Arial" w:hAnsi="Arial" w:cs="Arial"/>
                 <w:sz w:val="18"/>
                 <w:szCs w:val="18"/>
-                <w:lang w:val="es-MX"/>
+                <w:lang w:val="en-US"/>
               </w:rPr>
             </w:pPr>
           </w:p>
@@ -1448,7 +2532,7 @@
         </w:trPr>
         <w:tc>
           <w:tcPr>
-            <w:tcW w:w="7693" w:type="dxa"/>
+            <w:tcW w:w="7602" w:type="dxa"/>
           </w:tcPr>
           <w:p>
             <w:pPr>
@@ -1471,13 +2555,57 @@
                 <w:szCs w:val="18"/>
                 <w:lang w:val="es-MX" w:eastAsia="es-ES"/>
               </w:rPr>
-              <w:t>- {{ cert.nombre }}</w:t>
+              <w:t xml:space="preserve">- </w:t>
+            </w:r>
+            <w:proofErr w:type="gramStart"/>
+            <w:r>
+              <w:rPr>
+                <w:rFonts w:ascii="Arial" w:eastAsia="Times New Roman" w:hAnsi="Arial" w:cs="Arial"/>
+                <w:bCs/>
+                <w:sz w:val="18"/>
+                <w:szCs w:val="18"/>
+                <w:lang w:val="es-MX" w:eastAsia="es-ES"/>
+              </w:rPr>
+              <w:t xml:space="preserve">{{ </w:t>
+            </w:r>
+            <w:proofErr w:type="spellStart"/>
+            <w:r>
+              <w:rPr>
+                <w:rFonts w:ascii="Arial" w:eastAsia="Times New Roman" w:hAnsi="Arial" w:cs="Arial"/>
+                <w:bCs/>
+                <w:sz w:val="18"/>
+                <w:szCs w:val="18"/>
+                <w:lang w:val="es-MX" w:eastAsia="es-ES"/>
+              </w:rPr>
+              <w:t>cert</w:t>
+            </w:r>
+            <w:proofErr w:type="gramEnd"/>
+            <w:r>
+              <w:rPr>
+                <w:rFonts w:ascii="Arial" w:eastAsia="Times New Roman" w:hAnsi="Arial" w:cs="Arial"/>
+                <w:bCs/>
+                <w:sz w:val="18"/>
+                <w:szCs w:val="18"/>
+                <w:lang w:val="es-MX" w:eastAsia="es-ES"/>
+              </w:rPr>
+              <w:t>.nombre</w:t>
+            </w:r>
+            <w:proofErr w:type="spellEnd"/>
+            <w:r>
+              <w:rPr>
+                <w:rFonts w:ascii="Arial" w:eastAsia="Times New Roman" w:hAnsi="Arial" w:cs="Arial"/>
+                <w:bCs/>
+                <w:sz w:val="18"/>
+                <w:szCs w:val="18"/>
+                <w:lang w:val="es-MX" w:eastAsia="es-ES"/>
+              </w:rPr>
+              <w:t xml:space="preserve"> }}</w:t>
             </w:r>
           </w:p>
         </w:tc>
         <w:tc>
           <w:tcPr>
-            <w:tcW w:w="2268" w:type="dxa"/>
+            <w:tcW w:w="2248" w:type="dxa"/>
           </w:tcPr>
           <w:p>
             <w:pPr>
@@ -1488,14 +2616,45 @@
                 <w:lang w:val="es-MX"/>
               </w:rPr>
             </w:pPr>
-            <w:r>
-              <w:rPr>
-                <w:rFonts w:ascii="Arial" w:hAnsi="Arial" w:cs="Arial"/>
-                <w:sz w:val="18"/>
-                <w:szCs w:val="18"/>
-                <w:lang w:val="es-MX"/>
-              </w:rPr>
-              <w:t>{{ cert.anio }}</w:t>
+            <w:proofErr w:type="gramStart"/>
+            <w:r>
+              <w:rPr>
+                <w:rFonts w:ascii="Arial" w:hAnsi="Arial" w:cs="Arial"/>
+                <w:sz w:val="18"/>
+                <w:szCs w:val="18"/>
+                <w:lang w:val="es-MX"/>
+              </w:rPr>
+              <w:t xml:space="preserve">{{ </w:t>
+            </w:r>
+            <w:proofErr w:type="spellStart"/>
+            <w:r>
+              <w:rPr>
+                <w:rFonts w:ascii="Arial" w:hAnsi="Arial" w:cs="Arial"/>
+                <w:sz w:val="18"/>
+                <w:szCs w:val="18"/>
+                <w:lang w:val="es-MX"/>
+              </w:rPr>
+              <w:t>cert</w:t>
+            </w:r>
+            <w:proofErr w:type="gramEnd"/>
+            <w:r>
+              <w:rPr>
+                <w:rFonts w:ascii="Arial" w:hAnsi="Arial" w:cs="Arial"/>
+                <w:sz w:val="18"/>
+                <w:szCs w:val="18"/>
+                <w:lang w:val="es-MX"/>
+              </w:rPr>
+              <w:t>.anio</w:t>
+            </w:r>
+            <w:proofErr w:type="spellEnd"/>
+            <w:r>
+              <w:rPr>
+                <w:rFonts w:ascii="Arial" w:hAnsi="Arial" w:cs="Arial"/>
+                <w:sz w:val="18"/>
+                <w:szCs w:val="18"/>
+                <w:lang w:val="es-MX"/>
+              </w:rPr>
+              <w:t xml:space="preserve"> }}</w:t>
             </w:r>
           </w:p>
         </w:tc>
@@ -1506,7 +2665,7 @@
         </w:trPr>
         <w:tc>
           <w:tcPr>
-            <w:tcW w:w="7693" w:type="dxa"/>
+            <w:tcW w:w="7602" w:type="dxa"/>
           </w:tcPr>
           <w:p>
             <w:pPr>
@@ -1528,13 +2687,53 @@
                 <w:szCs w:val="18"/>
                 <w:lang w:val="es-MX"/>
               </w:rPr>
-              <w:t>{%tr endfor %}</w:t>
+              <w:t>{%</w:t>
+            </w:r>
+            <w:proofErr w:type="spellStart"/>
+            <w:r>
+              <w:rPr>
+                <w:rFonts w:ascii="Arial" w:hAnsi="Arial" w:cs="Arial"/>
+                <w:sz w:val="18"/>
+                <w:szCs w:val="18"/>
+                <w:lang w:val="es-MX"/>
+              </w:rPr>
+              <w:t>tr</w:t>
+            </w:r>
+            <w:proofErr w:type="spellEnd"/>
+            <w:r>
+              <w:rPr>
+                <w:rFonts w:ascii="Arial" w:hAnsi="Arial" w:cs="Arial"/>
+                <w:sz w:val="18"/>
+                <w:szCs w:val="18"/>
+                <w:lang w:val="es-MX"/>
+              </w:rPr>
+              <w:t xml:space="preserve"> </w:t>
+            </w:r>
+            <w:proofErr w:type="spellStart"/>
+            <w:r>
+              <w:rPr>
+                <w:rFonts w:ascii="Arial" w:hAnsi="Arial" w:cs="Arial"/>
+                <w:sz w:val="18"/>
+                <w:szCs w:val="18"/>
+                <w:lang w:val="es-MX"/>
+              </w:rPr>
+              <w:t>endfor</w:t>
+            </w:r>
+            <w:proofErr w:type="spellEnd"/>
+            <w:r>
+              <w:rPr>
+                <w:rFonts w:ascii="Arial" w:hAnsi="Arial" w:cs="Arial"/>
+                <w:sz w:val="18"/>
+                <w:szCs w:val="18"/>
+                <w:lang w:val="es-MX"/>
+              </w:rPr>
+              <w:t xml:space="preserve"> %}</w:t>
             </w:r>
           </w:p>
         </w:tc>
         <w:tc>
           <w:tcPr>
-            <w:tcW w:w="2268" w:type="dxa"/>
+            <w:tcW w:w="2248" w:type="dxa"/>
           </w:tcPr>
           <w:p>
             <w:pPr>
@@ -1549,7 +2748,437 @@
         </w:tc>
       </w:tr>
     </w:tbl>
-    <w:p/>
+    <w:p>
+      <w:pPr>
+        <w:jc w:val="both"/>
+        <w:rPr>
+          <w:rFonts w:ascii="Arial" w:hAnsi="Arial" w:cs="Arial"/>
+          <w:bCs/>
+          <w:sz w:val="18"/>
+          <w:szCs w:val="18"/>
+          <w:lang w:val="en-US"/>
+        </w:rPr>
+      </w:pPr>
+    </w:p>
+    <w:p>
+      <w:pPr>
+        <w:jc w:val="both"/>
+        <w:rPr>
+          <w:rFonts w:ascii="Arial" w:hAnsi="Arial" w:cs="Arial"/>
+          <w:bCs/>
+          <w:sz w:val="18"/>
+          <w:szCs w:val="18"/>
+          <w:lang w:val="en-US"/>
+        </w:rPr>
+      </w:pPr>
+      <w:r>
+        <w:rPr>
+          <w:rFonts w:ascii="Arial" w:hAnsi="Arial" w:cs="Arial"/>
+          <w:bCs/>
+          <w:sz w:val="18"/>
+          <w:szCs w:val="18"/>
+          <w:lang w:val="en-US"/>
+        </w:rPr>
+        <w:t xml:space="preserve">{% </w:t>
+      </w:r>
+      <w:r>
+        <w:rPr>
+          <w:rFonts w:ascii="Arial" w:hAnsi="Arial" w:cs="Arial"/>
+          <w:bCs/>
+          <w:sz w:val="18"/>
+          <w:szCs w:val="18"/>
+          <w:lang w:val="en-US"/>
+        </w:rPr>
+        <w:t>endif</w:t>
+      </w:r>
+      <w:r>
+        <w:rPr>
+          <w:rFonts w:ascii="Arial" w:hAnsi="Arial" w:cs="Arial"/>
+          <w:bCs/>
+          <w:sz w:val="18"/>
+          <w:szCs w:val="18"/>
+          <w:lang w:val="en-US"/>
+        </w:rPr>
+        <w:t xml:space="preserve"> </w:t>
+      </w:r>
+      <w:proofErr w:type="gramStart"/>
+      <w:r>
+        <w:rPr>
+          <w:rFonts w:ascii="Arial" w:hAnsi="Arial" w:cs="Arial"/>
+          <w:bCs/>
+          <w:sz w:val="18"/>
+          <w:szCs w:val="18"/>
+          <w:lang w:val="en-US"/>
+        </w:rPr>
+        <w:t>%}</w:t>
+      </w:r>
+      <w:r>
+        <w:rPr>
+          <w:rFonts w:ascii="Arial" w:hAnsi="Arial" w:cs="Arial"/>
+          <w:bCs/>
+          <w:sz w:val="18"/>
+          <w:szCs w:val="18"/>
+          <w:lang w:val="en-US"/>
+        </w:rPr>
+        <w:t>{</w:t>
+      </w:r>
+      <w:proofErr w:type="gramEnd"/>
+      <w:r>
+        <w:rPr>
+          <w:rFonts w:ascii="Arial" w:hAnsi="Arial" w:cs="Arial"/>
+          <w:bCs/>
+          <w:sz w:val="18"/>
+          <w:szCs w:val="18"/>
+          <w:lang w:val="en-US"/>
+        </w:rPr>
+        <w:t xml:space="preserve">% if </w:t>
+      </w:r>
+      <w:proofErr w:type="spellStart"/>
+      <w:r>
+        <w:rPr>
+          <w:rFonts w:ascii="Arial" w:hAnsi="Arial" w:cs="Arial"/>
+          <w:bCs/>
+          <w:sz w:val="18"/>
+          <w:szCs w:val="18"/>
+          <w:lang w:val="en-US"/>
+        </w:rPr>
+        <w:t>cursos</w:t>
+      </w:r>
+      <w:proofErr w:type="spellEnd"/>
+      <w:r>
+        <w:rPr>
+          <w:rFonts w:ascii="Arial" w:hAnsi="Arial" w:cs="Arial"/>
+          <w:bCs/>
+          <w:sz w:val="18"/>
+          <w:szCs w:val="18"/>
+          <w:lang w:val="en-US"/>
+        </w:rPr>
+        <w:t xml:space="preserve"> </w:t>
+      </w:r>
+      <w:proofErr w:type="gramStart"/>
+      <w:r>
+        <w:rPr>
+          <w:rFonts w:ascii="Arial" w:hAnsi="Arial" w:cs="Arial"/>
+          <w:bCs/>
+          <w:sz w:val="18"/>
+          <w:szCs w:val="18"/>
+          <w:lang w:val="en-US"/>
+        </w:rPr>
+        <w:t>%}</w:t>
+      </w:r>
+      <w:r>
+        <w:rPr>
+          <w:rFonts w:ascii="Arial" w:hAnsi="Arial" w:cs="Arial"/>
+          <w:b/>
+          <w:bCs/>
+          <w:sz w:val="18"/>
+          <w:szCs w:val="18"/>
+          <w:u w:val="single"/>
+          <w:lang w:val="es-MX"/>
+        </w:rPr>
+        <w:t>C</w:t>
+      </w:r>
+      <w:r>
+        <w:rPr>
+          <w:rFonts w:ascii="Arial" w:hAnsi="Arial" w:cs="Arial"/>
+          <w:b/>
+          <w:bCs/>
+          <w:sz w:val="18"/>
+          <w:szCs w:val="18"/>
+          <w:u w:val="single"/>
+          <w:lang w:val="es-MX"/>
+        </w:rPr>
+        <w:t>URSOS</w:t>
+      </w:r>
+      <w:proofErr w:type="gramEnd"/>
+    </w:p>
+    <w:p>
+      <w:pPr>
+        <w:jc w:val="both"/>
+        <w:rPr>
+          <w:rFonts w:ascii="Arial" w:hAnsi="Arial" w:cs="Arial"/>
+          <w:bCs/>
+          <w:sz w:val="18"/>
+          <w:szCs w:val="18"/>
+          <w:lang w:val="en-US"/>
+        </w:rPr>
+      </w:pPr>
+    </w:p>
+    <w:tbl>
+      <w:tblPr>
+        <w:tblW w:w="0" w:type="auto"/>
+        <w:tblInd w:w="-72" w:type="dxa"/>
+        <w:tblBorders>
+          <w:top w:val="single" w:sz="4" w:space="0" w:color="auto"/>
+          <w:left w:val="single" w:sz="4" w:space="0" w:color="auto"/>
+          <w:bottom w:val="single" w:sz="4" w:space="0" w:color="auto"/>
+          <w:right w:val="single" w:sz="4" w:space="0" w:color="auto"/>
+          <w:insideH w:val="single" w:sz="4" w:space="0" w:color="auto"/>
+          <w:insideV w:val="single" w:sz="4" w:space="0" w:color="auto"/>
+        </w:tblBorders>
+        <w:tblLook w:val="0000" w:firstRow="0" w:lastRow="0" w:firstColumn="0" w:lastColumn="0" w:noHBand="0" w:noVBand="0"/>
+      </w:tblPr>
+      <w:tblGrid>
+        <w:gridCol w:w="9850"/>
+      </w:tblGrid>
+      <w:tr>
+        <w:trPr>
+          <w:trHeight w:val="300"/>
+        </w:trPr>
+        <w:tc>
+          <w:tcPr>
+            <w:tcW w:w="9850" w:type="dxa"/>
+          </w:tcPr>
+          <w:p>
+            <w:pPr>
+              <w:rPr>
+                <w:rFonts w:ascii="Arial" w:hAnsi="Arial" w:cs="Arial"/>
+                <w:sz w:val="18"/>
+                <w:szCs w:val="18"/>
+                <w:lang w:val="en-US"/>
+              </w:rPr>
+            </w:pPr>
+            <w:r>
+              <w:rPr>
+                <w:rFonts w:ascii="Arial" w:hAnsi="Arial" w:cs="Arial"/>
+                <w:bCs/>
+                <w:sz w:val="18"/>
+                <w:szCs w:val="18"/>
+                <w:lang w:val="en-US"/>
+              </w:rPr>
+              <w:t>{%tr for c</w:t>
+            </w:r>
+            <w:r>
+              <w:rPr>
+                <w:rFonts w:ascii="Arial" w:hAnsi="Arial" w:cs="Arial"/>
+                <w:bCs/>
+                <w:sz w:val="18"/>
+                <w:szCs w:val="18"/>
+                <w:lang w:val="en-US"/>
+              </w:rPr>
+              <w:t>ur</w:t>
+            </w:r>
+            <w:r>
+              <w:rPr>
+                <w:rFonts w:ascii="Arial" w:hAnsi="Arial" w:cs="Arial"/>
+                <w:bCs/>
+                <w:sz w:val="18"/>
+                <w:szCs w:val="18"/>
+                <w:lang w:val="en-US"/>
+              </w:rPr>
+              <w:t xml:space="preserve"> in </w:t>
+            </w:r>
+            <w:proofErr w:type="spellStart"/>
+            <w:r>
+              <w:rPr>
+                <w:rFonts w:ascii="Arial" w:hAnsi="Arial" w:cs="Arial"/>
+                <w:bCs/>
+                <w:sz w:val="18"/>
+                <w:szCs w:val="18"/>
+                <w:lang w:val="en-US"/>
+              </w:rPr>
+              <w:t>cursos</w:t>
+            </w:r>
+            <w:proofErr w:type="spellEnd"/>
+            <w:r>
+              <w:rPr>
+                <w:rFonts w:ascii="Arial" w:hAnsi="Arial" w:cs="Arial"/>
+                <w:bCs/>
+                <w:sz w:val="18"/>
+                <w:szCs w:val="18"/>
+                <w:lang w:val="en-US"/>
+              </w:rPr>
+              <w:t xml:space="preserve"> %}</w:t>
+            </w:r>
+          </w:p>
+        </w:tc>
+      </w:tr>
+      <w:tr>
+        <w:trPr>
+          <w:trHeight w:val="300"/>
+        </w:trPr>
+        <w:tc>
+          <w:tcPr>
+            <w:tcW w:w="9850" w:type="dxa"/>
+          </w:tcPr>
+          <w:p>
+            <w:pPr>
+              <w:rPr>
+                <w:rFonts w:ascii="Arial" w:hAnsi="Arial" w:cs="Arial"/>
+                <w:sz w:val="18"/>
+                <w:szCs w:val="18"/>
+                <w:lang w:val="es-MX"/>
+              </w:rPr>
+            </w:pPr>
+            <w:r>
+              <w:rPr>
+                <w:rFonts w:ascii="Arial" w:hAnsi="Arial" w:cs="Arial"/>
+                <w:bCs/>
+                <w:sz w:val="18"/>
+                <w:szCs w:val="18"/>
+                <w:lang w:val="es-MX"/>
+              </w:rPr>
+              <w:t xml:space="preserve">- </w:t>
+            </w:r>
+            <w:proofErr w:type="gramStart"/>
+            <w:r>
+              <w:rPr>
+                <w:rFonts w:ascii="Arial" w:hAnsi="Arial" w:cs="Arial"/>
+                <w:bCs/>
+                <w:sz w:val="18"/>
+                <w:szCs w:val="18"/>
+                <w:lang w:val="es-MX"/>
+              </w:rPr>
+              <w:t xml:space="preserve">{{ </w:t>
+            </w:r>
+            <w:proofErr w:type="spellStart"/>
+            <w:r>
+              <w:rPr>
+                <w:rFonts w:ascii="Arial" w:hAnsi="Arial" w:cs="Arial"/>
+                <w:bCs/>
+                <w:sz w:val="18"/>
+                <w:szCs w:val="18"/>
+                <w:lang w:val="es-MX"/>
+              </w:rPr>
+              <w:t>cur</w:t>
+            </w:r>
+            <w:proofErr w:type="gramEnd"/>
+            <w:r>
+              <w:rPr>
+                <w:rFonts w:ascii="Arial" w:hAnsi="Arial" w:cs="Arial"/>
+                <w:bCs/>
+                <w:sz w:val="18"/>
+                <w:szCs w:val="18"/>
+                <w:lang w:val="es-MX"/>
+              </w:rPr>
+              <w:t>.nombre</w:t>
+            </w:r>
+            <w:proofErr w:type="spellEnd"/>
+            <w:r>
+              <w:rPr>
+                <w:rFonts w:ascii="Arial" w:hAnsi="Arial" w:cs="Arial"/>
+                <w:bCs/>
+                <w:sz w:val="18"/>
+                <w:szCs w:val="18"/>
+                <w:lang w:val="es-MX"/>
+              </w:rPr>
+              <w:t xml:space="preserve"> }}</w:t>
+            </w:r>
+          </w:p>
+        </w:tc>
+      </w:tr>
+      <w:tr>
+        <w:trPr>
+          <w:trHeight w:val="300"/>
+        </w:trPr>
+        <w:tc>
+          <w:tcPr>
+            <w:tcW w:w="9850" w:type="dxa"/>
+          </w:tcPr>
+          <w:p>
+            <w:pPr>
+              <w:rPr>
+                <w:rFonts w:ascii="Arial" w:hAnsi="Arial" w:cs="Arial"/>
+                <w:sz w:val="18"/>
+                <w:szCs w:val="18"/>
+                <w:lang w:val="es-MX"/>
+              </w:rPr>
+            </w:pPr>
+            <w:r>
+              <w:rPr>
+                <w:rFonts w:ascii="Arial" w:hAnsi="Arial" w:cs="Arial"/>
+                <w:sz w:val="18"/>
+                <w:szCs w:val="18"/>
+                <w:lang w:val="es-MX"/>
+              </w:rPr>
+              <w:t>{%</w:t>
+            </w:r>
+            <w:proofErr w:type="spellStart"/>
+            <w:r>
+              <w:rPr>
+                <w:rFonts w:ascii="Arial" w:hAnsi="Arial" w:cs="Arial"/>
+                <w:sz w:val="18"/>
+                <w:szCs w:val="18"/>
+                <w:lang w:val="es-MX"/>
+              </w:rPr>
+              <w:t>tr</w:t>
+            </w:r>
+            <w:proofErr w:type="spellEnd"/>
+            <w:r>
+              <w:rPr>
+                <w:rFonts w:ascii="Arial" w:hAnsi="Arial" w:cs="Arial"/>
+                <w:sz w:val="18"/>
+                <w:szCs w:val="18"/>
+                <w:lang w:val="es-MX"/>
+              </w:rPr>
+              <w:t xml:space="preserve"> </w:t>
+            </w:r>
+            <w:proofErr w:type="spellStart"/>
+            <w:r>
+              <w:rPr>
+                <w:rFonts w:ascii="Arial" w:hAnsi="Arial" w:cs="Arial"/>
+                <w:sz w:val="18"/>
+                <w:szCs w:val="18"/>
+                <w:lang w:val="es-MX"/>
+              </w:rPr>
+              <w:t>endfor</w:t>
+            </w:r>
+            <w:proofErr w:type="spellEnd"/>
+            <w:r>
+              <w:rPr>
+                <w:rFonts w:ascii="Arial" w:hAnsi="Arial" w:cs="Arial"/>
+                <w:sz w:val="18"/>
+                <w:szCs w:val="18"/>
+                <w:lang w:val="es-MX"/>
+              </w:rPr>
+              <w:t xml:space="preserve"> %}</w:t>
+            </w:r>
+          </w:p>
+        </w:tc>
+      </w:tr>
+    </w:tbl>
+    <w:p>
+      <w:pPr>
+        <w:jc w:val="both"/>
+        <w:rPr>
+          <w:rFonts w:ascii="Arial" w:hAnsi="Arial" w:cs="Arial"/>
+          <w:bCs/>
+          <w:sz w:val="18"/>
+          <w:szCs w:val="18"/>
+          <w:lang w:val="en-US"/>
+        </w:rPr>
+      </w:pPr>
+      <w:r>
+        <w:rPr>
+          <w:rFonts w:ascii="Arial" w:hAnsi="Arial" w:cs="Arial"/>
+          <w:bCs/>
+          <w:sz w:val="18"/>
+          <w:szCs w:val="18"/>
+          <w:lang w:val="en-US"/>
+        </w:rPr>
+        <w:t xml:space="preserve">{% </w:t>
+      </w:r>
+      <w:r>
+        <w:rPr>
+          <w:rFonts w:ascii="Arial" w:hAnsi="Arial" w:cs="Arial"/>
+          <w:bCs/>
+          <w:sz w:val="18"/>
+          <w:szCs w:val="18"/>
+          <w:lang w:val="en-US"/>
+        </w:rPr>
+        <w:t>endif</w:t>
+      </w:r>
+      <w:r>
+        <w:rPr>
+          <w:rFonts w:ascii="Arial" w:hAnsi="Arial" w:cs="Arial"/>
+          <w:bCs/>
+          <w:sz w:val="18"/>
+          <w:szCs w:val="18"/>
+          <w:lang w:val="en-US"/>
+        </w:rPr>
+        <w:t xml:space="preserve"> %}</w:t>
+      </w:r>
+    </w:p>
     <w:sectPr>
       <w:headerReference w:type="default" r:id="rId11"/>
       <w:footerReference w:type="default" r:id="rId12"/>
@@ -6977,30 +8606,6 @@
 </file>
 
 <file path=customXml/item1.xml><?xml version="1.0" encoding="utf-8"?>
-<p:properties xmlns:p="http://schemas.microsoft.com/office/2006/metadata/properties" xmlns:xsi="http://www.w3.org/2001/XMLSchema-instance" xmlns:pc="http://schemas.microsoft.com/office/infopath/2007/PartnerControls">
-  <documentManagement>
-    <lcf76f155ced4ddcb4097134ff3c332f xmlns="458c8650-8b2e-4de5-be2b-3b5e20f9203e">
-      <Terms xmlns="http://schemas.microsoft.com/office/infopath/2007/PartnerControls"/>
-    </lcf76f155ced4ddcb4097134ff3c332f>
-    <TaxCatchAll xmlns="0ec1683b-1f09-407c-8792-a5a8bc579d9d"/>
-  </documentManagement>
-</p:properties>
-</file>
-
-<file path=customXml/item2.xml><?xml version="1.0" encoding="utf-8"?>
-<b:Sources xmlns:b="http://schemas.openxmlformats.org/officeDocument/2006/bibliography" xmlns="http://schemas.openxmlformats.org/officeDocument/2006/bibliography" SelectedStyle="\APASixthEditionOfficeOnline.xsl" StyleName="APA" Version="6"/>
-</file>
-
-<file path=customXml/item3.xml><?xml version="1.0" encoding="utf-8"?>
-<?mso-contentType ?>
-<FormTemplates xmlns="http://schemas.microsoft.com/sharepoint/v3/contenttype/forms">
-  <Display>DocumentLibraryForm</Display>
-  <Edit>DocumentLibraryForm</Edit>
-  <New>DocumentLibraryForm</New>
-</FormTemplates>
-</file>
-
-<file path=customXml/item4.xml><?xml version="1.0" encoding="utf-8"?>
 <ct:contentTypeSchema xmlns:ct="http://schemas.microsoft.com/office/2006/metadata/contentType" xmlns:ma="http://schemas.microsoft.com/office/2006/metadata/properties/metaAttributes" ct:_="" ma:_="" ma:contentTypeName="Document" ma:contentTypeID="0x010100AA01E1029091DE488084A5A2D9C24E74" ma:contentTypeVersion="10" ma:contentTypeDescription="Create a new document." ma:contentTypeScope="" ma:versionID="fa224b1e2ea5aaa53b64c3b4b1d435b1">
   <xsd:schema xmlns:xsd="http://www.w3.org/2001/XMLSchema" xmlns:xs="http://www.w3.org/2001/XMLSchema" xmlns:p="http://schemas.microsoft.com/office/2006/metadata/properties" xmlns:ns2="458c8650-8b2e-4de5-be2b-3b5e20f9203e" xmlns:ns3="0ec1683b-1f09-407c-8792-a5a8bc579d9d" targetNamespace="http://schemas.microsoft.com/office/2006/metadata/properties" ma:root="true" ma:fieldsID="3f0568638764530331fbee8047bb9098" ns2:_="" ns3:_="">
     <xsd:import namespace="458c8650-8b2e-4de5-be2b-3b5e20f9203e"/>
@@ -7189,34 +8794,31 @@
 </ct:contentTypeSchema>
 </file>
 
-<file path=customXml/itemProps1.xml><?xml version="1.0" encoding="utf-8"?>
-<ds:datastoreItem xmlns:ds="http://schemas.openxmlformats.org/officeDocument/2006/customXml" ds:itemID="{D3A3C24A-BB39-4937-B831-24AA124EAA87}">
-  <ds:schemaRefs>
-    <ds:schemaRef ds:uri="http://schemas.microsoft.com/office/2006/metadata/properties"/>
-    <ds:schemaRef ds:uri="http://schemas.microsoft.com/office/infopath/2007/PartnerControls"/>
-    <ds:schemaRef ds:uri="458c8650-8b2e-4de5-be2b-3b5e20f9203e"/>
-    <ds:schemaRef ds:uri="0ec1683b-1f09-407c-8792-a5a8bc579d9d"/>
-  </ds:schemaRefs>
-</ds:datastoreItem>
+<file path=customXml/item2.xml><?xml version="1.0" encoding="utf-8"?>
+<?mso-contentType ?>
+<FormTemplates xmlns="http://schemas.microsoft.com/sharepoint/v3/contenttype/forms">
+  <Display>DocumentLibraryForm</Display>
+  <Edit>DocumentLibraryForm</Edit>
+  <New>DocumentLibraryForm</New>
+</FormTemplates>
 </file>
 
-<file path=customXml/itemProps2.xml><?xml version="1.0" encoding="utf-8"?>
-<ds:datastoreItem xmlns:ds="http://schemas.openxmlformats.org/officeDocument/2006/customXml" ds:itemID="{4BB9A27A-6211-48E6-B3D1-1ED5E2EAD372}">
-  <ds:schemaRefs>
-    <ds:schemaRef ds:uri="http://schemas.openxmlformats.org/officeDocument/2006/bibliography"/>
-  </ds:schemaRefs>
-</ds:datastoreItem>
+<file path=customXml/item3.xml><?xml version="1.0" encoding="utf-8"?>
+<b:Sources xmlns:b="http://schemas.openxmlformats.org/officeDocument/2006/bibliography" xmlns="http://schemas.openxmlformats.org/officeDocument/2006/bibliography" SelectedStyle="\APASixthEditionOfficeOnline.xsl" StyleName="APA" Version="6"/>
 </file>
 
-<file path=customXml/itemProps3.xml><?xml version="1.0" encoding="utf-8"?>
-<ds:datastoreItem xmlns:ds="http://schemas.openxmlformats.org/officeDocument/2006/customXml" ds:itemID="{51241304-2C43-44E6-B26F-77C42016271C}">
-  <ds:schemaRefs>
-    <ds:schemaRef ds:uri="http://schemas.microsoft.com/sharepoint/v3/contenttype/forms"/>
-  </ds:schemaRefs>
-</ds:datastoreItem>
+<file path=customXml/item4.xml><?xml version="1.0" encoding="utf-8"?>
+<p:properties xmlns:p="http://schemas.microsoft.com/office/2006/metadata/properties" xmlns:xsi="http://www.w3.org/2001/XMLSchema-instance" xmlns:pc="http://schemas.microsoft.com/office/infopath/2007/PartnerControls">
+  <documentManagement>
+    <lcf76f155ced4ddcb4097134ff3c332f xmlns="458c8650-8b2e-4de5-be2b-3b5e20f9203e">
+      <Terms xmlns="http://schemas.microsoft.com/office/infopath/2007/PartnerControls"/>
+    </lcf76f155ced4ddcb4097134ff3c332f>
+    <TaxCatchAll xmlns="0ec1683b-1f09-407c-8792-a5a8bc579d9d"/>
+  </documentManagement>
+</p:properties>
 </file>
 
-<file path=customXml/itemProps4.xml><?xml version="1.0" encoding="utf-8"?>
+<file path=customXml/itemProps1.xml><?xml version="1.0" encoding="utf-8"?>
 <ds:datastoreItem xmlns:ds="http://schemas.openxmlformats.org/officeDocument/2006/customXml" ds:itemID="{6EE546D2-1DFA-4BBD-AF1C-4C842A1F8073}">
   <ds:schemaRefs>
     <ds:schemaRef ds:uri="http://schemas.microsoft.com/office/2006/metadata/contentType"/>
@@ -7233,4 +8835,31 @@
     <ds:schemaRef ds:uri="http://schemas.microsoft.com/internal/obd"/>
   </ds:schemaRefs>
 </ds:datastoreItem>
+</file>
+
+<file path=customXml/itemProps2.xml><?xml version="1.0" encoding="utf-8"?>
+<ds:datastoreItem xmlns:ds="http://schemas.openxmlformats.org/officeDocument/2006/customXml" ds:itemID="{51241304-2C43-44E6-B26F-77C42016271C}">
+  <ds:schemaRefs>
+    <ds:schemaRef ds:uri="http://schemas.microsoft.com/sharepoint/v3/contenttype/forms"/>
+  </ds:schemaRefs>
+</ds:datastoreItem>
+</file>
+
+<file path=customXml/itemProps3.xml><?xml version="1.0" encoding="utf-8"?>
+<ds:datastoreItem xmlns:ds="http://schemas.openxmlformats.org/officeDocument/2006/customXml" ds:itemID="{4BB9A27A-6211-48E6-B3D1-1ED5E2EAD372}">
+  <ds:schemaRefs>
+    <ds:schemaRef ds:uri="http://schemas.openxmlformats.org/officeDocument/2006/bibliography"/>
+  </ds:schemaRefs>
+</ds:datastoreItem>
+</file>
+
+<file path=customXml/itemProps4.xml><?xml version="1.0" encoding="utf-8"?>
+<ds:datastoreItem xmlns:ds="http://schemas.openxmlformats.org/officeDocument/2006/customXml" ds:itemID="{D3A3C24A-BB39-4937-B831-24AA124EAA87}">
+  <ds:schemaRefs>
+    <ds:schemaRef ds:uri="http://schemas.microsoft.com/office/2006/metadata/properties"/>
+    <ds:schemaRef ds:uri="http://schemas.microsoft.com/office/infopath/2007/PartnerControls"/>
+    <ds:schemaRef ds:uri="458c8650-8b2e-4de5-be2b-3b5e20f9203e"/>
+    <ds:schemaRef ds:uri="0ec1683b-1f09-407c-8792-a5a8bc579d9d"/>
+  </ds:schemaRefs>
+</ds:datastoreItem>
 </file>
</xml_diff>

<commit_message>
se suben todas las skills actualizadas
</commit_message>
<xml_diff>
--- a/PLANTILLA-DE-CV.docx
+++ b/PLANTILLA-DE-CV.docx
@@ -13,16 +13,42 @@
           <w:lang w:val="es-MX"/>
         </w:rPr>
       </w:pPr>
-      <w:proofErr w:type="gramStart"/>
       <w:r>
         <w:rPr>
           <w:b/>
           <w:bCs/>
           <w:lang w:val="es-MX"/>
         </w:rPr>
-        <w:t>{{ nombre</w:t>
+        <w:t>{{ nombre }}</w:t>
       </w:r>
-      <w:proofErr w:type="gramEnd"/>
+    </w:p>
+    <w:p>
+      <w:pPr>
+        <w:pStyle w:val="Title"/>
+        <w:rPr>
+          <w:b/>
+          <w:bCs/>
+          <w:lang w:val="es-MX"/>
+        </w:rPr>
+      </w:pPr>
+      <w:r>
+        <w:rPr>
+          <w:b/>
+          <w:bCs/>
+          <w:lang w:val="es-MX"/>
+        </w:rPr>
+        <w:t xml:space="preserve">{{ </w:t>
+      </w:r>
+      <w:proofErr w:type="spellStart"/>
+      <w:r>
+        <w:rPr>
+          <w:b/>
+          <w:bCs/>
+          <w:lang w:val="es-MX"/>
+        </w:rPr>
+        <w:t>rol_propuesto</w:t>
+      </w:r>
+      <w:proofErr w:type="spellEnd"/>
       <w:r>
         <w:rPr>
           <w:b/>
@@ -35,159 +61,65 @@
     <w:p>
       <w:pPr>
         <w:pStyle w:val="Title"/>
+        <w:jc w:val="left"/>
         <w:rPr>
           <w:b/>
           <w:bCs/>
+          <w:sz w:val="18"/>
+          <w:szCs w:val="18"/>
           <w:lang w:val="es-MX"/>
         </w:rPr>
       </w:pPr>
-      <w:proofErr w:type="gramStart"/>
-      <w:r>
-        <w:rPr>
-          <w:b/>
-          <w:bCs/>
-          <w:lang w:val="es-MX"/>
-        </w:rPr>
-        <w:t xml:space="preserve">{{ </w:t>
-      </w:r>
-      <w:proofErr w:type="spellStart"/>
-      <w:r>
-        <w:rPr>
-          <w:b/>
-          <w:bCs/>
-          <w:lang w:val="es-MX"/>
-        </w:rPr>
-        <w:t>rol</w:t>
-      </w:r>
-      <w:proofErr w:type="gramEnd"/>
-      <w:r>
-        <w:rPr>
-          <w:b/>
-          <w:bCs/>
-          <w:lang w:val="es-MX"/>
-        </w:rPr>
-        <w:t>_</w:t>
-      </w:r>
-      <w:proofErr w:type="gramStart"/>
-      <w:r>
-        <w:rPr>
-          <w:b/>
-          <w:bCs/>
-          <w:lang w:val="es-MX"/>
-        </w:rPr>
-        <w:t>propuesto</w:t>
-      </w:r>
-      <w:proofErr w:type="spellEnd"/>
-      <w:r>
-        <w:rPr>
-          <w:b/>
-          <w:bCs/>
-          <w:lang w:val="es-MX"/>
-        </w:rPr>
-        <w:t xml:space="preserve"> }</w:t>
-      </w:r>
-      <w:proofErr w:type="gramEnd"/>
-      <w:r>
-        <w:rPr>
-          <w:b/>
-          <w:bCs/>
-          <w:lang w:val="es-MX"/>
-        </w:rPr>
-        <w:t>}</w:t>
-      </w:r>
     </w:p>
     <w:p>
       <w:pPr>
-        <w:pStyle w:val="Title"/>
-        <w:rPr>
-          <w:b/>
+        <w:rPr>
+          <w:rFonts w:ascii="Arial" w:hAnsi="Arial" w:cs="Arial"/>
           <w:bCs/>
-          <w:lang w:val="es-MX"/>
+          <w:sz w:val="18"/>
+          <w:szCs w:val="18"/>
         </w:rPr>
       </w:pPr>
     </w:p>
     <w:p>
       <w:pPr>
-        <w:pStyle w:val="Title"/>
-        <w:jc w:val="left"/>
-        <w:rPr>
+        <w:rPr>
+          <w:rFonts w:ascii="Arial" w:hAnsi="Arial" w:cs="Arial"/>
+          <w:bCs/>
+          <w:sz w:val="18"/>
+          <w:szCs w:val="18"/>
+        </w:rPr>
+      </w:pPr>
+    </w:p>
+    <w:p>
+      <w:pPr>
+        <w:rPr>
+          <w:rFonts w:ascii="Arial" w:hAnsi="Arial" w:cs="Arial"/>
           <w:b/>
-          <w:bCs/>
-          <w:sz w:val="18"/>
-          <w:szCs w:val="18"/>
-          <w:lang w:val="es-MX"/>
+          <w:sz w:val="18"/>
+          <w:szCs w:val="18"/>
+          <w:u w:val="single"/>
         </w:rPr>
       </w:pPr>
       <w:r>
         <w:rPr>
+          <w:rFonts w:ascii="Arial" w:hAnsi="Arial" w:cs="Arial"/>
           <w:b/>
-          <w:bCs/>
-          <w:sz w:val="18"/>
-          <w:szCs w:val="18"/>
-          <w:lang w:val="es-MX"/>
-        </w:rPr>
-        <w:t>Folio</w:t>
+          <w:sz w:val="18"/>
+          <w:szCs w:val="18"/>
+          <w:u w:val="single"/>
+        </w:rPr>
+        <w:t>EXPERIENCIA</w:t>
       </w:r>
       <w:r>
         <w:rPr>
+          <w:rFonts w:ascii="Arial" w:hAnsi="Arial" w:cs="Arial"/>
           <w:b/>
-          <w:bCs/>
-          <w:sz w:val="18"/>
-          <w:szCs w:val="18"/>
-          <w:lang w:val="es-MX"/>
-        </w:rPr>
-        <w:t xml:space="preserve">: </w:t>
-      </w:r>
-      <w:r>
-        <w:rPr>
-          <w:b/>
-          <w:bCs/>
-          <w:sz w:val="18"/>
-          <w:szCs w:val="18"/>
-          <w:lang w:val="es-MX"/>
-        </w:rPr>
-        <w:t>-</w:t>
-      </w:r>
-    </w:p>
-    <w:p>
-      <w:pPr>
-        <w:rPr>
-          <w:rFonts w:ascii="Arial" w:hAnsi="Arial" w:cs="Arial"/>
-          <w:bCs/>
-          <w:sz w:val="18"/>
-          <w:szCs w:val="18"/>
-        </w:rPr>
-      </w:pPr>
-    </w:p>
-    <w:p>
-      <w:pPr>
-        <w:rPr>
-          <w:rFonts w:ascii="Arial" w:hAnsi="Arial" w:cs="Arial"/>
-          <w:bCs/>
-          <w:sz w:val="18"/>
-          <w:szCs w:val="18"/>
-        </w:rPr>
-      </w:pPr>
-    </w:p>
-    <w:p>
-      <w:pPr>
-        <w:rPr>
-          <w:rFonts w:ascii="Arial" w:hAnsi="Arial" w:cs="Arial"/>
-          <w:b/>
           <w:sz w:val="18"/>
           <w:szCs w:val="18"/>
           <w:u w:val="single"/>
         </w:rPr>
-      </w:pPr>
-      <w:r>
-        <w:rPr>
-          <w:rFonts w:ascii="Arial" w:hAnsi="Arial" w:cs="Arial"/>
-          <w:b/>
-          <w:sz w:val="18"/>
-          <w:szCs w:val="18"/>
-          <w:u w:val="single"/>
-        </w:rPr>
-        <w:t>RESUMEN PROFESIONAL</w:t>
+        <w:t xml:space="preserve"> PROFESIONAL</w:t>
       </w:r>
     </w:p>
     <w:p>
@@ -239,7 +171,6 @@
                 <w:lang w:val="es-419"/>
               </w:rPr>
             </w:pPr>
-            <w:proofErr w:type="gramStart"/>
             <w:r>
               <w:rPr>
                 <w:rFonts w:ascii="Arial" w:eastAsia="Times New Roman" w:hAnsi="Arial" w:cs="Arial"/>
@@ -259,18 +190,7 @@
                 <w:szCs w:val="18"/>
                 <w:lang w:val="en-US" w:eastAsia="es-ES"/>
               </w:rPr>
-              <w:t>resumen</w:t>
-            </w:r>
-            <w:proofErr w:type="gramEnd"/>
-            <w:r>
-              <w:rPr>
-                <w:rFonts w:ascii="Arial" w:eastAsia="Times New Roman" w:hAnsi="Arial" w:cs="Arial"/>
-                <w:bCs/>
-                <w:sz w:val="18"/>
-                <w:szCs w:val="18"/>
-                <w:lang w:val="en-US" w:eastAsia="es-ES"/>
-              </w:rPr>
-              <w:t>_profesional</w:t>
+              <w:t>resumen_profesional</w:t>
             </w:r>
             <w:proofErr w:type="spellEnd"/>
             <w:r>
@@ -358,18 +278,7 @@
           <w:szCs w:val="18"/>
           <w:lang w:val="en-US"/>
         </w:rPr>
-        <w:t>experiencia_</w:t>
-      </w:r>
-      <w:proofErr w:type="gramStart"/>
-      <w:r>
-        <w:rPr>
-          <w:rFonts w:ascii="Arial" w:hAnsi="Arial" w:cs="Arial"/>
-          <w:bCs/>
-          <w:sz w:val="18"/>
-          <w:szCs w:val="18"/>
-          <w:lang w:val="en-US"/>
-        </w:rPr>
-        <w:t>laboral</w:t>
+        <w:t>experiencia_laboral</w:t>
       </w:r>
       <w:proofErr w:type="spellEnd"/>
       <w:r>
@@ -379,662 +288,6 @@
           <w:sz w:val="18"/>
           <w:szCs w:val="18"/>
           <w:lang w:val="en-US"/>
-        </w:rPr>
-        <w:t xml:space="preserve"> %}</w:t>
-      </w:r>
-      <w:proofErr w:type="gramEnd"/>
-    </w:p>
-    <w:tbl>
-      <w:tblPr>
-        <w:tblW w:w="0" w:type="auto"/>
-        <w:tblInd w:w="-75" w:type="dxa"/>
-        <w:tblBorders>
-          <w:top w:val="single" w:sz="4" w:space="0" w:color="auto"/>
-          <w:left w:val="single" w:sz="4" w:space="0" w:color="auto"/>
-          <w:bottom w:val="single" w:sz="4" w:space="0" w:color="auto"/>
-          <w:right w:val="single" w:sz="4" w:space="0" w:color="auto"/>
-          <w:insideH w:val="single" w:sz="4" w:space="0" w:color="auto"/>
-          <w:insideV w:val="single" w:sz="4" w:space="0" w:color="auto"/>
-        </w:tblBorders>
-        <w:tblLayout w:type="fixed"/>
-        <w:tblCellMar>
-          <w:left w:w="105" w:type="dxa"/>
-          <w:right w:w="105" w:type="dxa"/>
-        </w:tblCellMar>
-        <w:tblLook w:val="0000" w:firstRow="0" w:lastRow="0" w:firstColumn="0" w:lastColumn="0" w:noHBand="0" w:noVBand="0"/>
-      </w:tblPr>
-      <w:tblGrid>
-        <w:gridCol w:w="2472"/>
-        <w:gridCol w:w="2472"/>
-        <w:gridCol w:w="2472"/>
-        <w:gridCol w:w="2475"/>
-      </w:tblGrid>
-      <w:tr>
-        <w:tc>
-          <w:tcPr>
-            <w:tcW w:w="2472" w:type="dxa"/>
-          </w:tcPr>
-          <w:p>
-            <w:pPr>
-              <w:rPr>
-                <w:rFonts w:ascii="Arial" w:hAnsi="Arial" w:cs="Arial"/>
-                <w:b/>
-                <w:sz w:val="18"/>
-                <w:szCs w:val="18"/>
-                <w:lang w:val="es-MX"/>
-              </w:rPr>
-            </w:pPr>
-            <w:r>
-              <w:rPr>
-                <w:rFonts w:ascii="Arial" w:hAnsi="Arial" w:cs="Arial"/>
-                <w:b/>
-                <w:sz w:val="18"/>
-                <w:szCs w:val="18"/>
-                <w:lang w:val="es-MX"/>
-              </w:rPr>
-              <w:t>Empresa</w:t>
-            </w:r>
-          </w:p>
-          <w:p>
-            <w:pPr>
-              <w:rPr>
-                <w:rFonts w:ascii="Arial" w:hAnsi="Arial" w:cs="Arial"/>
-                <w:color w:val="0070C0"/>
-                <w:sz w:val="18"/>
-                <w:szCs w:val="18"/>
-                <w:lang w:val="es-MX"/>
-              </w:rPr>
-            </w:pPr>
-            <w:proofErr w:type="gramStart"/>
-            <w:r>
-              <w:rPr>
-                <w:rFonts w:ascii="Arial" w:hAnsi="Arial" w:cs="Arial"/>
-                <w:sz w:val="18"/>
-                <w:szCs w:val="18"/>
-                <w:lang w:val="es-MX"/>
-              </w:rPr>
-              <w:t xml:space="preserve">{{ </w:t>
-            </w:r>
-            <w:proofErr w:type="spellStart"/>
-            <w:r>
-              <w:rPr>
-                <w:rFonts w:ascii="Arial" w:hAnsi="Arial" w:cs="Arial"/>
-                <w:sz w:val="18"/>
-                <w:szCs w:val="18"/>
-                <w:lang w:val="es-MX"/>
-              </w:rPr>
-              <w:t>exp</w:t>
-            </w:r>
-            <w:proofErr w:type="gramEnd"/>
-            <w:r>
-              <w:rPr>
-                <w:rFonts w:ascii="Arial" w:hAnsi="Arial" w:cs="Arial"/>
-                <w:sz w:val="18"/>
-                <w:szCs w:val="18"/>
-                <w:lang w:val="es-MX"/>
-              </w:rPr>
-              <w:t>.empresa</w:t>
-            </w:r>
-            <w:proofErr w:type="spellEnd"/>
-            <w:r>
-              <w:rPr>
-                <w:rFonts w:ascii="Arial" w:hAnsi="Arial" w:cs="Arial"/>
-                <w:sz w:val="18"/>
-                <w:szCs w:val="18"/>
-                <w:lang w:val="es-MX"/>
-              </w:rPr>
-              <w:t xml:space="preserve"> }}</w:t>
-            </w:r>
-          </w:p>
-        </w:tc>
-        <w:tc>
-          <w:tcPr>
-            <w:tcW w:w="2472" w:type="dxa"/>
-          </w:tcPr>
-          <w:p>
-            <w:pPr>
-              <w:rPr>
-                <w:rFonts w:ascii="Arial" w:hAnsi="Arial" w:cs="Arial"/>
-                <w:b/>
-                <w:sz w:val="18"/>
-                <w:szCs w:val="18"/>
-                <w:lang w:val="es-MX"/>
-              </w:rPr>
-            </w:pPr>
-            <w:r>
-              <w:rPr>
-                <w:rFonts w:ascii="Arial" w:hAnsi="Arial" w:cs="Arial"/>
-                <w:b/>
-                <w:sz w:val="18"/>
-                <w:szCs w:val="18"/>
-                <w:lang w:val="es-MX"/>
-              </w:rPr>
-              <w:t>Puesto</w:t>
-            </w:r>
-          </w:p>
-          <w:p>
-            <w:pPr>
-              <w:rPr>
-                <w:rFonts w:ascii="Arial" w:hAnsi="Arial" w:cs="Arial"/>
-                <w:bCs/>
-                <w:sz w:val="18"/>
-                <w:szCs w:val="18"/>
-                <w:lang w:val="es-MX"/>
-              </w:rPr>
-            </w:pPr>
-            <w:proofErr w:type="gramStart"/>
-            <w:r>
-              <w:rPr>
-                <w:rFonts w:ascii="Arial" w:hAnsi="Arial" w:cs="Arial"/>
-                <w:sz w:val="18"/>
-                <w:szCs w:val="18"/>
-                <w:lang w:val="es-MX"/>
-              </w:rPr>
-              <w:t xml:space="preserve">{{ </w:t>
-            </w:r>
-            <w:proofErr w:type="spellStart"/>
-            <w:r>
-              <w:rPr>
-                <w:rFonts w:ascii="Arial" w:hAnsi="Arial" w:cs="Arial"/>
-                <w:sz w:val="18"/>
-                <w:szCs w:val="18"/>
-                <w:lang w:val="es-MX"/>
-              </w:rPr>
-              <w:t>exp</w:t>
-            </w:r>
-            <w:proofErr w:type="gramEnd"/>
-            <w:r>
-              <w:rPr>
-                <w:rFonts w:ascii="Arial" w:hAnsi="Arial" w:cs="Arial"/>
-                <w:sz w:val="18"/>
-                <w:szCs w:val="18"/>
-                <w:lang w:val="es-MX"/>
-              </w:rPr>
-              <w:t>.puesto</w:t>
-            </w:r>
-            <w:proofErr w:type="spellEnd"/>
-            <w:r>
-              <w:rPr>
-                <w:rFonts w:ascii="Arial" w:hAnsi="Arial" w:cs="Arial"/>
-                <w:sz w:val="18"/>
-                <w:szCs w:val="18"/>
-                <w:lang w:val="es-MX"/>
-              </w:rPr>
-              <w:t xml:space="preserve"> }}</w:t>
-            </w:r>
-          </w:p>
-        </w:tc>
-        <w:tc>
-          <w:tcPr>
-            <w:tcW w:w="2472" w:type="dxa"/>
-          </w:tcPr>
-          <w:p>
-            <w:pPr>
-              <w:rPr>
-                <w:rFonts w:ascii="Arial" w:hAnsi="Arial" w:cs="Arial"/>
-                <w:b/>
-                <w:sz w:val="18"/>
-                <w:szCs w:val="18"/>
-                <w:lang w:val="es-MX"/>
-              </w:rPr>
-            </w:pPr>
-            <w:r>
-              <w:rPr>
-                <w:rFonts w:ascii="Arial" w:hAnsi="Arial" w:cs="Arial"/>
-                <w:b/>
-                <w:sz w:val="18"/>
-                <w:szCs w:val="18"/>
-                <w:lang w:val="es-MX"/>
-              </w:rPr>
-              <w:t>Desde:</w:t>
-            </w:r>
-          </w:p>
-          <w:p>
-            <w:pPr>
-              <w:rPr>
-                <w:rFonts w:ascii="Arial" w:hAnsi="Arial" w:cs="Arial"/>
-                <w:bCs/>
-                <w:sz w:val="18"/>
-                <w:szCs w:val="18"/>
-                <w:lang w:val="es-MX"/>
-              </w:rPr>
-            </w:pPr>
-            <w:proofErr w:type="gramStart"/>
-            <w:r>
-              <w:rPr>
-                <w:rFonts w:ascii="Arial" w:hAnsi="Arial" w:cs="Arial"/>
-                <w:sz w:val="18"/>
-                <w:szCs w:val="18"/>
-                <w:lang w:val="es-MX"/>
-              </w:rPr>
-              <w:t xml:space="preserve">{{ </w:t>
-            </w:r>
-            <w:proofErr w:type="spellStart"/>
-            <w:r>
-              <w:rPr>
-                <w:rFonts w:ascii="Arial" w:hAnsi="Arial" w:cs="Arial"/>
-                <w:sz w:val="18"/>
-                <w:szCs w:val="18"/>
-                <w:lang w:val="es-MX"/>
-              </w:rPr>
-              <w:t>exp</w:t>
-            </w:r>
-            <w:proofErr w:type="gramEnd"/>
-            <w:r>
-              <w:rPr>
-                <w:rFonts w:ascii="Arial" w:hAnsi="Arial" w:cs="Arial"/>
-                <w:sz w:val="18"/>
-                <w:szCs w:val="18"/>
-                <w:lang w:val="es-MX"/>
-              </w:rPr>
-              <w:t>.fecha_inicio</w:t>
-            </w:r>
-            <w:proofErr w:type="spellEnd"/>
-            <w:r>
-              <w:rPr>
-                <w:rFonts w:ascii="Arial" w:hAnsi="Arial" w:cs="Arial"/>
-                <w:sz w:val="18"/>
-                <w:szCs w:val="18"/>
-                <w:lang w:val="es-MX"/>
-              </w:rPr>
-              <w:t xml:space="preserve"> }}</w:t>
-            </w:r>
-          </w:p>
-        </w:tc>
-        <w:tc>
-          <w:tcPr>
-            <w:tcW w:w="2475" w:type="dxa"/>
-          </w:tcPr>
-          <w:p>
-            <w:pPr>
-              <w:pStyle w:val="Heading2"/>
-              <w:rPr>
-                <w:bCs w:val="0"/>
-                <w:szCs w:val="18"/>
-                <w:lang w:val="es-MX"/>
-              </w:rPr>
-            </w:pPr>
-            <w:r>
-              <w:rPr>
-                <w:bCs w:val="0"/>
-                <w:szCs w:val="18"/>
-                <w:lang w:val="es-MX"/>
-              </w:rPr>
-              <w:t xml:space="preserve">Hasta: </w:t>
-            </w:r>
-          </w:p>
-          <w:p>
-            <w:pPr>
-              <w:rPr>
-                <w:rFonts w:ascii="Arial" w:hAnsi="Arial" w:cs="Arial"/>
-                <w:sz w:val="18"/>
-                <w:szCs w:val="18"/>
-                <w:lang w:val="es-MX"/>
-              </w:rPr>
-            </w:pPr>
-            <w:proofErr w:type="gramStart"/>
-            <w:r>
-              <w:rPr>
-                <w:rFonts w:ascii="Arial" w:hAnsi="Arial" w:cs="Arial"/>
-                <w:sz w:val="18"/>
-                <w:szCs w:val="18"/>
-                <w:lang w:val="es-MX"/>
-              </w:rPr>
-              <w:t xml:space="preserve">{{ </w:t>
-            </w:r>
-            <w:proofErr w:type="spellStart"/>
-            <w:r>
-              <w:rPr>
-                <w:rFonts w:ascii="Arial" w:hAnsi="Arial" w:cs="Arial"/>
-                <w:sz w:val="18"/>
-                <w:szCs w:val="18"/>
-                <w:lang w:val="es-MX"/>
-              </w:rPr>
-              <w:t>exp</w:t>
-            </w:r>
-            <w:proofErr w:type="gramEnd"/>
-            <w:r>
-              <w:rPr>
-                <w:rFonts w:ascii="Arial" w:hAnsi="Arial" w:cs="Arial"/>
-                <w:sz w:val="18"/>
-                <w:szCs w:val="18"/>
-                <w:lang w:val="es-MX"/>
-              </w:rPr>
-              <w:t>.fecha_fin</w:t>
-            </w:r>
-            <w:proofErr w:type="spellEnd"/>
-            <w:r>
-              <w:rPr>
-                <w:rFonts w:ascii="Arial" w:hAnsi="Arial" w:cs="Arial"/>
-                <w:sz w:val="18"/>
-                <w:szCs w:val="18"/>
-                <w:lang w:val="es-MX"/>
-              </w:rPr>
-              <w:t xml:space="preserve"> }}</w:t>
-            </w:r>
-          </w:p>
-        </w:tc>
-      </w:tr>
-    </w:tbl>
-    <w:p>
-      <w:pPr>
-        <w:rPr>
-          <w:rFonts w:ascii="Arial" w:hAnsi="Arial" w:cs="Arial"/>
-          <w:bCs/>
-          <w:sz w:val="18"/>
-          <w:szCs w:val="18"/>
-          <w:lang w:val="en-US"/>
-        </w:rPr>
-      </w:pPr>
-    </w:p>
-    <w:tbl>
-      <w:tblPr>
-        <w:tblW w:w="0" w:type="auto"/>
-        <w:tblInd w:w="-75" w:type="dxa"/>
-        <w:tblBorders>
-          <w:top w:val="single" w:sz="4" w:space="0" w:color="auto"/>
-          <w:left w:val="single" w:sz="4" w:space="0" w:color="auto"/>
-          <w:bottom w:val="single" w:sz="4" w:space="0" w:color="auto"/>
-          <w:right w:val="single" w:sz="4" w:space="0" w:color="auto"/>
-          <w:insideH w:val="single" w:sz="4" w:space="0" w:color="auto"/>
-          <w:insideV w:val="single" w:sz="4" w:space="0" w:color="auto"/>
-        </w:tblBorders>
-        <w:tblLayout w:type="fixed"/>
-        <w:tblCellMar>
-          <w:left w:w="105" w:type="dxa"/>
-          <w:right w:w="105" w:type="dxa"/>
-        </w:tblCellMar>
-        <w:tblLook w:val="0000" w:firstRow="0" w:lastRow="0" w:firstColumn="0" w:lastColumn="0" w:noHBand="0" w:noVBand="0"/>
-      </w:tblPr>
-      <w:tblGrid>
-        <w:gridCol w:w="2070"/>
-        <w:gridCol w:w="7821"/>
-      </w:tblGrid>
-      <w:tr>
-        <w:tc>
-          <w:tcPr>
-            <w:tcW w:w="2070" w:type="dxa"/>
-          </w:tcPr>
-          <w:p>
-            <w:pPr>
-              <w:rPr>
-                <w:rFonts w:ascii="Arial" w:hAnsi="Arial" w:cs="Arial"/>
-                <w:b/>
-                <w:bCs/>
-                <w:sz w:val="18"/>
-                <w:szCs w:val="18"/>
-              </w:rPr>
-            </w:pPr>
-            <w:r>
-              <w:rPr>
-                <w:rFonts w:ascii="Arial" w:hAnsi="Arial" w:cs="Arial"/>
-                <w:b/>
-                <w:bCs/>
-                <w:sz w:val="18"/>
-                <w:szCs w:val="18"/>
-                <w:lang w:val="es-MX"/>
-              </w:rPr>
-              <w:t>Actividades Principales</w:t>
-            </w:r>
-          </w:p>
-        </w:tc>
-        <w:tc>
-          <w:tcPr>
-            <w:tcW w:w="7821" w:type="dxa"/>
-          </w:tcPr>
-          <w:p>
-            <w:pPr>
-              <w:pStyle w:val="NoSpacing"/>
-              <w:ind w:left="0"/>
-              <w:jc w:val="both"/>
-              <w:rPr>
-                <w:sz w:val="18"/>
-                <w:szCs w:val="20"/>
-              </w:rPr>
-            </w:pPr>
-            <w:r>
-              <w:rPr>
-                <w:sz w:val="18"/>
-                <w:szCs w:val="20"/>
-              </w:rPr>
-              <w:t xml:space="preserve">{% for act in </w:t>
-            </w:r>
-            <w:proofErr w:type="spellStart"/>
-            <w:proofErr w:type="gramStart"/>
-            <w:r>
-              <w:rPr>
-                <w:sz w:val="18"/>
-                <w:szCs w:val="20"/>
-              </w:rPr>
-              <w:t>exp.actividades</w:t>
-            </w:r>
-            <w:proofErr w:type="spellEnd"/>
-            <w:proofErr w:type="gramEnd"/>
-            <w:r>
-              <w:rPr>
-                <w:sz w:val="18"/>
-                <w:szCs w:val="20"/>
-              </w:rPr>
-              <w:t xml:space="preserve"> </w:t>
-            </w:r>
-            <w:proofErr w:type="gramStart"/>
-            <w:r>
-              <w:rPr>
-                <w:sz w:val="18"/>
-                <w:szCs w:val="20"/>
-              </w:rPr>
-              <w:t>%}•</w:t>
-            </w:r>
-            <w:proofErr w:type="gramEnd"/>
-            <w:r>
-              <w:rPr>
-                <w:sz w:val="18"/>
-                <w:szCs w:val="20"/>
-              </w:rPr>
-              <w:t xml:space="preserve"> </w:t>
-            </w:r>
-            <w:proofErr w:type="gramStart"/>
-            <w:r>
-              <w:rPr>
-                <w:sz w:val="18"/>
-                <w:szCs w:val="20"/>
-              </w:rPr>
-              <w:t>{{ act</w:t>
-            </w:r>
-            <w:proofErr w:type="gramEnd"/>
-            <w:r>
-              <w:rPr>
-                <w:sz w:val="18"/>
-                <w:szCs w:val="20"/>
-              </w:rPr>
-              <w:t xml:space="preserve"> }}</w:t>
-            </w:r>
-          </w:p>
-          <w:p>
-            <w:pPr>
-              <w:pStyle w:val="NoSpacing"/>
-              <w:ind w:left="0"/>
-              <w:jc w:val="both"/>
-              <w:rPr>
-                <w:szCs w:val="22"/>
-              </w:rPr>
-            </w:pPr>
-            <w:r>
-              <w:rPr>
-                <w:sz w:val="18"/>
-                <w:szCs w:val="20"/>
-              </w:rPr>
-              <w:t xml:space="preserve">{% </w:t>
-            </w:r>
-            <w:proofErr w:type="spellStart"/>
-            <w:r>
-              <w:rPr>
-                <w:sz w:val="18"/>
-                <w:szCs w:val="20"/>
-              </w:rPr>
-              <w:t>endfor</w:t>
-            </w:r>
-            <w:proofErr w:type="spellEnd"/>
-            <w:r>
-              <w:rPr>
-                <w:sz w:val="18"/>
-                <w:szCs w:val="20"/>
-              </w:rPr>
-              <w:t xml:space="preserve"> %}</w:t>
-            </w:r>
-          </w:p>
-        </w:tc>
-      </w:tr>
-    </w:tbl>
-    <w:p>
-      <w:pPr>
-        <w:rPr>
-          <w:rFonts w:ascii="Arial" w:hAnsi="Arial" w:cs="Arial"/>
-          <w:bCs/>
-          <w:sz w:val="18"/>
-          <w:szCs w:val="18"/>
-          <w:lang w:val="es-419"/>
-        </w:rPr>
-      </w:pPr>
-      <w:r>
-        <w:rPr>
-          <w:rFonts w:ascii="Arial" w:hAnsi="Arial" w:cs="Arial"/>
-          <w:bCs/>
-          <w:sz w:val="18"/>
-          <w:szCs w:val="18"/>
-          <w:lang w:val="es-419"/>
-        </w:rPr>
-        <w:t xml:space="preserve">{% </w:t>
-      </w:r>
-      <w:proofErr w:type="spellStart"/>
-      <w:r>
-        <w:rPr>
-          <w:rFonts w:ascii="Arial" w:hAnsi="Arial" w:cs="Arial"/>
-          <w:bCs/>
-          <w:sz w:val="18"/>
-          <w:szCs w:val="18"/>
-          <w:lang w:val="es-419"/>
-        </w:rPr>
-        <w:t>endfor</w:t>
-      </w:r>
-      <w:proofErr w:type="spellEnd"/>
-      <w:r>
-        <w:rPr>
-          <w:rFonts w:ascii="Arial" w:hAnsi="Arial" w:cs="Arial"/>
-          <w:bCs/>
-          <w:sz w:val="18"/>
-          <w:szCs w:val="18"/>
-          <w:lang w:val="es-419"/>
-        </w:rPr>
-        <w:t xml:space="preserve"> </w:t>
-      </w:r>
-      <w:proofErr w:type="gramStart"/>
-      <w:r>
-        <w:rPr>
-          <w:rFonts w:ascii="Arial" w:hAnsi="Arial" w:cs="Arial"/>
-          <w:bCs/>
-          <w:sz w:val="18"/>
-          <w:szCs w:val="18"/>
-          <w:lang w:val="es-419"/>
-        </w:rPr>
-        <w:t>%}</w:t>
-      </w:r>
-      <w:r>
-        <w:rPr>
-          <w:rFonts w:ascii="Arial" w:hAnsi="Arial" w:cs="Arial"/>
-          <w:bCs/>
-          <w:sz w:val="18"/>
-          <w:szCs w:val="18"/>
-          <w:lang w:val="es-MX"/>
-        </w:rPr>
-        <w:t>{</w:t>
-      </w:r>
-      <w:proofErr w:type="gramEnd"/>
-      <w:r>
-        <w:rPr>
-          <w:rFonts w:ascii="Arial" w:hAnsi="Arial" w:cs="Arial"/>
-          <w:bCs/>
-          <w:sz w:val="18"/>
-          <w:szCs w:val="18"/>
-          <w:lang w:val="es-MX"/>
-        </w:rPr>
-        <w:t xml:space="preserve">% </w:t>
-      </w:r>
-      <w:proofErr w:type="spellStart"/>
-      <w:r>
-        <w:rPr>
-          <w:rFonts w:ascii="Arial" w:hAnsi="Arial" w:cs="Arial"/>
-          <w:bCs/>
-          <w:sz w:val="18"/>
-          <w:szCs w:val="18"/>
-          <w:lang w:val="es-MX"/>
-        </w:rPr>
-        <w:t>if</w:t>
-      </w:r>
-      <w:proofErr w:type="spellEnd"/>
-      <w:r>
-        <w:rPr>
-          <w:rFonts w:ascii="Arial" w:hAnsi="Arial" w:cs="Arial"/>
-          <w:bCs/>
-          <w:sz w:val="18"/>
-          <w:szCs w:val="18"/>
-          <w:lang w:val="es-MX"/>
-        </w:rPr>
-        <w:t xml:space="preserve"> </w:t>
-      </w:r>
-      <w:proofErr w:type="spellStart"/>
-      <w:r>
-        <w:rPr>
-          <w:rFonts w:ascii="Arial" w:hAnsi="Arial" w:cs="Arial"/>
-          <w:bCs/>
-          <w:sz w:val="18"/>
-          <w:szCs w:val="18"/>
-          <w:lang w:val="es-MX"/>
-        </w:rPr>
-        <w:t>ajuste_puesto_liderazgo</w:t>
-      </w:r>
-      <w:proofErr w:type="spellEnd"/>
-      <w:r>
-        <w:rPr>
-          <w:rFonts w:ascii="Arial" w:hAnsi="Arial" w:cs="Arial"/>
-          <w:bCs/>
-          <w:sz w:val="18"/>
-          <w:szCs w:val="18"/>
-          <w:lang w:val="es-MX"/>
-        </w:rPr>
-        <w:t xml:space="preserve"> and </w:t>
-      </w:r>
-      <w:proofErr w:type="spellStart"/>
-      <w:r>
-        <w:rPr>
-          <w:rFonts w:ascii="Arial" w:hAnsi="Arial" w:cs="Arial"/>
-          <w:bCs/>
-          <w:sz w:val="18"/>
-          <w:szCs w:val="18"/>
-          <w:lang w:val="es-MX"/>
-        </w:rPr>
-        <w:t>ajuste_puesto_</w:t>
-      </w:r>
-      <w:proofErr w:type="gramStart"/>
-      <w:r>
-        <w:rPr>
-          <w:rFonts w:ascii="Arial" w:hAnsi="Arial" w:cs="Arial"/>
-          <w:bCs/>
-          <w:sz w:val="18"/>
-          <w:szCs w:val="18"/>
-          <w:lang w:val="es-MX"/>
-        </w:rPr>
-        <w:t>liderazgo.puesto</w:t>
-      </w:r>
-      <w:proofErr w:type="spellEnd"/>
-      <w:proofErr w:type="gramEnd"/>
-      <w:r>
-        <w:rPr>
-          <w:rFonts w:ascii="Arial" w:hAnsi="Arial" w:cs="Arial"/>
-          <w:bCs/>
-          <w:sz w:val="18"/>
-          <w:szCs w:val="18"/>
-          <w:lang w:val="es-MX"/>
         </w:rPr>
         <w:t xml:space="preserve"> %}</w:t>
       </w:r>
@@ -1100,7 +353,6 @@
                 <w:lang w:val="es-MX"/>
               </w:rPr>
             </w:pPr>
-            <w:proofErr w:type="gramStart"/>
             <w:r>
               <w:rPr>
                 <w:rFonts w:ascii="Arial" w:hAnsi="Arial" w:cs="Arial"/>
@@ -1118,30 +370,9 @@
                 <w:szCs w:val="18"/>
                 <w:lang w:val="es-MX"/>
               </w:rPr>
-              <w:t>ajuste</w:t>
-            </w:r>
-            <w:proofErr w:type="gramEnd"/>
-            <w:r>
-              <w:rPr>
-                <w:rFonts w:ascii="Arial" w:hAnsi="Arial" w:cs="Arial"/>
-                <w:sz w:val="18"/>
-                <w:szCs w:val="18"/>
-                <w:lang w:val="es-MX"/>
-              </w:rPr>
-              <w:t>_puesto_</w:t>
-            </w:r>
-            <w:proofErr w:type="gramStart"/>
-            <w:r>
-              <w:rPr>
-                <w:rFonts w:ascii="Arial" w:hAnsi="Arial" w:cs="Arial"/>
-                <w:sz w:val="18"/>
-                <w:szCs w:val="18"/>
-                <w:lang w:val="es-MX"/>
-              </w:rPr>
-              <w:t>liderazgo.empresa</w:t>
+              <w:t>exp.empresa</w:t>
             </w:r>
             <w:proofErr w:type="spellEnd"/>
-            <w:proofErr w:type="gramEnd"/>
             <w:r>
               <w:rPr>
                 <w:rFonts w:ascii="Arial" w:hAnsi="Arial" w:cs="Arial"/>
@@ -1188,7 +419,6 @@
                 <w:lang w:val="es-MX"/>
               </w:rPr>
             </w:pPr>
-            <w:proofErr w:type="gramStart"/>
             <w:r>
               <w:rPr>
                 <w:rFonts w:ascii="Arial" w:hAnsi="Arial" w:cs="Arial"/>
@@ -1206,30 +436,9 @@
                 <w:szCs w:val="18"/>
                 <w:lang w:val="es-MX"/>
               </w:rPr>
-              <w:t>ajuste</w:t>
-            </w:r>
-            <w:proofErr w:type="gramEnd"/>
-            <w:r>
-              <w:rPr>
-                <w:rFonts w:ascii="Arial" w:hAnsi="Arial" w:cs="Arial"/>
-                <w:sz w:val="18"/>
-                <w:szCs w:val="18"/>
-                <w:lang w:val="es-MX"/>
-              </w:rPr>
-              <w:t>_puesto_</w:t>
-            </w:r>
-            <w:proofErr w:type="gramStart"/>
-            <w:r>
-              <w:rPr>
-                <w:rFonts w:ascii="Arial" w:hAnsi="Arial" w:cs="Arial"/>
-                <w:sz w:val="18"/>
-                <w:szCs w:val="18"/>
-                <w:lang w:val="es-MX"/>
-              </w:rPr>
-              <w:t>liderazgo.puesto</w:t>
+              <w:t>exp.puesto</w:t>
             </w:r>
             <w:proofErr w:type="spellEnd"/>
-            <w:proofErr w:type="gramEnd"/>
             <w:r>
               <w:rPr>
                 <w:rFonts w:ascii="Arial" w:hAnsi="Arial" w:cs="Arial"/>
@@ -1276,7 +485,6 @@
                 <w:lang w:val="es-MX"/>
               </w:rPr>
             </w:pPr>
-            <w:proofErr w:type="gramStart"/>
             <w:r>
               <w:rPr>
                 <w:rFonts w:ascii="Arial" w:hAnsi="Arial" w:cs="Arial"/>
@@ -1294,46 +502,7 @@
                 <w:szCs w:val="18"/>
                 <w:lang w:val="es-MX"/>
               </w:rPr>
-              <w:t>ajuste</w:t>
-            </w:r>
-            <w:proofErr w:type="gramEnd"/>
-            <w:r>
-              <w:rPr>
-                <w:rFonts w:ascii="Arial" w:hAnsi="Arial" w:cs="Arial"/>
-                <w:sz w:val="18"/>
-                <w:szCs w:val="18"/>
-                <w:lang w:val="es-MX"/>
-              </w:rPr>
-              <w:t>_puesto_</w:t>
-            </w:r>
-            <w:proofErr w:type="gramStart"/>
-            <w:r>
-              <w:rPr>
-                <w:rFonts w:ascii="Arial" w:hAnsi="Arial" w:cs="Arial"/>
-                <w:sz w:val="18"/>
-                <w:szCs w:val="18"/>
-                <w:lang w:val="es-MX"/>
-              </w:rPr>
-              <w:t>liderazgo.</w:t>
-            </w:r>
-            <w:r>
-              <w:rPr>
-                <w:rFonts w:ascii="Arial" w:hAnsi="Arial" w:cs="Arial"/>
-                <w:sz w:val="18"/>
-                <w:szCs w:val="18"/>
-                <w:lang w:val="es-MX"/>
-              </w:rPr>
-              <w:t>fecha</w:t>
-            </w:r>
-            <w:proofErr w:type="gramEnd"/>
-            <w:r>
-              <w:rPr>
-                <w:rFonts w:ascii="Arial" w:hAnsi="Arial" w:cs="Arial"/>
-                <w:sz w:val="18"/>
-                <w:szCs w:val="18"/>
-                <w:lang w:val="es-MX"/>
-              </w:rPr>
-              <w:t>_inicio</w:t>
+              <w:t>exp.fecha_inicio</w:t>
             </w:r>
             <w:proofErr w:type="spellEnd"/>
             <w:r>
@@ -1378,7 +547,6 @@
                 <w:lang w:val="es-MX"/>
               </w:rPr>
             </w:pPr>
-            <w:proofErr w:type="gramStart"/>
             <w:r>
               <w:rPr>
                 <w:rFonts w:ascii="Arial" w:hAnsi="Arial" w:cs="Arial"/>
@@ -1396,46 +564,568 @@
                 <w:szCs w:val="18"/>
                 <w:lang w:val="es-MX"/>
               </w:rPr>
-              <w:t>ajuste</w:t>
-            </w:r>
-            <w:proofErr w:type="gramEnd"/>
-            <w:r>
-              <w:rPr>
-                <w:rFonts w:ascii="Arial" w:hAnsi="Arial" w:cs="Arial"/>
-                <w:sz w:val="18"/>
-                <w:szCs w:val="18"/>
-                <w:lang w:val="es-MX"/>
-              </w:rPr>
-              <w:t>_puesto_</w:t>
-            </w:r>
-            <w:proofErr w:type="gramStart"/>
-            <w:r>
-              <w:rPr>
-                <w:rFonts w:ascii="Arial" w:hAnsi="Arial" w:cs="Arial"/>
-                <w:sz w:val="18"/>
-                <w:szCs w:val="18"/>
-                <w:lang w:val="es-MX"/>
-              </w:rPr>
-              <w:t>liderazgo.</w:t>
-            </w:r>
-            <w:r>
-              <w:rPr>
-                <w:rFonts w:ascii="Arial" w:hAnsi="Arial" w:cs="Arial"/>
-                <w:sz w:val="18"/>
-                <w:szCs w:val="18"/>
-                <w:lang w:val="es-MX"/>
-              </w:rPr>
-              <w:t>fecha</w:t>
-            </w:r>
-            <w:proofErr w:type="gramEnd"/>
-            <w:r>
-              <w:rPr>
-                <w:rFonts w:ascii="Arial" w:hAnsi="Arial" w:cs="Arial"/>
-                <w:sz w:val="18"/>
-                <w:szCs w:val="18"/>
-                <w:lang w:val="es-MX"/>
-              </w:rPr>
-              <w:t>_fin</w:t>
+              <w:t>exp.fecha_fin</w:t>
+            </w:r>
+            <w:proofErr w:type="spellEnd"/>
+            <w:r>
+              <w:rPr>
+                <w:rFonts w:ascii="Arial" w:hAnsi="Arial" w:cs="Arial"/>
+                <w:sz w:val="18"/>
+                <w:szCs w:val="18"/>
+                <w:lang w:val="es-MX"/>
+              </w:rPr>
+              <w:t xml:space="preserve"> }}</w:t>
+            </w:r>
+          </w:p>
+        </w:tc>
+      </w:tr>
+    </w:tbl>
+    <w:p>
+      <w:pPr>
+        <w:rPr>
+          <w:rFonts w:ascii="Arial" w:hAnsi="Arial" w:cs="Arial"/>
+          <w:bCs/>
+          <w:sz w:val="18"/>
+          <w:szCs w:val="18"/>
+          <w:lang w:val="en-US"/>
+        </w:rPr>
+      </w:pPr>
+    </w:p>
+    <w:tbl>
+      <w:tblPr>
+        <w:tblW w:w="0" w:type="auto"/>
+        <w:tblInd w:w="-75" w:type="dxa"/>
+        <w:tblBorders>
+          <w:top w:val="single" w:sz="4" w:space="0" w:color="auto"/>
+          <w:left w:val="single" w:sz="4" w:space="0" w:color="auto"/>
+          <w:bottom w:val="single" w:sz="4" w:space="0" w:color="auto"/>
+          <w:right w:val="single" w:sz="4" w:space="0" w:color="auto"/>
+          <w:insideH w:val="single" w:sz="4" w:space="0" w:color="auto"/>
+          <w:insideV w:val="single" w:sz="4" w:space="0" w:color="auto"/>
+        </w:tblBorders>
+        <w:tblLayout w:type="fixed"/>
+        <w:tblCellMar>
+          <w:left w:w="105" w:type="dxa"/>
+          <w:right w:w="105" w:type="dxa"/>
+        </w:tblCellMar>
+        <w:tblLook w:val="0000" w:firstRow="0" w:lastRow="0" w:firstColumn="0" w:lastColumn="0" w:noHBand="0" w:noVBand="0"/>
+      </w:tblPr>
+      <w:tblGrid>
+        <w:gridCol w:w="2070"/>
+        <w:gridCol w:w="7821"/>
+      </w:tblGrid>
+      <w:tr>
+        <w:tc>
+          <w:tcPr>
+            <w:tcW w:w="2070" w:type="dxa"/>
+          </w:tcPr>
+          <w:p>
+            <w:pPr>
+              <w:rPr>
+                <w:rFonts w:ascii="Arial" w:hAnsi="Arial" w:cs="Arial"/>
+                <w:b/>
+                <w:bCs/>
+                <w:sz w:val="18"/>
+                <w:szCs w:val="18"/>
+              </w:rPr>
+            </w:pPr>
+            <w:r>
+              <w:rPr>
+                <w:rFonts w:ascii="Arial" w:hAnsi="Arial" w:cs="Arial"/>
+                <w:b/>
+                <w:bCs/>
+                <w:sz w:val="18"/>
+                <w:szCs w:val="18"/>
+                <w:lang w:val="es-MX"/>
+              </w:rPr>
+              <w:t>Actividades Principales</w:t>
+            </w:r>
+          </w:p>
+        </w:tc>
+        <w:tc>
+          <w:tcPr>
+            <w:tcW w:w="7821" w:type="dxa"/>
+          </w:tcPr>
+          <w:p>
+            <w:pPr>
+              <w:pStyle w:val="NoSpacing"/>
+              <w:ind w:left="0"/>
+              <w:jc w:val="both"/>
+              <w:rPr>
+                <w:sz w:val="18"/>
+                <w:szCs w:val="20"/>
+              </w:rPr>
+            </w:pPr>
+            <w:r>
+              <w:rPr>
+                <w:sz w:val="18"/>
+                <w:szCs w:val="20"/>
+              </w:rPr>
+              <w:t xml:space="preserve">{% for act in </w:t>
+            </w:r>
+            <w:proofErr w:type="spellStart"/>
+            <w:r>
+              <w:rPr>
+                <w:sz w:val="18"/>
+                <w:szCs w:val="20"/>
+              </w:rPr>
+              <w:t>exp.actividades</w:t>
+            </w:r>
+            <w:proofErr w:type="spellEnd"/>
+            <w:r>
+              <w:rPr>
+                <w:sz w:val="18"/>
+                <w:szCs w:val="20"/>
+              </w:rPr>
+              <w:t xml:space="preserve"> %}• {{ act }}</w:t>
+            </w:r>
+          </w:p>
+          <w:p>
+            <w:pPr>
+              <w:pStyle w:val="NoSpacing"/>
+              <w:ind w:left="0"/>
+              <w:jc w:val="both"/>
+              <w:rPr>
+                <w:szCs w:val="22"/>
+              </w:rPr>
+            </w:pPr>
+            <w:r>
+              <w:rPr>
+                <w:sz w:val="18"/>
+                <w:szCs w:val="20"/>
+              </w:rPr>
+              <w:t xml:space="preserve">{% </w:t>
+            </w:r>
+            <w:proofErr w:type="spellStart"/>
+            <w:r>
+              <w:rPr>
+                <w:sz w:val="18"/>
+                <w:szCs w:val="20"/>
+              </w:rPr>
+              <w:t>endfor</w:t>
+            </w:r>
+            <w:proofErr w:type="spellEnd"/>
+            <w:r>
+              <w:rPr>
+                <w:sz w:val="18"/>
+                <w:szCs w:val="20"/>
+              </w:rPr>
+              <w:t xml:space="preserve"> %}</w:t>
+            </w:r>
+          </w:p>
+        </w:tc>
+      </w:tr>
+    </w:tbl>
+    <w:p>
+      <w:pPr>
+        <w:rPr>
+          <w:rFonts w:ascii="Arial" w:hAnsi="Arial" w:cs="Arial"/>
+          <w:bCs/>
+          <w:sz w:val="18"/>
+          <w:szCs w:val="18"/>
+          <w:lang w:val="es-419"/>
+        </w:rPr>
+      </w:pPr>
+      <w:r>
+        <w:rPr>
+          <w:rFonts w:ascii="Arial" w:hAnsi="Arial" w:cs="Arial"/>
+          <w:bCs/>
+          <w:sz w:val="18"/>
+          <w:szCs w:val="18"/>
+          <w:lang w:val="es-419"/>
+        </w:rPr>
+        <w:t xml:space="preserve">{% </w:t>
+      </w:r>
+      <w:proofErr w:type="spellStart"/>
+      <w:r>
+        <w:rPr>
+          <w:rFonts w:ascii="Arial" w:hAnsi="Arial" w:cs="Arial"/>
+          <w:bCs/>
+          <w:sz w:val="18"/>
+          <w:szCs w:val="18"/>
+          <w:lang w:val="es-419"/>
+        </w:rPr>
+        <w:t>endfor</w:t>
+      </w:r>
+      <w:proofErr w:type="spellEnd"/>
+      <w:r>
+        <w:rPr>
+          <w:rFonts w:ascii="Arial" w:hAnsi="Arial" w:cs="Arial"/>
+          <w:bCs/>
+          <w:sz w:val="18"/>
+          <w:szCs w:val="18"/>
+          <w:lang w:val="es-419"/>
+        </w:rPr>
+        <w:t xml:space="preserve"> %}</w:t>
+      </w:r>
+      <w:r>
+        <w:rPr>
+          <w:rFonts w:ascii="Arial" w:hAnsi="Arial" w:cs="Arial"/>
+          <w:bCs/>
+          <w:sz w:val="18"/>
+          <w:szCs w:val="18"/>
+          <w:lang w:val="es-MX"/>
+        </w:rPr>
+        <w:t xml:space="preserve">{% </w:t>
+      </w:r>
+      <w:proofErr w:type="spellStart"/>
+      <w:r>
+        <w:rPr>
+          <w:rFonts w:ascii="Arial" w:hAnsi="Arial" w:cs="Arial"/>
+          <w:bCs/>
+          <w:sz w:val="18"/>
+          <w:szCs w:val="18"/>
+          <w:lang w:val="es-MX"/>
+        </w:rPr>
+        <w:t>if</w:t>
+      </w:r>
+      <w:proofErr w:type="spellEnd"/>
+      <w:r>
+        <w:rPr>
+          <w:rFonts w:ascii="Arial" w:hAnsi="Arial" w:cs="Arial"/>
+          <w:bCs/>
+          <w:sz w:val="18"/>
+          <w:szCs w:val="18"/>
+          <w:lang w:val="es-MX"/>
+        </w:rPr>
+        <w:t xml:space="preserve"> </w:t>
+      </w:r>
+      <w:proofErr w:type="spellStart"/>
+      <w:r>
+        <w:rPr>
+          <w:rFonts w:ascii="Arial" w:hAnsi="Arial" w:cs="Arial"/>
+          <w:bCs/>
+          <w:sz w:val="18"/>
+          <w:szCs w:val="18"/>
+          <w:lang w:val="es-MX"/>
+        </w:rPr>
+        <w:t>ajuste_puesto_liderazgo</w:t>
+      </w:r>
+      <w:proofErr w:type="spellEnd"/>
+      <w:r>
+        <w:rPr>
+          <w:rFonts w:ascii="Arial" w:hAnsi="Arial" w:cs="Arial"/>
+          <w:bCs/>
+          <w:sz w:val="18"/>
+          <w:szCs w:val="18"/>
+          <w:lang w:val="es-MX"/>
+        </w:rPr>
+        <w:t xml:space="preserve"> and </w:t>
+      </w:r>
+      <w:proofErr w:type="spellStart"/>
+      <w:r>
+        <w:rPr>
+          <w:rFonts w:ascii="Arial" w:hAnsi="Arial" w:cs="Arial"/>
+          <w:bCs/>
+          <w:sz w:val="18"/>
+          <w:szCs w:val="18"/>
+          <w:lang w:val="es-MX"/>
+        </w:rPr>
+        <w:t>ajuste_puesto_liderazgo.puesto</w:t>
+      </w:r>
+      <w:proofErr w:type="spellEnd"/>
+      <w:r>
+        <w:rPr>
+          <w:rFonts w:ascii="Arial" w:hAnsi="Arial" w:cs="Arial"/>
+          <w:bCs/>
+          <w:sz w:val="18"/>
+          <w:szCs w:val="18"/>
+          <w:lang w:val="es-MX"/>
+        </w:rPr>
+        <w:t xml:space="preserve"> %}</w:t>
+      </w:r>
+    </w:p>
+    <w:tbl>
+      <w:tblPr>
+        <w:tblW w:w="0" w:type="auto"/>
+        <w:tblInd w:w="-75" w:type="dxa"/>
+        <w:tblBorders>
+          <w:top w:val="single" w:sz="4" w:space="0" w:color="auto"/>
+          <w:left w:val="single" w:sz="4" w:space="0" w:color="auto"/>
+          <w:bottom w:val="single" w:sz="4" w:space="0" w:color="auto"/>
+          <w:right w:val="single" w:sz="4" w:space="0" w:color="auto"/>
+          <w:insideH w:val="single" w:sz="4" w:space="0" w:color="auto"/>
+          <w:insideV w:val="single" w:sz="4" w:space="0" w:color="auto"/>
+        </w:tblBorders>
+        <w:tblLayout w:type="fixed"/>
+        <w:tblCellMar>
+          <w:left w:w="105" w:type="dxa"/>
+          <w:right w:w="105" w:type="dxa"/>
+        </w:tblCellMar>
+        <w:tblLook w:val="0000" w:firstRow="0" w:lastRow="0" w:firstColumn="0" w:lastColumn="0" w:noHBand="0" w:noVBand="0"/>
+      </w:tblPr>
+      <w:tblGrid>
+        <w:gridCol w:w="2472"/>
+        <w:gridCol w:w="2472"/>
+        <w:gridCol w:w="2472"/>
+        <w:gridCol w:w="2475"/>
+      </w:tblGrid>
+      <w:tr>
+        <w:tc>
+          <w:tcPr>
+            <w:tcW w:w="2472" w:type="dxa"/>
+          </w:tcPr>
+          <w:p>
+            <w:pPr>
+              <w:rPr>
+                <w:rFonts w:ascii="Arial" w:hAnsi="Arial" w:cs="Arial"/>
+                <w:b/>
+                <w:sz w:val="18"/>
+                <w:szCs w:val="18"/>
+                <w:lang w:val="es-MX"/>
+              </w:rPr>
+            </w:pPr>
+            <w:r>
+              <w:rPr>
+                <w:rFonts w:ascii="Arial" w:hAnsi="Arial" w:cs="Arial"/>
+                <w:b/>
+                <w:sz w:val="18"/>
+                <w:szCs w:val="18"/>
+                <w:lang w:val="es-MX"/>
+              </w:rPr>
+              <w:t>Empresa</w:t>
+            </w:r>
+          </w:p>
+          <w:p>
+            <w:pPr>
+              <w:rPr>
+                <w:rFonts w:ascii="Arial" w:hAnsi="Arial" w:cs="Arial"/>
+                <w:color w:val="0070C0"/>
+                <w:sz w:val="18"/>
+                <w:szCs w:val="18"/>
+                <w:lang w:val="es-MX"/>
+              </w:rPr>
+            </w:pPr>
+            <w:r>
+              <w:rPr>
+                <w:rFonts w:ascii="Arial" w:hAnsi="Arial" w:cs="Arial"/>
+                <w:sz w:val="18"/>
+                <w:szCs w:val="18"/>
+                <w:lang w:val="es-MX"/>
+              </w:rPr>
+              <w:t xml:space="preserve">{{ </w:t>
+            </w:r>
+            <w:proofErr w:type="spellStart"/>
+            <w:r>
+              <w:rPr>
+                <w:rFonts w:ascii="Arial" w:hAnsi="Arial" w:cs="Arial"/>
+                <w:sz w:val="18"/>
+                <w:szCs w:val="18"/>
+                <w:lang w:val="es-MX"/>
+              </w:rPr>
+              <w:t>ajuste_puesto_liderazgo.empresa</w:t>
+            </w:r>
+            <w:proofErr w:type="spellEnd"/>
+            <w:r>
+              <w:rPr>
+                <w:rFonts w:ascii="Arial" w:hAnsi="Arial" w:cs="Arial"/>
+                <w:sz w:val="18"/>
+                <w:szCs w:val="18"/>
+                <w:lang w:val="es-MX"/>
+              </w:rPr>
+              <w:t xml:space="preserve"> }}</w:t>
+            </w:r>
+          </w:p>
+        </w:tc>
+        <w:tc>
+          <w:tcPr>
+            <w:tcW w:w="2472" w:type="dxa"/>
+          </w:tcPr>
+          <w:p>
+            <w:pPr>
+              <w:rPr>
+                <w:rFonts w:ascii="Arial" w:hAnsi="Arial" w:cs="Arial"/>
+                <w:b/>
+                <w:sz w:val="18"/>
+                <w:szCs w:val="18"/>
+                <w:lang w:val="es-MX"/>
+              </w:rPr>
+            </w:pPr>
+            <w:r>
+              <w:rPr>
+                <w:rFonts w:ascii="Arial" w:hAnsi="Arial" w:cs="Arial"/>
+                <w:b/>
+                <w:sz w:val="18"/>
+                <w:szCs w:val="18"/>
+                <w:lang w:val="es-MX"/>
+              </w:rPr>
+              <w:t>Puesto</w:t>
+            </w:r>
+          </w:p>
+          <w:p>
+            <w:pPr>
+              <w:rPr>
+                <w:rFonts w:ascii="Arial" w:hAnsi="Arial" w:cs="Arial"/>
+                <w:bCs/>
+                <w:sz w:val="18"/>
+                <w:szCs w:val="18"/>
+                <w:lang w:val="es-MX"/>
+              </w:rPr>
+            </w:pPr>
+            <w:r>
+              <w:rPr>
+                <w:rFonts w:ascii="Arial" w:hAnsi="Arial" w:cs="Arial"/>
+                <w:sz w:val="18"/>
+                <w:szCs w:val="18"/>
+                <w:lang w:val="es-MX"/>
+              </w:rPr>
+              <w:t xml:space="preserve">{{ </w:t>
+            </w:r>
+            <w:proofErr w:type="spellStart"/>
+            <w:r>
+              <w:rPr>
+                <w:rFonts w:ascii="Arial" w:hAnsi="Arial" w:cs="Arial"/>
+                <w:sz w:val="18"/>
+                <w:szCs w:val="18"/>
+                <w:lang w:val="es-MX"/>
+              </w:rPr>
+              <w:t>ajuste_puesto_liderazgo.puesto</w:t>
+            </w:r>
+            <w:proofErr w:type="spellEnd"/>
+            <w:r>
+              <w:rPr>
+                <w:rFonts w:ascii="Arial" w:hAnsi="Arial" w:cs="Arial"/>
+                <w:sz w:val="18"/>
+                <w:szCs w:val="18"/>
+                <w:lang w:val="es-MX"/>
+              </w:rPr>
+              <w:t xml:space="preserve"> }}</w:t>
+            </w:r>
+          </w:p>
+        </w:tc>
+        <w:tc>
+          <w:tcPr>
+            <w:tcW w:w="2472" w:type="dxa"/>
+          </w:tcPr>
+          <w:p>
+            <w:pPr>
+              <w:rPr>
+                <w:rFonts w:ascii="Arial" w:hAnsi="Arial" w:cs="Arial"/>
+                <w:b/>
+                <w:sz w:val="18"/>
+                <w:szCs w:val="18"/>
+                <w:lang w:val="es-MX"/>
+              </w:rPr>
+            </w:pPr>
+            <w:r>
+              <w:rPr>
+                <w:rFonts w:ascii="Arial" w:hAnsi="Arial" w:cs="Arial"/>
+                <w:b/>
+                <w:sz w:val="18"/>
+                <w:szCs w:val="18"/>
+                <w:lang w:val="es-MX"/>
+              </w:rPr>
+              <w:t>Desde:</w:t>
+            </w:r>
+          </w:p>
+          <w:p>
+            <w:pPr>
+              <w:rPr>
+                <w:rFonts w:ascii="Arial" w:hAnsi="Arial" w:cs="Arial"/>
+                <w:bCs/>
+                <w:sz w:val="18"/>
+                <w:szCs w:val="18"/>
+                <w:lang w:val="es-MX"/>
+              </w:rPr>
+            </w:pPr>
+            <w:r>
+              <w:rPr>
+                <w:rFonts w:ascii="Arial" w:hAnsi="Arial" w:cs="Arial"/>
+                <w:sz w:val="18"/>
+                <w:szCs w:val="18"/>
+                <w:lang w:val="es-MX"/>
+              </w:rPr>
+              <w:t xml:space="preserve">{{ </w:t>
+            </w:r>
+            <w:proofErr w:type="spellStart"/>
+            <w:r>
+              <w:rPr>
+                <w:rFonts w:ascii="Arial" w:hAnsi="Arial" w:cs="Arial"/>
+                <w:sz w:val="18"/>
+                <w:szCs w:val="18"/>
+                <w:lang w:val="es-MX"/>
+              </w:rPr>
+              <w:t>ajuste_puesto_liderazgo.</w:t>
+            </w:r>
+            <w:r>
+              <w:rPr>
+                <w:rFonts w:ascii="Arial" w:hAnsi="Arial" w:cs="Arial"/>
+                <w:sz w:val="18"/>
+                <w:szCs w:val="18"/>
+                <w:lang w:val="es-MX"/>
+              </w:rPr>
+              <w:t>fecha_inicio</w:t>
+            </w:r>
+            <w:proofErr w:type="spellEnd"/>
+            <w:r>
+              <w:rPr>
+                <w:rFonts w:ascii="Arial" w:hAnsi="Arial" w:cs="Arial"/>
+                <w:sz w:val="18"/>
+                <w:szCs w:val="18"/>
+                <w:lang w:val="es-MX"/>
+              </w:rPr>
+              <w:t xml:space="preserve"> }}</w:t>
+            </w:r>
+          </w:p>
+        </w:tc>
+        <w:tc>
+          <w:tcPr>
+            <w:tcW w:w="2475" w:type="dxa"/>
+          </w:tcPr>
+          <w:p>
+            <w:pPr>
+              <w:pStyle w:val="Heading2"/>
+              <w:rPr>
+                <w:bCs w:val="0"/>
+                <w:szCs w:val="18"/>
+                <w:lang w:val="es-MX"/>
+              </w:rPr>
+            </w:pPr>
+            <w:r>
+              <w:rPr>
+                <w:bCs w:val="0"/>
+                <w:szCs w:val="18"/>
+                <w:lang w:val="es-MX"/>
+              </w:rPr>
+              <w:t xml:space="preserve">Hasta: </w:t>
+            </w:r>
+          </w:p>
+          <w:p>
+            <w:pPr>
+              <w:rPr>
+                <w:rFonts w:ascii="Arial" w:hAnsi="Arial" w:cs="Arial"/>
+                <w:sz w:val="18"/>
+                <w:szCs w:val="18"/>
+                <w:lang w:val="es-MX"/>
+              </w:rPr>
+            </w:pPr>
+            <w:r>
+              <w:rPr>
+                <w:rFonts w:ascii="Arial" w:hAnsi="Arial" w:cs="Arial"/>
+                <w:sz w:val="18"/>
+                <w:szCs w:val="18"/>
+                <w:lang w:val="es-MX"/>
+              </w:rPr>
+              <w:t xml:space="preserve">{{ </w:t>
+            </w:r>
+            <w:proofErr w:type="spellStart"/>
+            <w:r>
+              <w:rPr>
+                <w:rFonts w:ascii="Arial" w:hAnsi="Arial" w:cs="Arial"/>
+                <w:sz w:val="18"/>
+                <w:szCs w:val="18"/>
+                <w:lang w:val="es-MX"/>
+              </w:rPr>
+              <w:t>ajuste_puesto_liderazgo.</w:t>
+            </w:r>
+            <w:r>
+              <w:rPr>
+                <w:rFonts w:ascii="Arial" w:hAnsi="Arial" w:cs="Arial"/>
+                <w:sz w:val="18"/>
+                <w:szCs w:val="18"/>
+                <w:lang w:val="es-MX"/>
+              </w:rPr>
+              <w:t>fecha_fin</w:t>
             </w:r>
             <w:proofErr w:type="spellEnd"/>
             <w:r>
@@ -1540,63 +1230,22 @@
                 <w:sz w:val="18"/>
                 <w:szCs w:val="20"/>
               </w:rPr>
-              <w:t>ajuste_puesto_</w:t>
-            </w:r>
-            <w:proofErr w:type="gramStart"/>
+              <w:t>ajuste_puesto_liderazgo.actividades</w:t>
+            </w:r>
+            <w:proofErr w:type="spellEnd"/>
             <w:r>
               <w:rPr>
                 <w:sz w:val="18"/>
                 <w:szCs w:val="20"/>
               </w:rPr>
-              <w:t>liderazgo.actividades</w:t>
-            </w:r>
-            <w:proofErr w:type="spellEnd"/>
-            <w:proofErr w:type="gramEnd"/>
+              <w:t xml:space="preserve"> %}</w:t>
+            </w:r>
             <w:r>
               <w:rPr>
                 <w:sz w:val="18"/>
                 <w:szCs w:val="20"/>
               </w:rPr>
-              <w:t xml:space="preserve"> </w:t>
-            </w:r>
-            <w:proofErr w:type="gramStart"/>
-            <w:r>
-              <w:rPr>
-                <w:sz w:val="18"/>
-                <w:szCs w:val="20"/>
-              </w:rPr>
-              <w:t>%}</w:t>
-            </w:r>
-            <w:r>
-              <w:rPr>
-                <w:sz w:val="18"/>
-                <w:szCs w:val="20"/>
-              </w:rPr>
-              <w:t>•</w:t>
-            </w:r>
-            <w:proofErr w:type="gramEnd"/>
-            <w:r>
-              <w:rPr>
-                <w:sz w:val="18"/>
-                <w:szCs w:val="20"/>
-              </w:rPr>
-              <w:t xml:space="preserve"> </w:t>
-            </w:r>
-            <w:proofErr w:type="gramStart"/>
-            <w:r>
-              <w:rPr>
-                <w:sz w:val="18"/>
-                <w:szCs w:val="20"/>
-              </w:rPr>
-              <w:t>{{ act</w:t>
-            </w:r>
-            <w:proofErr w:type="gramEnd"/>
-            <w:r>
-              <w:rPr>
-                <w:sz w:val="18"/>
-                <w:szCs w:val="20"/>
-              </w:rPr>
-              <w:t xml:space="preserve"> }}</w:t>
+              <w:t>• {{ act }}</w:t>
             </w:r>
           </w:p>
           <w:p>
@@ -1685,7 +1334,7 @@
           <w:sz w:val="18"/>
           <w:szCs w:val="18"/>
           <w:u w:val="single"/>
-          <w:lang w:val="en-US"/>
+          <w:lang w:val="es-MX"/>
         </w:rPr>
       </w:pPr>
       <w:r>
@@ -1694,9 +1343,9 @@
           <w:bCs/>
           <w:sz w:val="18"/>
           <w:szCs w:val="18"/>
-          <w:lang w:val="en-US"/>
-        </w:rPr>
-        <w:t xml:space="preserve">{% if </w:t>
+          <w:lang w:val="es-MX"/>
+        </w:rPr>
+        <w:t xml:space="preserve">{% </w:t>
       </w:r>
       <w:proofErr w:type="spellStart"/>
       <w:r>
@@ -1705,20 +1354,9 @@
           <w:bCs/>
           <w:sz w:val="18"/>
           <w:szCs w:val="18"/>
-          <w:lang w:val="en-US"/>
-        </w:rPr>
-        <w:t>resumen_laboral_text|</w:t>
-      </w:r>
-      <w:proofErr w:type="gramStart"/>
-      <w:r>
-        <w:rPr>
-          <w:rFonts w:ascii="Arial" w:hAnsi="Arial" w:cs="Arial"/>
-          <w:bCs/>
-          <w:sz w:val="18"/>
-          <w:szCs w:val="18"/>
-          <w:lang w:val="en-US"/>
-        </w:rPr>
-        <w:t>default</w:t>
+          <w:lang w:val="es-MX"/>
+        </w:rPr>
+        <w:t>if</w:t>
       </w:r>
       <w:proofErr w:type="spellEnd"/>
       <w:r>
@@ -1727,53 +1365,53 @@
           <w:bCs/>
           <w:sz w:val="18"/>
           <w:szCs w:val="18"/>
-          <w:lang w:val="en-US"/>
-        </w:rPr>
-        <w:t>(</w:t>
+          <w:lang w:val="es-MX"/>
+        </w:rPr>
+        <w:t xml:space="preserve"> </w:t>
       </w:r>
-      <w:proofErr w:type="gramEnd"/>
+      <w:proofErr w:type="spellStart"/>
       <w:r>
         <w:rPr>
           <w:rFonts w:ascii="Arial" w:hAnsi="Arial" w:cs="Arial"/>
           <w:bCs/>
           <w:sz w:val="18"/>
           <w:szCs w:val="18"/>
-          <w:lang w:val="en-US"/>
-        </w:rPr>
-        <w:t>'</w:t>
+          <w:lang w:val="es-MX"/>
+        </w:rPr>
+        <w:t>resumen_laboral_text|default</w:t>
       </w:r>
-      <w:proofErr w:type="gramStart"/>
+      <w:proofErr w:type="spellEnd"/>
       <w:r>
         <w:rPr>
           <w:rFonts w:ascii="Arial" w:hAnsi="Arial" w:cs="Arial"/>
           <w:bCs/>
           <w:sz w:val="18"/>
           <w:szCs w:val="18"/>
-          <w:lang w:val="en-US"/>
-        </w:rPr>
-        <w:t>')|</w:t>
+          <w:lang w:val="es-MX"/>
+        </w:rPr>
+        <w:t>('')|</w:t>
       </w:r>
-      <w:proofErr w:type="gramEnd"/>
+      <w:proofErr w:type="spellStart"/>
       <w:r>
         <w:rPr>
           <w:rFonts w:ascii="Arial" w:hAnsi="Arial" w:cs="Arial"/>
           <w:bCs/>
           <w:sz w:val="18"/>
           <w:szCs w:val="18"/>
-          <w:lang w:val="en-US"/>
-        </w:rPr>
-        <w:t xml:space="preserve">trim </w:t>
+          <w:lang w:val="es-MX"/>
+        </w:rPr>
+        <w:t>trim</w:t>
       </w:r>
-      <w:proofErr w:type="gramStart"/>
+      <w:proofErr w:type="spellEnd"/>
       <w:r>
         <w:rPr>
           <w:rFonts w:ascii="Arial" w:hAnsi="Arial" w:cs="Arial"/>
           <w:bCs/>
           <w:sz w:val="18"/>
           <w:szCs w:val="18"/>
-          <w:lang w:val="en-US"/>
-        </w:rPr>
-        <w:t>%}</w:t>
+          <w:lang w:val="es-MX"/>
+        </w:rPr>
+        <w:t xml:space="preserve"> %}</w:t>
       </w:r>
       <w:r>
         <w:rPr>
@@ -1782,21 +1420,9 @@
           <w:sz w:val="18"/>
           <w:szCs w:val="18"/>
           <w:u w:val="single"/>
-          <w:lang w:val="en-US"/>
-        </w:rPr>
-        <w:t>HISTORIAL</w:t>
-      </w:r>
-      <w:proofErr w:type="gramEnd"/>
-      <w:r>
-        <w:rPr>
-          <w:rFonts w:ascii="Arial" w:hAnsi="Arial" w:cs="Arial"/>
-          <w:b/>
-          <w:sz w:val="18"/>
-          <w:szCs w:val="18"/>
-          <w:u w:val="single"/>
-          <w:lang w:val="en-US"/>
-        </w:rPr>
-        <w:t xml:space="preserve"> PROFESIONAL ADICIONAL</w:t>
+          <w:lang w:val="es-MX"/>
+        </w:rPr>
+        <w:t>HISTORIAL PROFESIONAL ADICIONAL</w:t>
       </w:r>
     </w:p>
     <w:p>
@@ -1806,7 +1432,7 @@
           <w:bCs/>
           <w:sz w:val="18"/>
           <w:szCs w:val="18"/>
-          <w:lang w:val="en-US"/>
+          <w:lang w:val="es-MX"/>
         </w:rPr>
       </w:pPr>
     </w:p>
@@ -1820,7 +1446,6 @@
           <w:lang w:val="es-MX"/>
         </w:rPr>
       </w:pPr>
-      <w:proofErr w:type="gramStart"/>
       <w:r>
         <w:rPr>
           <w:rFonts w:ascii="Arial" w:hAnsi="Arial" w:cs="Arial"/>
@@ -1840,29 +1465,7 @@
           <w:szCs w:val="18"/>
           <w:lang w:val="es-MX"/>
         </w:rPr>
-        <w:t>periodo</w:t>
-      </w:r>
-      <w:proofErr w:type="gramEnd"/>
-      <w:r>
-        <w:rPr>
-          <w:rFonts w:ascii="Arial" w:hAnsi="Arial" w:cs="Arial"/>
-          <w:bCs/>
-          <w:sz w:val="18"/>
-          <w:szCs w:val="18"/>
-          <w:lang w:val="es-MX"/>
-        </w:rPr>
-        <w:t>_resumen_</w:t>
-      </w:r>
-      <w:proofErr w:type="gramStart"/>
-      <w:r>
-        <w:rPr>
-          <w:rFonts w:ascii="Arial" w:hAnsi="Arial" w:cs="Arial"/>
-          <w:bCs/>
-          <w:sz w:val="18"/>
-          <w:szCs w:val="18"/>
-          <w:lang w:val="es-MX"/>
-        </w:rPr>
-        <w:t>laboral</w:t>
+        <w:t>periodo_resumen_laboral</w:t>
       </w:r>
       <w:proofErr w:type="spellEnd"/>
       <w:r>
@@ -1873,18 +1476,7 @@
           <w:szCs w:val="18"/>
           <w:lang w:val="es-MX"/>
         </w:rPr>
-        <w:t xml:space="preserve"> }</w:t>
-      </w:r>
-      <w:proofErr w:type="gramEnd"/>
-      <w:r>
-        <w:rPr>
-          <w:rFonts w:ascii="Arial" w:hAnsi="Arial" w:cs="Arial"/>
-          <w:bCs/>
-          <w:sz w:val="18"/>
-          <w:szCs w:val="18"/>
-          <w:lang w:val="es-MX"/>
-        </w:rPr>
-        <w:t>}</w:t>
+        <w:t xml:space="preserve"> }}</w:t>
       </w:r>
     </w:p>
     <w:p>
@@ -1909,7 +1501,6 @@
           <w:lang w:val="es-MX"/>
         </w:rPr>
       </w:pPr>
-      <w:proofErr w:type="gramStart"/>
       <w:r>
         <w:rPr>
           <w:rFonts w:ascii="Arial" w:hAnsi="Arial" w:cs="Arial"/>
@@ -1929,29 +1520,7 @@
           <w:szCs w:val="18"/>
           <w:lang w:val="es-MX"/>
         </w:rPr>
-        <w:t>resumen</w:t>
-      </w:r>
-      <w:proofErr w:type="gramEnd"/>
-      <w:r>
-        <w:rPr>
-          <w:rFonts w:ascii="Arial" w:hAnsi="Arial" w:cs="Arial"/>
-          <w:bCs/>
-          <w:sz w:val="18"/>
-          <w:szCs w:val="18"/>
-          <w:lang w:val="es-MX"/>
-        </w:rPr>
-        <w:t>_laboral_</w:t>
-      </w:r>
-      <w:proofErr w:type="gramStart"/>
-      <w:r>
-        <w:rPr>
-          <w:rFonts w:ascii="Arial" w:hAnsi="Arial" w:cs="Arial"/>
-          <w:bCs/>
-          <w:sz w:val="18"/>
-          <w:szCs w:val="18"/>
-          <w:lang w:val="es-MX"/>
-        </w:rPr>
-        <w:t>text</w:t>
+        <w:t>resumen_laboral_text</w:t>
       </w:r>
       <w:proofErr w:type="spellEnd"/>
       <w:r>
@@ -1962,18 +1531,7 @@
           <w:szCs w:val="18"/>
           <w:lang w:val="es-MX"/>
         </w:rPr>
-        <w:t xml:space="preserve"> }</w:t>
-      </w:r>
-      <w:proofErr w:type="gramEnd"/>
-      <w:r>
-        <w:rPr>
-          <w:rFonts w:ascii="Arial" w:hAnsi="Arial" w:cs="Arial"/>
-          <w:bCs/>
-          <w:sz w:val="18"/>
-          <w:szCs w:val="18"/>
-          <w:lang w:val="es-MX"/>
-        </w:rPr>
-        <w:t>}</w:t>
+        <w:t xml:space="preserve"> }}</w:t>
       </w:r>
     </w:p>
     <w:p>
@@ -1996,7 +1554,7 @@
           <w:bCs/>
           <w:sz w:val="18"/>
           <w:szCs w:val="18"/>
-          <w:lang w:val="en-US"/>
+          <w:lang w:val="es-MX"/>
         </w:rPr>
       </w:pPr>
       <w:r>
@@ -2005,27 +1563,29 @@
           <w:bCs/>
           <w:sz w:val="18"/>
           <w:szCs w:val="18"/>
-          <w:lang w:val="en-US"/>
+          <w:lang w:val="es-MX"/>
         </w:rPr>
         <w:t xml:space="preserve">{% </w:t>
       </w:r>
+      <w:proofErr w:type="spellStart"/>
       <w:r>
         <w:rPr>
           <w:rFonts w:ascii="Arial" w:hAnsi="Arial" w:cs="Arial"/>
           <w:bCs/>
           <w:sz w:val="18"/>
           <w:szCs w:val="18"/>
-          <w:lang w:val="en-US"/>
+          <w:lang w:val="es-MX"/>
         </w:rPr>
         <w:t>endif</w:t>
       </w:r>
+      <w:proofErr w:type="spellEnd"/>
       <w:r>
         <w:rPr>
           <w:rFonts w:ascii="Arial" w:hAnsi="Arial" w:cs="Arial"/>
           <w:bCs/>
           <w:sz w:val="18"/>
           <w:szCs w:val="18"/>
-          <w:lang w:val="en-US"/>
+          <w:lang w:val="es-MX"/>
         </w:rPr>
         <w:t xml:space="preserve"> %}</w:t>
       </w:r>
@@ -2037,7 +1597,7 @@
           <w:b/>
           <w:sz w:val="18"/>
           <w:szCs w:val="18"/>
-          <w:lang w:val="en-US"/>
+          <w:lang w:val="es-MX"/>
         </w:rPr>
       </w:pPr>
       <w:r>
@@ -2047,7 +1607,7 @@
           <w:sz w:val="18"/>
           <w:szCs w:val="18"/>
           <w:u w:val="single"/>
-          <w:lang w:val="en-US"/>
+          <w:lang w:val="es-MX"/>
         </w:rPr>
         <w:br w:type="page"/>
       </w:r>
@@ -2057,7 +1617,7 @@
           <w:b/>
           <w:sz w:val="18"/>
           <w:szCs w:val="18"/>
-          <w:lang w:val="en-US"/>
+          <w:lang w:val="es-MX"/>
         </w:rPr>
         <w:lastRenderedPageBreak/>
         <w:t xml:space="preserve"> </w:t>
@@ -2083,7 +1643,18 @@
           <w:u w:val="single"/>
           <w:lang w:val="es-MX"/>
         </w:rPr>
-        <w:t>NIVEL DE ESTUDIOS:</w:t>
+        <w:t>FORMACIÓN ACADÉMICA</w:t>
+      </w:r>
+      <w:r>
+        <w:rPr>
+          <w:rFonts w:ascii="Arial" w:hAnsi="Arial" w:cs="Arial"/>
+          <w:b/>
+          <w:sz w:val="18"/>
+          <w:szCs w:val="18"/>
+          <w:u w:val="single"/>
+          <w:lang w:val="es-MX"/>
+        </w:rPr>
+        <w:t>:</w:t>
       </w:r>
     </w:p>
     <w:p>
@@ -2126,12 +1697,12 @@
             <w:pPr>
               <w:rPr>
                 <w:rFonts w:ascii="Arial" w:hAnsi="Arial" w:cs="Arial"/>
+                <w:bCs/>
                 <w:sz w:val="18"/>
                 <w:szCs w:val="18"/>
                 <w:lang w:val="es-MX"/>
               </w:rPr>
             </w:pPr>
-            <w:proofErr w:type="gramStart"/>
             <w:r>
               <w:rPr>
                 <w:rFonts w:ascii="Arial" w:hAnsi="Arial" w:cs="Arial"/>
@@ -2151,9 +1722,9 @@
                 <w:szCs w:val="18"/>
                 <w:lang w:val="es-MX"/>
               </w:rPr>
-              <w:t>estudios</w:t>
-            </w:r>
-            <w:proofErr w:type="gramEnd"/>
+              <w:t>estudios_titulo</w:t>
+            </w:r>
+            <w:proofErr w:type="spellEnd"/>
             <w:r>
               <w:rPr>
                 <w:rFonts w:ascii="Arial" w:hAnsi="Arial" w:cs="Arial"/>
@@ -2162,7 +1733,38 @@
                 <w:szCs w:val="18"/>
                 <w:lang w:val="es-MX"/>
               </w:rPr>
-              <w:t>_titulo</w:t>
+              <w:t xml:space="preserve"> }}</w:t>
+            </w:r>
+            <w:r>
+              <w:rPr>
+                <w:rFonts w:ascii="Arial" w:hAnsi="Arial" w:cs="Arial"/>
+                <w:bCs/>
+                <w:sz w:val="18"/>
+                <w:szCs w:val="18"/>
+                <w:lang w:val="es-MX"/>
+              </w:rPr>
+              <w:t xml:space="preserve"> - </w:t>
+            </w:r>
+            <w:r>
+              <w:rPr>
+                <w:rFonts w:ascii="Arial" w:hAnsi="Arial" w:cs="Arial"/>
+                <w:bCs/>
+                <w:sz w:val="18"/>
+                <w:szCs w:val="18"/>
+                <w:lang w:val="es-MX"/>
+              </w:rPr>
+              <w:t xml:space="preserve">{{ </w:t>
+            </w:r>
+            <w:proofErr w:type="spellStart"/>
+            <w:r>
+              <w:rPr>
+                <w:rFonts w:ascii="Arial" w:hAnsi="Arial" w:cs="Arial"/>
+                <w:bCs/>
+                <w:sz w:val="18"/>
+                <w:szCs w:val="18"/>
+                <w:lang w:val="es-MX"/>
+              </w:rPr>
+              <w:t>estudios_periodo</w:t>
             </w:r>
             <w:proofErr w:type="spellEnd"/>
             <w:r>
@@ -2175,6 +1777,16 @@
               </w:rPr>
               <w:t xml:space="preserve"> }}</w:t>
             </w:r>
+          </w:p>
+          <w:p>
+            <w:pPr>
+              <w:rPr>
+                <w:rFonts w:ascii="Arial" w:hAnsi="Arial" w:cs="Arial"/>
+                <w:sz w:val="18"/>
+                <w:szCs w:val="18"/>
+                <w:lang w:val="es-MX"/>
+              </w:rPr>
+            </w:pPr>
           </w:p>
         </w:tc>
         <w:tc>
@@ -2190,7 +1802,6 @@
                 <w:lang w:val="es-MX"/>
               </w:rPr>
             </w:pPr>
-            <w:proofErr w:type="gramStart"/>
             <w:r>
               <w:rPr>
                 <w:rFonts w:ascii="Arial" w:hAnsi="Arial" w:cs="Arial"/>
@@ -2210,9 +1821,9 @@
                 <w:szCs w:val="18"/>
                 <w:lang w:val="es-MX"/>
               </w:rPr>
-              <w:t>estudios</w:t>
-            </w:r>
-            <w:proofErr w:type="gramEnd"/>
+              <w:t>estudios_lugar</w:t>
+            </w:r>
+            <w:proofErr w:type="spellEnd"/>
             <w:r>
               <w:rPr>
                 <w:rFonts w:ascii="Arial" w:hAnsi="Arial" w:cs="Arial"/>
@@ -2221,40 +1832,7 @@
                 <w:szCs w:val="18"/>
                 <w:lang w:val="es-MX"/>
               </w:rPr>
-              <w:t>_</w:t>
-            </w:r>
-            <w:proofErr w:type="gramStart"/>
-            <w:r>
-              <w:rPr>
-                <w:rFonts w:ascii="Arial" w:hAnsi="Arial" w:cs="Arial"/>
-                <w:bCs/>
-                <w:sz w:val="18"/>
-                <w:szCs w:val="18"/>
-                <w:lang w:val="es-MX"/>
-              </w:rPr>
-              <w:t>lugar</w:t>
-            </w:r>
-            <w:proofErr w:type="spellEnd"/>
-            <w:r>
-              <w:rPr>
-                <w:rFonts w:ascii="Arial" w:hAnsi="Arial" w:cs="Arial"/>
-                <w:bCs/>
-                <w:sz w:val="18"/>
-                <w:szCs w:val="18"/>
-                <w:lang w:val="es-MX"/>
-              </w:rPr>
-              <w:t xml:space="preserve"> }</w:t>
-            </w:r>
-            <w:proofErr w:type="gramEnd"/>
-            <w:r>
-              <w:rPr>
-                <w:rFonts w:ascii="Arial" w:hAnsi="Arial" w:cs="Arial"/>
-                <w:bCs/>
-                <w:sz w:val="18"/>
-                <w:szCs w:val="18"/>
-                <w:lang w:val="es-MX"/>
-              </w:rPr>
-              <w:t>}</w:t>
+              <w:t xml:space="preserve"> }}</w:t>
             </w:r>
           </w:p>
           <w:p>
@@ -2283,7 +1861,6 @@
                 <w:lang w:val="es-MX"/>
               </w:rPr>
             </w:pPr>
-            <w:proofErr w:type="gramStart"/>
             <w:r>
               <w:rPr>
                 <w:rFonts w:ascii="Arial" w:hAnsi="Arial" w:cs="Arial"/>
@@ -2292,6 +1869,27 @@
                 <w:szCs w:val="18"/>
                 <w:lang w:val="es-MX"/>
               </w:rPr>
+              <w:t>Cédula Profesional</w:t>
+            </w:r>
+          </w:p>
+          <w:p>
+            <w:pPr>
+              <w:rPr>
+                <w:rFonts w:ascii="Arial" w:hAnsi="Arial" w:cs="Arial"/>
+                <w:bCs/>
+                <w:sz w:val="18"/>
+                <w:szCs w:val="18"/>
+                <w:lang w:val="es-MX"/>
+              </w:rPr>
+            </w:pPr>
+            <w:r>
+              <w:rPr>
+                <w:rFonts w:ascii="Arial" w:hAnsi="Arial" w:cs="Arial"/>
+                <w:bCs/>
+                <w:sz w:val="18"/>
+                <w:szCs w:val="18"/>
+                <w:lang w:val="es-MX"/>
+              </w:rPr>
               <w:t xml:space="preserve">{{ </w:t>
             </w:r>
             <w:proofErr w:type="spellStart"/>
@@ -2303,9 +1901,9 @@
                 <w:szCs w:val="18"/>
                 <w:lang w:val="es-MX"/>
               </w:rPr>
-              <w:t>estudios</w:t>
-            </w:r>
-            <w:proofErr w:type="gramEnd"/>
+              <w:t>no_cedula</w:t>
+            </w:r>
+            <w:proofErr w:type="spellEnd"/>
             <w:r>
               <w:rPr>
                 <w:rFonts w:ascii="Arial" w:hAnsi="Arial" w:cs="Arial"/>
@@ -2314,7 +1912,39 @@
                 <w:szCs w:val="18"/>
                 <w:lang w:val="es-MX"/>
               </w:rPr>
-              <w:t>_periodo</w:t>
+              <w:t xml:space="preserve"> }}</w:t>
+            </w:r>
+          </w:p>
+          <w:p>
+            <w:pPr>
+              <w:rPr>
+                <w:rFonts w:ascii="Arial" w:hAnsi="Arial" w:cs="Arial"/>
+                <w:bCs/>
+                <w:sz w:val="18"/>
+                <w:szCs w:val="18"/>
+                <w:lang w:val="es-MX"/>
+              </w:rPr>
+            </w:pPr>
+            <w:r>
+              <w:rPr>
+                <w:rFonts w:ascii="Arial" w:hAnsi="Arial" w:cs="Arial"/>
+                <w:bCs/>
+                <w:sz w:val="18"/>
+                <w:szCs w:val="18"/>
+                <w:lang w:val="es-MX"/>
+              </w:rPr>
+              <w:t xml:space="preserve">{{ </w:t>
+            </w:r>
+            <w:proofErr w:type="spellStart"/>
+            <w:r>
+              <w:rPr>
+                <w:rFonts w:ascii="Arial" w:hAnsi="Arial" w:cs="Arial"/>
+                <w:bCs/>
+                <w:sz w:val="18"/>
+                <w:szCs w:val="18"/>
+                <w:lang w:val="es-MX"/>
+              </w:rPr>
+              <w:t>fecha_cedula</w:t>
             </w:r>
             <w:proofErr w:type="spellEnd"/>
             <w:r>
@@ -2403,18 +2033,7 @@
           <w:szCs w:val="18"/>
           <w:lang w:val="es-MX"/>
         </w:rPr>
-        <w:t xml:space="preserve"> </w:t>
-      </w:r>
-      <w:proofErr w:type="gramStart"/>
-      <w:r>
-        <w:rPr>
-          <w:rFonts w:ascii="Arial" w:hAnsi="Arial" w:cs="Arial"/>
-          <w:bCs/>
-          <w:sz w:val="18"/>
-          <w:szCs w:val="18"/>
-          <w:lang w:val="es-MX"/>
-        </w:rPr>
-        <w:t>%}</w:t>
+        <w:t xml:space="preserve"> %}</w:t>
       </w:r>
       <w:r>
         <w:rPr>
@@ -2428,7 +2047,6 @@
         </w:rPr>
         <w:t>CERTIFICACIONES</w:t>
       </w:r>
-      <w:proofErr w:type="gramEnd"/>
     </w:p>
     <w:p>
       <w:pPr>
@@ -2555,9 +2173,9 @@
                 <w:szCs w:val="18"/>
                 <w:lang w:val="es-MX" w:eastAsia="es-ES"/>
               </w:rPr>
-              <w:t xml:space="preserve">- </w:t>
-            </w:r>
-            <w:proofErr w:type="gramStart"/>
+              <w:t xml:space="preserve">- {{ </w:t>
+            </w:r>
+            <w:proofErr w:type="spellStart"/>
             <w:r>
               <w:rPr>
                 <w:rFonts w:ascii="Arial" w:eastAsia="Times New Roman" w:hAnsi="Arial" w:cs="Arial"/>
@@ -2566,29 +2184,7 @@
                 <w:szCs w:val="18"/>
                 <w:lang w:val="es-MX" w:eastAsia="es-ES"/>
               </w:rPr>
-              <w:t xml:space="preserve">{{ </w:t>
-            </w:r>
-            <w:proofErr w:type="spellStart"/>
-            <w:r>
-              <w:rPr>
-                <w:rFonts w:ascii="Arial" w:eastAsia="Times New Roman" w:hAnsi="Arial" w:cs="Arial"/>
-                <w:bCs/>
-                <w:sz w:val="18"/>
-                <w:szCs w:val="18"/>
-                <w:lang w:val="es-MX" w:eastAsia="es-ES"/>
-              </w:rPr>
-              <w:t>cert</w:t>
-            </w:r>
-            <w:proofErr w:type="gramEnd"/>
-            <w:r>
-              <w:rPr>
-                <w:rFonts w:ascii="Arial" w:eastAsia="Times New Roman" w:hAnsi="Arial" w:cs="Arial"/>
-                <w:bCs/>
-                <w:sz w:val="18"/>
-                <w:szCs w:val="18"/>
-                <w:lang w:val="es-MX" w:eastAsia="es-ES"/>
-              </w:rPr>
-              <w:t>.nombre</w:t>
+              <w:t>cert.nombre</w:t>
             </w:r>
             <w:proofErr w:type="spellEnd"/>
             <w:r>
@@ -2616,7 +2212,6 @@
                 <w:lang w:val="es-MX"/>
               </w:rPr>
             </w:pPr>
-            <w:proofErr w:type="gramStart"/>
             <w:r>
               <w:rPr>
                 <w:rFonts w:ascii="Arial" w:hAnsi="Arial" w:cs="Arial"/>
@@ -2634,17 +2229,7 @@
                 <w:szCs w:val="18"/>
                 <w:lang w:val="es-MX"/>
               </w:rPr>
-              <w:t>cert</w:t>
-            </w:r>
-            <w:proofErr w:type="gramEnd"/>
-            <w:r>
-              <w:rPr>
-                <w:rFonts w:ascii="Arial" w:hAnsi="Arial" w:cs="Arial"/>
-                <w:sz w:val="18"/>
-                <w:szCs w:val="18"/>
-                <w:lang w:val="es-MX"/>
-              </w:rPr>
-              <w:t>.anio</w:t>
+              <w:t>cert.anio</w:t>
             </w:r>
             <w:proofErr w:type="spellEnd"/>
             <w:r>
@@ -2799,18 +2384,7 @@
           <w:szCs w:val="18"/>
           <w:lang w:val="en-US"/>
         </w:rPr>
-        <w:t xml:space="preserve"> </w:t>
-      </w:r>
-      <w:proofErr w:type="gramStart"/>
-      <w:r>
-        <w:rPr>
-          <w:rFonts w:ascii="Arial" w:hAnsi="Arial" w:cs="Arial"/>
-          <w:bCs/>
-          <w:sz w:val="18"/>
-          <w:szCs w:val="18"/>
-          <w:lang w:val="en-US"/>
-        </w:rPr>
-        <w:t>%}</w:t>
+        <w:t xml:space="preserve"> %}</w:t>
       </w:r>
       <w:r>
         <w:rPr>
@@ -2820,18 +2394,7 @@
           <w:szCs w:val="18"/>
           <w:lang w:val="en-US"/>
         </w:rPr>
-        <w:t>{</w:t>
-      </w:r>
-      <w:proofErr w:type="gramEnd"/>
-      <w:r>
-        <w:rPr>
-          <w:rFonts w:ascii="Arial" w:hAnsi="Arial" w:cs="Arial"/>
-          <w:bCs/>
-          <w:sz w:val="18"/>
-          <w:szCs w:val="18"/>
-          <w:lang w:val="en-US"/>
-        </w:rPr>
-        <w:t xml:space="preserve">% if </w:t>
+        <w:t xml:space="preserve">{% if </w:t>
       </w:r>
       <w:proofErr w:type="spellStart"/>
       <w:r>
@@ -2853,18 +2416,7 @@
           <w:szCs w:val="18"/>
           <w:lang w:val="en-US"/>
         </w:rPr>
-        <w:t xml:space="preserve"> </w:t>
-      </w:r>
-      <w:proofErr w:type="gramStart"/>
-      <w:r>
-        <w:rPr>
-          <w:rFonts w:ascii="Arial" w:hAnsi="Arial" w:cs="Arial"/>
-          <w:bCs/>
-          <w:sz w:val="18"/>
-          <w:szCs w:val="18"/>
-          <w:lang w:val="en-US"/>
-        </w:rPr>
-        <w:t>%}</w:t>
+        <w:t xml:space="preserve"> %}</w:t>
       </w:r>
       <w:r>
         <w:rPr>
@@ -2876,21 +2428,8 @@
           <w:u w:val="single"/>
           <w:lang w:val="es-MX"/>
         </w:rPr>
-        <w:t>C</w:t>
+        <w:t>CURSOS</w:t>
       </w:r>
-      <w:r>
-        <w:rPr>
-          <w:rFonts w:ascii="Arial" w:hAnsi="Arial" w:cs="Arial"/>
-          <w:b/>
-          <w:bCs/>
-          <w:sz w:val="18"/>
-          <w:szCs w:val="18"/>
-          <w:u w:val="single"/>
-          <w:lang w:val="es-MX"/>
-        </w:rPr>
-        <w:t>URSOS</w:t>
-      </w:r>
-      <w:proofErr w:type="gramEnd"/>
     </w:p>
     <w:p>
       <w:pPr>
@@ -2946,27 +2485,7 @@
                 <w:szCs w:val="18"/>
                 <w:lang w:val="en-US"/>
               </w:rPr>
-              <w:t>{%tr for c</w:t>
-            </w:r>
-            <w:r>
-              <w:rPr>
-                <w:rFonts w:ascii="Arial" w:hAnsi="Arial" w:cs="Arial"/>
-                <w:bCs/>
-                <w:sz w:val="18"/>
-                <w:szCs w:val="18"/>
-                <w:lang w:val="en-US"/>
-              </w:rPr>
-              <w:t>ur</w:t>
-            </w:r>
-            <w:r>
-              <w:rPr>
-                <w:rFonts w:ascii="Arial" w:hAnsi="Arial" w:cs="Arial"/>
-                <w:bCs/>
-                <w:sz w:val="18"/>
-                <w:szCs w:val="18"/>
-                <w:lang w:val="en-US"/>
-              </w:rPr>
-              <w:t xml:space="preserve"> in </w:t>
+              <w:t xml:space="preserve">{%tr for cur in </w:t>
             </w:r>
             <w:proofErr w:type="spellStart"/>
             <w:r>
@@ -3018,9 +2537,9 @@
                 <w:szCs w:val="18"/>
                 <w:lang w:val="es-MX"/>
               </w:rPr>
-              <w:t xml:space="preserve">- </w:t>
-            </w:r>
-            <w:proofErr w:type="gramStart"/>
+              <w:t xml:space="preserve">- {{ </w:t>
+            </w:r>
+            <w:proofErr w:type="spellStart"/>
             <w:r>
               <w:rPr>
                 <w:rFonts w:ascii="Arial" w:hAnsi="Arial" w:cs="Arial"/>
@@ -3029,20 +2548,8 @@
                 <w:szCs w:val="18"/>
                 <w:lang w:val="es-MX"/>
               </w:rPr>
-              <w:t xml:space="preserve">{{ </w:t>
-            </w:r>
-            <w:proofErr w:type="spellStart"/>
-            <w:r>
-              <w:rPr>
-                <w:rFonts w:ascii="Arial" w:hAnsi="Arial" w:cs="Arial"/>
-                <w:bCs/>
-                <w:sz w:val="18"/>
-                <w:szCs w:val="18"/>
-                <w:lang w:val="es-MX"/>
-              </w:rPr>
               <w:t>cur</w:t>
             </w:r>
-            <w:proofErr w:type="gramEnd"/>
             <w:r>
               <w:rPr>
                 <w:rFonts w:ascii="Arial" w:hAnsi="Arial" w:cs="Arial"/>
@@ -3178,6 +2685,328 @@
         </w:rPr>
         <w:t xml:space="preserve"> %}</w:t>
       </w:r>
+    </w:p>
+    <w:p>
+      <w:pPr>
+        <w:jc w:val="both"/>
+        <w:rPr>
+          <w:rFonts w:ascii="Arial" w:hAnsi="Arial" w:cs="Arial"/>
+          <w:bCs/>
+          <w:sz w:val="18"/>
+          <w:szCs w:val="18"/>
+          <w:lang w:val="en-US"/>
+        </w:rPr>
+      </w:pPr>
+    </w:p>
+    <w:p>
+      <w:pPr>
+        <w:jc w:val="both"/>
+        <w:rPr>
+          <w:rFonts w:ascii="Arial" w:hAnsi="Arial" w:cs="Arial"/>
+          <w:bCs/>
+          <w:sz w:val="18"/>
+          <w:szCs w:val="18"/>
+          <w:lang w:val="en-US"/>
+        </w:rPr>
+      </w:pPr>
+    </w:p>
+    <w:p>
+      <w:pPr>
+        <w:jc w:val="both"/>
+        <w:rPr>
+          <w:rFonts w:ascii="Arial" w:hAnsi="Arial" w:cs="Arial"/>
+          <w:bCs/>
+          <w:sz w:val="18"/>
+          <w:szCs w:val="18"/>
+          <w:lang w:val="en-US"/>
+        </w:rPr>
+      </w:pPr>
+    </w:p>
+    <w:p>
+      <w:pPr>
+        <w:jc w:val="both"/>
+        <w:rPr>
+          <w:rFonts w:ascii="Arial" w:hAnsi="Arial" w:cs="Arial"/>
+          <w:bCs/>
+          <w:sz w:val="18"/>
+          <w:szCs w:val="18"/>
+          <w:lang w:val="es-MX"/>
+        </w:rPr>
+      </w:pPr>
+    </w:p>
+    <w:p>
+      <w:pPr>
+        <w:jc w:val="both"/>
+        <w:rPr>
+          <w:rFonts w:ascii="Arial" w:hAnsi="Arial" w:cs="Arial"/>
+          <w:bCs/>
+          <w:sz w:val="18"/>
+          <w:szCs w:val="18"/>
+          <w:lang w:val="es-MX"/>
+        </w:rPr>
+      </w:pPr>
+    </w:p>
+    <w:p>
+      <w:pPr>
+        <w:jc w:val="both"/>
+        <w:rPr>
+          <w:rFonts w:ascii="Arial" w:hAnsi="Arial" w:cs="Arial"/>
+          <w:bCs/>
+          <w:sz w:val="18"/>
+          <w:szCs w:val="18"/>
+          <w:lang w:val="es-MX"/>
+        </w:rPr>
+      </w:pPr>
+    </w:p>
+    <w:tbl>
+      <w:tblPr>
+        <w:tblW w:w="0" w:type="auto"/>
+        <w:tblLook w:val="04A0" w:firstRow="1" w:lastRow="0" w:firstColumn="1" w:lastColumn="0" w:noHBand="0" w:noVBand="1"/>
+      </w:tblPr>
+      <w:tblGrid>
+        <w:gridCol w:w="4889"/>
+        <w:gridCol w:w="4889"/>
+      </w:tblGrid>
+      <w:tr>
+        <w:tc>
+          <w:tcPr>
+            <w:tcW w:w="4889" w:type="dxa"/>
+            <w:vAlign w:val="center"/>
+          </w:tcPr>
+          <w:p>
+            <w:pPr>
+              <w:ind w:left="708" w:hanging="708"/>
+              <w:jc w:val="center"/>
+              <w:rPr>
+                <w:rFonts w:ascii="Arial" w:hAnsi="Arial" w:cs="Arial"/>
+                <w:bCs/>
+                <w:sz w:val="18"/>
+                <w:szCs w:val="18"/>
+                <w:lang w:val="en-US"/>
+              </w:rPr>
+            </w:pPr>
+            <w:r>
+              <w:rPr>
+                <w:rFonts w:ascii="Arial" w:hAnsi="Arial" w:cs="Arial"/>
+                <w:bCs/>
+                <w:sz w:val="18"/>
+                <w:szCs w:val="18"/>
+                <w:lang w:val="en-US"/>
+              </w:rPr>
+              <w:t>______________________________________</w:t>
+            </w:r>
+          </w:p>
+          <w:p>
+            <w:pPr>
+              <w:pStyle w:val="Title"/>
+              <w:ind w:left="708" w:hanging="708"/>
+              <w:rPr>
+                <w:b/>
+                <w:bCs/>
+                <w:sz w:val="18"/>
+                <w:szCs w:val="18"/>
+                <w:lang w:val="es-MX"/>
+              </w:rPr>
+            </w:pPr>
+            <w:r>
+              <w:rPr>
+                <w:b/>
+                <w:bCs/>
+                <w:sz w:val="18"/>
+                <w:szCs w:val="18"/>
+                <w:lang w:val="es-MX"/>
+              </w:rPr>
+              <w:t>{{ nombre }}</w:t>
+            </w:r>
+          </w:p>
+          <w:p>
+            <w:pPr>
+              <w:pStyle w:val="Title"/>
+              <w:rPr>
+                <w:b/>
+                <w:bCs/>
+                <w:sz w:val="18"/>
+                <w:szCs w:val="18"/>
+                <w:lang w:val="es-MX"/>
+              </w:rPr>
+            </w:pPr>
+            <w:r>
+              <w:rPr>
+                <w:b/>
+                <w:bCs/>
+                <w:sz w:val="18"/>
+                <w:szCs w:val="18"/>
+                <w:lang w:val="es-MX"/>
+              </w:rPr>
+              <w:t xml:space="preserve">{{ </w:t>
+            </w:r>
+            <w:proofErr w:type="spellStart"/>
+            <w:r>
+              <w:rPr>
+                <w:b/>
+                <w:bCs/>
+                <w:sz w:val="18"/>
+                <w:szCs w:val="18"/>
+                <w:lang w:val="es-MX"/>
+              </w:rPr>
+              <w:t>rol_propuesto</w:t>
+            </w:r>
+            <w:proofErr w:type="spellEnd"/>
+            <w:r>
+              <w:rPr>
+                <w:b/>
+                <w:bCs/>
+                <w:sz w:val="18"/>
+                <w:szCs w:val="18"/>
+                <w:lang w:val="es-MX"/>
+              </w:rPr>
+              <w:t xml:space="preserve"> }}</w:t>
+            </w:r>
+          </w:p>
+          <w:p>
+            <w:pPr>
+              <w:pStyle w:val="Title"/>
+              <w:jc w:val="left"/>
+              <w:rPr>
+                <w:b/>
+                <w:bCs/>
+                <w:color w:val="0070C0"/>
+                <w:sz w:val="18"/>
+                <w:szCs w:val="18"/>
+                <w:lang w:val="es-MX"/>
+              </w:rPr>
+            </w:pPr>
+          </w:p>
+        </w:tc>
+        <w:tc>
+          <w:tcPr>
+            <w:tcW w:w="4889" w:type="dxa"/>
+            <w:vAlign w:val="center"/>
+          </w:tcPr>
+          <w:p>
+            <w:pPr>
+              <w:jc w:val="center"/>
+              <w:rPr>
+                <w:rFonts w:ascii="Arial" w:hAnsi="Arial" w:cs="Arial"/>
+                <w:bCs/>
+                <w:sz w:val="18"/>
+                <w:szCs w:val="18"/>
+                <w:lang w:val="es-MX"/>
+              </w:rPr>
+            </w:pPr>
+            <w:r>
+              <w:rPr>
+                <w:rFonts w:ascii="Arial" w:hAnsi="Arial" w:cs="Arial"/>
+                <w:bCs/>
+                <w:sz w:val="18"/>
+                <w:szCs w:val="18"/>
+                <w:lang w:val="es-MX"/>
+              </w:rPr>
+              <w:t>______________________________________</w:t>
+            </w:r>
+          </w:p>
+          <w:p>
+            <w:pPr>
+              <w:jc w:val="center"/>
+              <w:rPr>
+                <w:rFonts w:ascii="Arial" w:hAnsi="Arial" w:cs="Arial"/>
+                <w:b/>
+                <w:sz w:val="18"/>
+                <w:szCs w:val="18"/>
+                <w:lang w:val="es-MX"/>
+              </w:rPr>
+            </w:pPr>
+            <w:r>
+              <w:rPr>
+                <w:rFonts w:ascii="Arial" w:hAnsi="Arial" w:cs="Arial"/>
+                <w:b/>
+                <w:sz w:val="18"/>
+                <w:szCs w:val="18"/>
+                <w:lang w:val="es-MX"/>
+              </w:rPr>
+              <w:t>Ángel Eduardo Guerrero García</w:t>
+            </w:r>
+          </w:p>
+          <w:p>
+            <w:pPr>
+              <w:jc w:val="center"/>
+              <w:rPr>
+                <w:rFonts w:ascii="Arial" w:hAnsi="Arial" w:cs="Arial"/>
+                <w:b/>
+                <w:sz w:val="18"/>
+                <w:szCs w:val="18"/>
+                <w:lang w:val="es-MX"/>
+              </w:rPr>
+            </w:pPr>
+            <w:r>
+              <w:rPr>
+                <w:rFonts w:ascii="Arial" w:hAnsi="Arial" w:cs="Arial"/>
+                <w:b/>
+                <w:sz w:val="18"/>
+                <w:szCs w:val="18"/>
+                <w:lang w:val="es-MX"/>
+              </w:rPr>
+              <w:t>Representante legal</w:t>
+            </w:r>
+          </w:p>
+          <w:p>
+            <w:pPr>
+              <w:jc w:val="center"/>
+              <w:rPr>
+                <w:rFonts w:ascii="Arial" w:hAnsi="Arial" w:cs="Arial"/>
+                <w:b/>
+                <w:sz w:val="18"/>
+                <w:szCs w:val="18"/>
+                <w:lang w:val="es-MX"/>
+              </w:rPr>
+            </w:pPr>
+            <w:r>
+              <w:rPr>
+                <w:rFonts w:ascii="Arial" w:hAnsi="Arial" w:cs="Arial"/>
+                <w:b/>
+                <w:sz w:val="18"/>
+                <w:szCs w:val="18"/>
+                <w:lang w:val="es-MX"/>
+              </w:rPr>
+              <w:t>BFS Ingeniería Aplicada S. A. de C. V.</w:t>
+            </w:r>
+          </w:p>
+        </w:tc>
+      </w:tr>
+    </w:tbl>
+    <w:p>
+      <w:pPr>
+        <w:jc w:val="both"/>
+        <w:rPr>
+          <w:rFonts w:ascii="Arial" w:hAnsi="Arial" w:cs="Arial"/>
+          <w:bCs/>
+          <w:sz w:val="18"/>
+          <w:szCs w:val="18"/>
+          <w:lang w:val="es-MX"/>
+        </w:rPr>
+      </w:pPr>
+    </w:p>
+    <w:p>
+      <w:pPr>
+        <w:ind w:left="708" w:hanging="708"/>
+        <w:rPr>
+          <w:b/>
+          <w:bCs/>
+          <w:color w:val="0070C0"/>
+          <w:lang w:val="es-MX"/>
+        </w:rPr>
+      </w:pPr>
+    </w:p>
+    <w:p>
+      <w:pPr>
+        <w:rPr>
+          <w:rFonts w:ascii="Arial" w:hAnsi="Arial" w:cs="Arial"/>
+          <w:bCs/>
+          <w:sz w:val="18"/>
+          <w:szCs w:val="18"/>
+          <w:lang w:val="es-MX"/>
+        </w:rPr>
+      </w:pPr>
     </w:p>
     <w:sectPr>
       <w:headerReference w:type="default" r:id="rId11"/>
@@ -3213,46 +3042,6 @@
 <w:ftr xmlns:wpc="http://schemas.microsoft.com/office/word/2010/wordprocessingCanvas" xmlns:cx="http://schemas.microsoft.com/office/drawing/2014/chartex" xmlns:cx1="http://schemas.microsoft.com/office/drawing/2015/9/8/chartex" xmlns:cx2="http://schemas.microsoft.com/office/drawing/2015/10/21/chartex" xmlns:cx3="http://schemas.microsoft.com/office/drawing/2016/5/9/chartex" xmlns:cx4="http://schemas.microsoft.com/office/drawing/2016/5/10/chartex" xmlns:cx5="http://schemas.microsoft.com/office/drawing/2016/5/11/chartex" xmlns:cx6="http://schemas.microsoft.com/office/drawing/2016/5/12/chartex" xmlns:cx7="http://schemas.microsoft.com/office/drawing/2016/5/13/chartex" xmlns:cx8="http://schemas.microsoft.com/office/drawing/2016/5/14/chartex" xmlns:mc="http://schemas.openxmlformats.org/markup-compatibility/2006" xmlns:aink="http://schemas.microsoft.com/office/drawing/2016/ink" xmlns:am3d="http://schemas.microsoft.com/office/drawing/2017/model3d" xmlns:o="urn:schemas-microsoft-com:office:office" xmlns:oel="http://schemas.microsoft.com/office/2019/extlst" xmlns:r="http://schemas.openxmlformats.org/officeDocument/2006/relationships" xmlns:m="http://schemas.openxmlformats.org/officeDocument/2006/math" xmlns:v="urn:schemas-microsoft-com:vml" xmlns:wp14="http://schemas.microsoft.com/office/word/2010/wordprocessingDrawing" xmlns:wp="http://schemas.openxmlformats.org/drawingml/2006/wordprocessingDrawing" xmlns:w10="urn:schemas-microsoft-com:office:word" xmlns:w="http://schemas.openxmlformats.org/wordprocessingml/2006/main" xmlns:w14="http://schemas.microsoft.com/office/word/2010/wordml" xmlns:w15="http://schemas.microsoft.com/office/word/2012/wordml" xmlns:w16cex="http://schemas.microsoft.com/office/word/2018/wordml/cex" xmlns:w16cid="http://schemas.microsoft.com/office/word/2016/wordml/cid" xmlns:w16="http://schemas.microsoft.com/office/word/2018/wordml" xmlns:w16du="http://schemas.microsoft.com/office/word/2023/wordml/word16du" xmlns:w16sdtdh="http://schemas.microsoft.com/office/word/2020/wordml/sdtdatahash" xmlns:w16sdtfl="http://schemas.microsoft.com/office/word/2024/wordml/sdtformatlock" xmlns:w16se="http://schemas.microsoft.com/office/word/2015/wordml/symex" xmlns:wpg="http://schemas.microsoft.com/office/word/2010/wordprocessingGroup" xmlns:wpi="http://schemas.microsoft.com/office/word/2010/wordprocessingInk" xmlns:wne="http://schemas.microsoft.com/office/word/2006/wordml" xmlns:wps="http://schemas.microsoft.com/office/word/2010/wordprocessingShape" mc:Ignorable="w14 w15 w16se w16cid w16 w16cex w16sdtdh w16sdtfl w16du wp14">
   <w:p>
     <w:pPr>
-      <w:pStyle w:val="Header"/>
-      <w:pBdr>
-        <w:bottom w:val="single" w:sz="12" w:space="1" w:color="0E2841"/>
-      </w:pBdr>
-      <w:rPr>
-        <w:rFonts w:ascii="Tahoma" w:eastAsia="Calibri" w:hAnsi="Tahoma" w:cs="Tahoma"/>
-        <w:sz w:val="18"/>
-        <w:szCs w:val="18"/>
-        <w:lang w:eastAsia="en-US"/>
-      </w:rPr>
-    </w:pPr>
-    <w:r>
-      <w:rPr>
-        <w:noProof/>
-      </w:rPr>
-      <w:pict w14:anchorId="2895A54B">
-        <v:shapetype id="_x0000_t202" coordsize="21600,21600" o:spt="202" path="m,l,21600r21600,l21600,xe">
-          <v:stroke joinstyle="miter"/>
-          <v:path gradientshapeok="t" o:connecttype="rect"/>
-        </v:shapetype>
-        <v:shape id="Text Box 1" o:spid="_x0000_s1034" type="#_x0000_t202" style="position:absolute;margin-left:1.3pt;margin-top:13.6pt;width:518.75pt;height:52.8pt;z-index:3;visibility:visible;mso-width-relative:margin;mso-height-relative:margin" o:gfxdata="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" filled="f" stroked="f" strokeweight=".5pt">
-          <v:textbox style="mso-next-textbox:#Text Box 1">
-            <w:txbxContent>
-              <w:p>
-                <w:pPr>
-                  <w:rPr>
-                    <w:rFonts w:cs="Arial"/>
-                    <w:sz w:val="16"/>
-                    <w:szCs w:val="16"/>
-                  </w:rPr>
-                </w:pPr>
-              </w:p>
-            </w:txbxContent>
-          </v:textbox>
-        </v:shape>
-      </w:pict>
-    </w:r>
-  </w:p>
-  <w:p>
-    <w:pPr>
       <w:pStyle w:val="Footer"/>
       <w:tabs>
         <w:tab w:val="clear" w:pos="4320"/>
@@ -3265,6 +3054,10 @@
         <w:noProof/>
       </w:rPr>
       <w:pict w14:anchorId="0FF2E83E">
+        <v:shapetype id="_x0000_t202" coordsize="21600,21600" o:spt="202" path="m,l,21600r21600,l21600,xe">
+          <v:stroke joinstyle="miter"/>
+          <v:path gradientshapeok="t" o:connecttype="rect"/>
+        </v:shapetype>
         <v:shape id="_x0000_s1029" type="#_x0000_t202" style="position:absolute;margin-left:56.35pt;margin-top:729.7pt;width:154.5pt;height:17.3pt;z-index:2;visibility:visible;mso-height-relative:margin" o:gfxdata="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" stroked="f" strokeweight=".5pt">
           <v:textbox style="mso-next-textbox:#_x0000_s1029">
             <w:txbxContent>
@@ -3353,7 +3146,7 @@
           <v:stroke joinstyle="miter"/>
           <v:path gradientshapeok="t" o:connecttype="rect"/>
         </v:shapetype>
-        <v:shape id="Text Box 3" o:spid="_x0000_s1036" type="#_x0000_t202" style="position:absolute;margin-left:126.85pt;margin-top:-22.45pt;width:338.2pt;height:48.45pt;z-index:4;visibility:visible;mso-position-horizontal-relative:page;mso-width-relative:margin;mso-height-relative:margin" o:gfxdata="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" fillcolor="window" stroked="f" strokeweight=".5pt">
+        <v:shape id="Text Box 3" o:spid="_x0000_s1036" type="#_x0000_t202" style="position:absolute;margin-left:126.85pt;margin-top:-22.45pt;width:338.2pt;height:48.45pt;z-index:3;visibility:visible;mso-position-horizontal-relative:page;mso-width-relative:margin;mso-height-relative:margin" o:gfxdata="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" fillcolor="window" stroked="f" strokeweight=".5pt">
           <v:textbox style="mso-next-textbox:#Text Box 3">
             <w:txbxContent>
               <w:p>
@@ -3410,7 +3203,7 @@
           <v:path o:extrusionok="f" gradientshapeok="t" o:connecttype="rect"/>
           <o:lock v:ext="edit" aspectratio="t"/>
         </v:shapetype>
-        <v:shape id="Imagen 9" o:spid="_x0000_s1035" type="#_x0000_t75" alt="Logo, company name&#10;&#10;Description automatically generated" style="position:absolute;margin-left:401.55pt;margin-top:-13.75pt;width:91.1pt;height:43.5pt;z-index:5;visibility:visible;mso-width-relative:margin;mso-height-relative:margin">
+        <v:shape id="Imagen 9" o:spid="_x0000_s1035" type="#_x0000_t75" alt="Logo, company name&#10;&#10;Description automatically generated" style="position:absolute;margin-left:401.55pt;margin-top:-13.75pt;width:91.1pt;height:43.5pt;z-index:4;visibility:visible;mso-width-relative:margin;mso-height-relative:margin">
           <v:imagedata r:id="rId1" o:title="image001"/>
         </v:shape>
       </w:pict>
@@ -7751,6 +7544,8 @@
     <w:lsdException w:name="heading 7" w:semiHidden="1" w:unhideWhenUsed="1" w:qFormat="1"/>
     <w:lsdException w:name="heading 8" w:semiHidden="1" w:unhideWhenUsed="1" w:qFormat="1"/>
     <w:lsdException w:name="heading 9" w:semiHidden="1" w:unhideWhenUsed="1" w:qFormat="1"/>
+    <w:lsdException w:name="header" w:uiPriority="99"/>
+    <w:lsdException w:name="footer" w:uiPriority="99" w:qFormat="1"/>
     <w:lsdException w:name="caption" w:semiHidden="1" w:unhideWhenUsed="1" w:qFormat="1"/>
     <w:lsdException w:name="List Bullet" w:uiPriority="99"/>
     <w:lsdException w:name="Title" w:qFormat="1"/>
@@ -8126,9 +7921,10 @@
   </w:style>
   <w:style w:type="paragraph" w:styleId="Header">
     <w:name w:val="header"/>
-    <w:aliases w:val=" Car,APNSHEADER2,L1 Header,encabezado,En-tête 1.1,En-tÍte 1.1,En-tÕte 1.1,En-t’te 1.1,En-títe 1.1,*Header,h,Header1,Encabezado Car Car,logomai,even,Header/Footer,header odd,Hyphen,Chapter Name,base,body,En-tête SQ,ITT i,he,bases I,h Car Car1"/>
+    <w:aliases w:val=" Car,APNSHEADER2,L1 Header,encabezado,En-tête 1.1,En-tÍte 1.1,En-tÕte 1.1,En-t’te 1.1,En-títe 1.1,*Header,h,Header1,Encabezado Car Car,logomai,even,Header/Footer,header odd,Hyphen,Chapter Name,base,body,En-tête SQ,ITT i,he,bases I,h Car Car1,h Ca"/>
     <w:basedOn w:val="Normal"/>
     <w:link w:val="HeaderChar"/>
+    <w:uiPriority w:val="99"/>
     <w:pPr>
       <w:tabs>
         <w:tab w:val="center" w:pos="4419"/>
@@ -8138,7 +7934,11 @@
   </w:style>
   <w:style w:type="paragraph" w:styleId="Footer">
     <w:name w:val="footer"/>
+    <w:aliases w:val="Footer Text Stk"/>
     <w:basedOn w:val="Normal"/>
+    <w:link w:val="FooterChar"/>
+    <w:uiPriority w:val="99"/>
+    <w:qFormat/>
     <w:pPr>
       <w:tabs>
         <w:tab w:val="center" w:pos="4320"/>
@@ -8240,6 +8040,7 @@
     <w:name w:val="Header Char"/>
     <w:aliases w:val=" Car Char,APNSHEADER2 Char,L1 Header Char,encabezado Char,En-tête 1.1 Char,En-tÍte 1.1 Char,En-tÕte 1.1 Char,En-t’te 1.1 Char,En-títe 1.1 Char,*Header Char,h Char,Header1 Char,Encabezado Car Car Char,logomai Char,even Char,Header/Footer Char"/>
     <w:link w:val="Header"/>
+    <w:qFormat/>
     <w:rsid w:val="007F334B"/>
     <w:rPr>
       <w:sz w:val="24"/>
@@ -8340,6 +8141,14 @@
       <w:rFonts w:ascii="Arial" w:hAnsi="Arial"/>
       <w:szCs w:val="24"/>
     </w:rPr>
+  </w:style>
+  <w:style w:type="character" w:customStyle="1" w:styleId="FooterChar">
+    <w:name w:val="Footer Char"/>
+    <w:aliases w:val="Footer Text Stk Char"/>
+    <w:basedOn w:val="DefaultParagraphFont"/>
+    <w:link w:val="Footer"/>
+    <w:uiPriority w:val="99"/>
+    <w:rsid w:val="00C952BC"/>
   </w:style>
 </w:styles>
 </file>
@@ -8606,6 +8415,21 @@
 </file>
 
 <file path=customXml/item1.xml><?xml version="1.0" encoding="utf-8"?>
+<b:Sources xmlns:b="http://schemas.openxmlformats.org/officeDocument/2006/bibliography" xmlns="http://schemas.openxmlformats.org/officeDocument/2006/bibliography" SelectedStyle="\APASixthEditionOfficeOnline.xsl" StyleName="APA" Version="6"/>
+</file>
+
+<file path=customXml/item2.xml><?xml version="1.0" encoding="utf-8"?>
+<p:properties xmlns:p="http://schemas.microsoft.com/office/2006/metadata/properties" xmlns:xsi="http://www.w3.org/2001/XMLSchema-instance" xmlns:pc="http://schemas.microsoft.com/office/infopath/2007/PartnerControls">
+  <documentManagement>
+    <lcf76f155ced4ddcb4097134ff3c332f xmlns="458c8650-8b2e-4de5-be2b-3b5e20f9203e">
+      <Terms xmlns="http://schemas.microsoft.com/office/infopath/2007/PartnerControls"/>
+    </lcf76f155ced4ddcb4097134ff3c332f>
+    <TaxCatchAll xmlns="0ec1683b-1f09-407c-8792-a5a8bc579d9d"/>
+  </documentManagement>
+</p:properties>
+</file>
+
+<file path=customXml/item3.xml><?xml version="1.0" encoding="utf-8"?>
 <ct:contentTypeSchema xmlns:ct="http://schemas.microsoft.com/office/2006/metadata/contentType" xmlns:ma="http://schemas.microsoft.com/office/2006/metadata/properties/metaAttributes" ct:_="" ma:_="" ma:contentTypeName="Document" ma:contentTypeID="0x010100AA01E1029091DE488084A5A2D9C24E74" ma:contentTypeVersion="10" ma:contentTypeDescription="Create a new document." ma:contentTypeScope="" ma:versionID="fa224b1e2ea5aaa53b64c3b4b1d435b1">
   <xsd:schema xmlns:xsd="http://www.w3.org/2001/XMLSchema" xmlns:xs="http://www.w3.org/2001/XMLSchema" xmlns:p="http://schemas.microsoft.com/office/2006/metadata/properties" xmlns:ns2="458c8650-8b2e-4de5-be2b-3b5e20f9203e" xmlns:ns3="0ec1683b-1f09-407c-8792-a5a8bc579d9d" targetNamespace="http://schemas.microsoft.com/office/2006/metadata/properties" ma:root="true" ma:fieldsID="3f0568638764530331fbee8047bb9098" ns2:_="" ns3:_="">
     <xsd:import namespace="458c8650-8b2e-4de5-be2b-3b5e20f9203e"/>
@@ -8794,7 +8618,7 @@
 </ct:contentTypeSchema>
 </file>
 
-<file path=customXml/item2.xml><?xml version="1.0" encoding="utf-8"?>
+<file path=customXml/item4.xml><?xml version="1.0" encoding="utf-8"?>
 <?mso-contentType ?>
 <FormTemplates xmlns="http://schemas.microsoft.com/sharepoint/v3/contenttype/forms">
   <Display>DocumentLibraryForm</Display>
@@ -8803,22 +8627,26 @@
 </FormTemplates>
 </file>
 
-<file path=customXml/item3.xml><?xml version="1.0" encoding="utf-8"?>
-<b:Sources xmlns:b="http://schemas.openxmlformats.org/officeDocument/2006/bibliography" xmlns="http://schemas.openxmlformats.org/officeDocument/2006/bibliography" SelectedStyle="\APASixthEditionOfficeOnline.xsl" StyleName="APA" Version="6"/>
+<file path=customXml/itemProps1.xml><?xml version="1.0" encoding="utf-8"?>
+<ds:datastoreItem xmlns:ds="http://schemas.openxmlformats.org/officeDocument/2006/customXml" ds:itemID="{4BB9A27A-6211-48E6-B3D1-1ED5E2EAD372}">
+  <ds:schemaRefs>
+    <ds:schemaRef ds:uri="http://schemas.openxmlformats.org/officeDocument/2006/bibliography"/>
+  </ds:schemaRefs>
+</ds:datastoreItem>
 </file>
 
-<file path=customXml/item4.xml><?xml version="1.0" encoding="utf-8"?>
-<p:properties xmlns:p="http://schemas.microsoft.com/office/2006/metadata/properties" xmlns:xsi="http://www.w3.org/2001/XMLSchema-instance" xmlns:pc="http://schemas.microsoft.com/office/infopath/2007/PartnerControls">
-  <documentManagement>
-    <lcf76f155ced4ddcb4097134ff3c332f xmlns="458c8650-8b2e-4de5-be2b-3b5e20f9203e">
-      <Terms xmlns="http://schemas.microsoft.com/office/infopath/2007/PartnerControls"/>
-    </lcf76f155ced4ddcb4097134ff3c332f>
-    <TaxCatchAll xmlns="0ec1683b-1f09-407c-8792-a5a8bc579d9d"/>
-  </documentManagement>
-</p:properties>
+<file path=customXml/itemProps2.xml><?xml version="1.0" encoding="utf-8"?>
+<ds:datastoreItem xmlns:ds="http://schemas.openxmlformats.org/officeDocument/2006/customXml" ds:itemID="{D3A3C24A-BB39-4937-B831-24AA124EAA87}">
+  <ds:schemaRefs>
+    <ds:schemaRef ds:uri="http://schemas.microsoft.com/office/2006/metadata/properties"/>
+    <ds:schemaRef ds:uri="http://schemas.microsoft.com/office/infopath/2007/PartnerControls"/>
+    <ds:schemaRef ds:uri="458c8650-8b2e-4de5-be2b-3b5e20f9203e"/>
+    <ds:schemaRef ds:uri="0ec1683b-1f09-407c-8792-a5a8bc579d9d"/>
+  </ds:schemaRefs>
+</ds:datastoreItem>
 </file>
 
-<file path=customXml/itemProps1.xml><?xml version="1.0" encoding="utf-8"?>
+<file path=customXml/itemProps3.xml><?xml version="1.0" encoding="utf-8"?>
 <ds:datastoreItem xmlns:ds="http://schemas.openxmlformats.org/officeDocument/2006/customXml" ds:itemID="{6EE546D2-1DFA-4BBD-AF1C-4C842A1F8073}">
   <ds:schemaRefs>
     <ds:schemaRef ds:uri="http://schemas.microsoft.com/office/2006/metadata/contentType"/>
@@ -8837,29 +8665,10 @@
 </ds:datastoreItem>
 </file>
 
-<file path=customXml/itemProps2.xml><?xml version="1.0" encoding="utf-8"?>
+<file path=customXml/itemProps4.xml><?xml version="1.0" encoding="utf-8"?>
 <ds:datastoreItem xmlns:ds="http://schemas.openxmlformats.org/officeDocument/2006/customXml" ds:itemID="{51241304-2C43-44E6-B26F-77C42016271C}">
   <ds:schemaRefs>
     <ds:schemaRef ds:uri="http://schemas.microsoft.com/sharepoint/v3/contenttype/forms"/>
   </ds:schemaRefs>
 </ds:datastoreItem>
-</file>
-
-<file path=customXml/itemProps3.xml><?xml version="1.0" encoding="utf-8"?>
-<ds:datastoreItem xmlns:ds="http://schemas.openxmlformats.org/officeDocument/2006/customXml" ds:itemID="{4BB9A27A-6211-48E6-B3D1-1ED5E2EAD372}">
-  <ds:schemaRefs>
-    <ds:schemaRef ds:uri="http://schemas.openxmlformats.org/officeDocument/2006/bibliography"/>
-  </ds:schemaRefs>
-</ds:datastoreItem>
-</file>
-
-<file path=customXml/itemProps4.xml><?xml version="1.0" encoding="utf-8"?>
-<ds:datastoreItem xmlns:ds="http://schemas.openxmlformats.org/officeDocument/2006/customXml" ds:itemID="{D3A3C24A-BB39-4937-B831-24AA124EAA87}">
-  <ds:schemaRefs>
-    <ds:schemaRef ds:uri="http://schemas.microsoft.com/office/2006/metadata/properties"/>
-    <ds:schemaRef ds:uri="http://schemas.microsoft.com/office/infopath/2007/PartnerControls"/>
-    <ds:schemaRef ds:uri="458c8650-8b2e-4de5-be2b-3b5e20f9203e"/>
-    <ds:schemaRef ds:uri="0ec1683b-1f09-407c-8792-a5a8bc579d9d"/>
-  </ds:schemaRefs>
-</ds:datastoreItem>
 </file>
</xml_diff>

<commit_message>
se suben cambios ultimas versiones de los skills de los perfiles
</commit_message>
<xml_diff>
--- a/PLANTILLA-DE-CV.docx
+++ b/PLANTILLA-DE-CV.docx
@@ -13,13 +13,23 @@
           <w:lang w:val="es-MX"/>
         </w:rPr>
       </w:pPr>
+      <w:proofErr w:type="gramStart"/>
       <w:r>
         <w:rPr>
           <w:b/>
           <w:bCs/>
           <w:lang w:val="es-MX"/>
         </w:rPr>
-        <w:t>{{ nombre }}</w:t>
+        <w:t>{{ nombre</w:t>
+      </w:r>
+      <w:proofErr w:type="gramEnd"/>
+      <w:r>
+        <w:rPr>
+          <w:b/>
+          <w:bCs/>
+          <w:lang w:val="es-MX"/>
+        </w:rPr>
+        <w:t xml:space="preserve"> }}</w:t>
       </w:r>
     </w:p>
     <w:p>
@@ -31,6 +41,7 @@
           <w:lang w:val="es-MX"/>
         </w:rPr>
       </w:pPr>
+      <w:proofErr w:type="gramStart"/>
       <w:r>
         <w:rPr>
           <w:b/>
@@ -46,7 +57,25 @@
           <w:bCs/>
           <w:lang w:val="es-MX"/>
         </w:rPr>
-        <w:t>rol_propuesto</w:t>
+        <w:t>rol</w:t>
+      </w:r>
+      <w:proofErr w:type="gramEnd"/>
+      <w:r>
+        <w:rPr>
+          <w:b/>
+          <w:bCs/>
+          <w:lang w:val="es-MX"/>
+        </w:rPr>
+        <w:t>_</w:t>
+      </w:r>
+      <w:proofErr w:type="gramStart"/>
+      <w:r>
+        <w:rPr>
+          <w:b/>
+          <w:bCs/>
+          <w:lang w:val="es-MX"/>
+        </w:rPr>
+        <w:t>propuesto</w:t>
       </w:r>
       <w:proofErr w:type="spellEnd"/>
       <w:r>
@@ -55,7 +84,16 @@
           <w:bCs/>
           <w:lang w:val="es-MX"/>
         </w:rPr>
-        <w:t xml:space="preserve"> }}</w:t>
+        <w:t xml:space="preserve"> }</w:t>
+      </w:r>
+      <w:proofErr w:type="gramEnd"/>
+      <w:r>
+        <w:rPr>
+          <w:b/>
+          <w:bCs/>
+          <w:lang w:val="es-MX"/>
+        </w:rPr>
+        <w:t>}</w:t>
       </w:r>
     </w:p>
     <w:p>
@@ -73,11 +111,14 @@
     </w:p>
     <w:p>
       <w:pPr>
-        <w:rPr>
-          <w:rFonts w:ascii="Arial" w:hAnsi="Arial" w:cs="Arial"/>
-          <w:bCs/>
-          <w:sz w:val="18"/>
-          <w:szCs w:val="18"/>
+        <w:pStyle w:val="Title"/>
+        <w:jc w:val="left"/>
+        <w:rPr>
+          <w:b/>
+          <w:bCs/>
+          <w:sz w:val="18"/>
+          <w:szCs w:val="18"/>
+          <w:lang w:val="es-MX"/>
         </w:rPr>
       </w:pPr>
     </w:p>
@@ -109,17 +150,7 @@
           <w:szCs w:val="18"/>
           <w:u w:val="single"/>
         </w:rPr>
-        <w:t>EXPERIENCIA</w:t>
-      </w:r>
-      <w:r>
-        <w:rPr>
-          <w:rFonts w:ascii="Arial" w:hAnsi="Arial" w:cs="Arial"/>
-          <w:b/>
-          <w:sz w:val="18"/>
-          <w:szCs w:val="18"/>
-          <w:u w:val="single"/>
-        </w:rPr>
-        <w:t xml:space="preserve"> PROFESIONAL</w:t>
+        <w:t>FUNCIONES</w:t>
       </w:r>
     </w:p>
     <w:p>
@@ -171,6 +202,7 @@
                 <w:lang w:val="es-419"/>
               </w:rPr>
             </w:pPr>
+            <w:proofErr w:type="gramStart"/>
             <w:r>
               <w:rPr>
                 <w:rFonts w:ascii="Arial" w:eastAsia="Times New Roman" w:hAnsi="Arial" w:cs="Arial"/>
@@ -190,9 +222,10 @@
                 <w:szCs w:val="18"/>
                 <w:lang w:val="en-US" w:eastAsia="es-ES"/>
               </w:rPr>
-              <w:t>resumen_profesional</w:t>
+              <w:t>funciones</w:t>
             </w:r>
             <w:proofErr w:type="spellEnd"/>
+            <w:proofErr w:type="gramEnd"/>
             <w:r>
               <w:rPr>
                 <w:rFonts w:ascii="Arial" w:eastAsia="Times New Roman" w:hAnsi="Arial" w:cs="Arial"/>
@@ -214,6 +247,155 @@
           <w:bCs/>
           <w:sz w:val="18"/>
           <w:szCs w:val="18"/>
+        </w:rPr>
+      </w:pPr>
+    </w:p>
+    <w:p>
+      <w:pPr>
+        <w:rPr>
+          <w:rFonts w:ascii="Arial" w:hAnsi="Arial" w:cs="Arial"/>
+          <w:b/>
+          <w:sz w:val="18"/>
+          <w:szCs w:val="18"/>
+          <w:u w:val="single"/>
+        </w:rPr>
+      </w:pPr>
+    </w:p>
+    <w:p>
+      <w:pPr>
+        <w:rPr>
+          <w:rFonts w:ascii="Arial" w:hAnsi="Arial" w:cs="Arial"/>
+          <w:b/>
+          <w:sz w:val="18"/>
+          <w:szCs w:val="18"/>
+          <w:u w:val="single"/>
+        </w:rPr>
+      </w:pPr>
+      <w:r>
+        <w:rPr>
+          <w:rFonts w:ascii="Arial" w:hAnsi="Arial" w:cs="Arial"/>
+          <w:b/>
+          <w:sz w:val="18"/>
+          <w:szCs w:val="18"/>
+          <w:u w:val="single"/>
+        </w:rPr>
+        <w:t>EXPERIENCIA</w:t>
+      </w:r>
+      <w:r>
+        <w:rPr>
+          <w:rFonts w:ascii="Arial" w:hAnsi="Arial" w:cs="Arial"/>
+          <w:b/>
+          <w:sz w:val="18"/>
+          <w:szCs w:val="18"/>
+          <w:u w:val="single"/>
+        </w:rPr>
+        <w:t xml:space="preserve"> PROFESIONAL</w:t>
+      </w:r>
+    </w:p>
+    <w:p>
+      <w:pPr>
+        <w:rPr>
+          <w:rFonts w:ascii="Arial" w:hAnsi="Arial" w:cs="Arial"/>
+          <w:bCs/>
+          <w:sz w:val="18"/>
+          <w:szCs w:val="18"/>
+        </w:rPr>
+      </w:pPr>
+    </w:p>
+    <w:tbl>
+      <w:tblPr>
+        <w:tblW w:w="0" w:type="auto"/>
+        <w:tblInd w:w="-75" w:type="dxa"/>
+        <w:tblBorders>
+          <w:top w:val="single" w:sz="4" w:space="0" w:color="auto"/>
+          <w:left w:val="single" w:sz="4" w:space="0" w:color="auto"/>
+          <w:bottom w:val="single" w:sz="4" w:space="0" w:color="auto"/>
+          <w:right w:val="single" w:sz="4" w:space="0" w:color="auto"/>
+          <w:insideH w:val="single" w:sz="4" w:space="0" w:color="auto"/>
+          <w:insideV w:val="single" w:sz="4" w:space="0" w:color="auto"/>
+        </w:tblBorders>
+        <w:tblLayout w:type="fixed"/>
+        <w:tblCellMar>
+          <w:left w:w="105" w:type="dxa"/>
+          <w:right w:w="105" w:type="dxa"/>
+        </w:tblCellMar>
+        <w:tblLook w:val="0000" w:firstRow="0" w:lastRow="0" w:firstColumn="0" w:lastColumn="0" w:noHBand="0" w:noVBand="0"/>
+      </w:tblPr>
+      <w:tblGrid>
+        <w:gridCol w:w="9961"/>
+      </w:tblGrid>
+      <w:tr>
+        <w:tc>
+          <w:tcPr>
+            <w:tcW w:w="9961" w:type="dxa"/>
+          </w:tcPr>
+          <w:p>
+            <w:pPr>
+              <w:pStyle w:val="BodyText3"/>
+              <w:spacing w:after="40"/>
+              <w:ind w:right="51"/>
+              <w:rPr>
+                <w:rFonts w:ascii="Arial" w:hAnsi="Arial" w:cs="Arial"/>
+                <w:sz w:val="18"/>
+                <w:szCs w:val="18"/>
+                <w:lang w:val="es-419"/>
+              </w:rPr>
+            </w:pPr>
+            <w:proofErr w:type="gramStart"/>
+            <w:r>
+              <w:rPr>
+                <w:rFonts w:ascii="Arial" w:eastAsia="Times New Roman" w:hAnsi="Arial" w:cs="Arial"/>
+                <w:bCs/>
+                <w:sz w:val="18"/>
+                <w:szCs w:val="18"/>
+                <w:lang w:val="en-US" w:eastAsia="es-ES"/>
+              </w:rPr>
+              <w:t xml:space="preserve">{{ </w:t>
+            </w:r>
+            <w:proofErr w:type="spellStart"/>
+            <w:r>
+              <w:rPr>
+                <w:rFonts w:ascii="Arial" w:eastAsia="Times New Roman" w:hAnsi="Arial" w:cs="Arial"/>
+                <w:bCs/>
+                <w:sz w:val="18"/>
+                <w:szCs w:val="18"/>
+                <w:lang w:val="en-US" w:eastAsia="es-ES"/>
+              </w:rPr>
+              <w:t>resumen</w:t>
+            </w:r>
+            <w:proofErr w:type="gramEnd"/>
+            <w:r>
+              <w:rPr>
+                <w:rFonts w:ascii="Arial" w:eastAsia="Times New Roman" w:hAnsi="Arial" w:cs="Arial"/>
+                <w:bCs/>
+                <w:sz w:val="18"/>
+                <w:szCs w:val="18"/>
+                <w:lang w:val="en-US" w:eastAsia="es-ES"/>
+              </w:rPr>
+              <w:t>_profesional</w:t>
+            </w:r>
+            <w:proofErr w:type="spellEnd"/>
+            <w:r>
+              <w:rPr>
+                <w:rFonts w:ascii="Arial" w:eastAsia="Times New Roman" w:hAnsi="Arial" w:cs="Arial"/>
+                <w:bCs/>
+                <w:sz w:val="18"/>
+                <w:szCs w:val="18"/>
+                <w:lang w:val="en-US" w:eastAsia="es-ES"/>
+              </w:rPr>
+              <w:t xml:space="preserve"> }}</w:t>
+            </w:r>
+          </w:p>
+        </w:tc>
+      </w:tr>
+    </w:tbl>
+    <w:p>
+      <w:pPr>
+        <w:rPr>
+          <w:rFonts w:ascii="Arial" w:hAnsi="Arial" w:cs="Arial"/>
+          <w:bCs/>
+          <w:sz w:val="18"/>
+          <w:szCs w:val="18"/>
           <w:lang w:val="es-MX"/>
         </w:rPr>
       </w:pPr>
@@ -278,7 +460,18 @@
           <w:szCs w:val="18"/>
           <w:lang w:val="en-US"/>
         </w:rPr>
-        <w:t>experiencia_laboral</w:t>
+        <w:t>experiencia_</w:t>
+      </w:r>
+      <w:proofErr w:type="gramStart"/>
+      <w:r>
+        <w:rPr>
+          <w:rFonts w:ascii="Arial" w:hAnsi="Arial" w:cs="Arial"/>
+          <w:bCs/>
+          <w:sz w:val="18"/>
+          <w:szCs w:val="18"/>
+          <w:lang w:val="en-US"/>
+        </w:rPr>
+        <w:t>laboral</w:t>
       </w:r>
       <w:proofErr w:type="spellEnd"/>
       <w:r>
@@ -288,6 +481,662 @@
           <w:sz w:val="18"/>
           <w:szCs w:val="18"/>
           <w:lang w:val="en-US"/>
+        </w:rPr>
+        <w:t xml:space="preserve"> %}</w:t>
+      </w:r>
+      <w:proofErr w:type="gramEnd"/>
+    </w:p>
+    <w:tbl>
+      <w:tblPr>
+        <w:tblW w:w="0" w:type="auto"/>
+        <w:tblInd w:w="-75" w:type="dxa"/>
+        <w:tblBorders>
+          <w:top w:val="single" w:sz="4" w:space="0" w:color="auto"/>
+          <w:left w:val="single" w:sz="4" w:space="0" w:color="auto"/>
+          <w:bottom w:val="single" w:sz="4" w:space="0" w:color="auto"/>
+          <w:right w:val="single" w:sz="4" w:space="0" w:color="auto"/>
+          <w:insideH w:val="single" w:sz="4" w:space="0" w:color="auto"/>
+          <w:insideV w:val="single" w:sz="4" w:space="0" w:color="auto"/>
+        </w:tblBorders>
+        <w:tblLayout w:type="fixed"/>
+        <w:tblCellMar>
+          <w:left w:w="105" w:type="dxa"/>
+          <w:right w:w="105" w:type="dxa"/>
+        </w:tblCellMar>
+        <w:tblLook w:val="0000" w:firstRow="0" w:lastRow="0" w:firstColumn="0" w:lastColumn="0" w:noHBand="0" w:noVBand="0"/>
+      </w:tblPr>
+      <w:tblGrid>
+        <w:gridCol w:w="2472"/>
+        <w:gridCol w:w="2472"/>
+        <w:gridCol w:w="2472"/>
+        <w:gridCol w:w="2475"/>
+      </w:tblGrid>
+      <w:tr>
+        <w:tc>
+          <w:tcPr>
+            <w:tcW w:w="2472" w:type="dxa"/>
+          </w:tcPr>
+          <w:p>
+            <w:pPr>
+              <w:rPr>
+                <w:rFonts w:ascii="Arial" w:hAnsi="Arial" w:cs="Arial"/>
+                <w:b/>
+                <w:sz w:val="18"/>
+                <w:szCs w:val="18"/>
+                <w:lang w:val="es-MX"/>
+              </w:rPr>
+            </w:pPr>
+            <w:r>
+              <w:rPr>
+                <w:rFonts w:ascii="Arial" w:hAnsi="Arial" w:cs="Arial"/>
+                <w:b/>
+                <w:sz w:val="18"/>
+                <w:szCs w:val="18"/>
+                <w:lang w:val="es-MX"/>
+              </w:rPr>
+              <w:t>Empresa</w:t>
+            </w:r>
+          </w:p>
+          <w:p>
+            <w:pPr>
+              <w:rPr>
+                <w:rFonts w:ascii="Arial" w:hAnsi="Arial" w:cs="Arial"/>
+                <w:color w:val="0070C0"/>
+                <w:sz w:val="18"/>
+                <w:szCs w:val="18"/>
+                <w:lang w:val="es-MX"/>
+              </w:rPr>
+            </w:pPr>
+            <w:proofErr w:type="gramStart"/>
+            <w:r>
+              <w:rPr>
+                <w:rFonts w:ascii="Arial" w:hAnsi="Arial" w:cs="Arial"/>
+                <w:sz w:val="18"/>
+                <w:szCs w:val="18"/>
+                <w:lang w:val="es-MX"/>
+              </w:rPr>
+              <w:t xml:space="preserve">{{ </w:t>
+            </w:r>
+            <w:proofErr w:type="spellStart"/>
+            <w:r>
+              <w:rPr>
+                <w:rFonts w:ascii="Arial" w:hAnsi="Arial" w:cs="Arial"/>
+                <w:sz w:val="18"/>
+                <w:szCs w:val="18"/>
+                <w:lang w:val="es-MX"/>
+              </w:rPr>
+              <w:t>exp</w:t>
+            </w:r>
+            <w:proofErr w:type="gramEnd"/>
+            <w:r>
+              <w:rPr>
+                <w:rFonts w:ascii="Arial" w:hAnsi="Arial" w:cs="Arial"/>
+                <w:sz w:val="18"/>
+                <w:szCs w:val="18"/>
+                <w:lang w:val="es-MX"/>
+              </w:rPr>
+              <w:t>.empresa</w:t>
+            </w:r>
+            <w:proofErr w:type="spellEnd"/>
+            <w:r>
+              <w:rPr>
+                <w:rFonts w:ascii="Arial" w:hAnsi="Arial" w:cs="Arial"/>
+                <w:sz w:val="18"/>
+                <w:szCs w:val="18"/>
+                <w:lang w:val="es-MX"/>
+              </w:rPr>
+              <w:t xml:space="preserve"> }}</w:t>
+            </w:r>
+          </w:p>
+        </w:tc>
+        <w:tc>
+          <w:tcPr>
+            <w:tcW w:w="2472" w:type="dxa"/>
+          </w:tcPr>
+          <w:p>
+            <w:pPr>
+              <w:rPr>
+                <w:rFonts w:ascii="Arial" w:hAnsi="Arial" w:cs="Arial"/>
+                <w:b/>
+                <w:sz w:val="18"/>
+                <w:szCs w:val="18"/>
+                <w:lang w:val="es-MX"/>
+              </w:rPr>
+            </w:pPr>
+            <w:r>
+              <w:rPr>
+                <w:rFonts w:ascii="Arial" w:hAnsi="Arial" w:cs="Arial"/>
+                <w:b/>
+                <w:sz w:val="18"/>
+                <w:szCs w:val="18"/>
+                <w:lang w:val="es-MX"/>
+              </w:rPr>
+              <w:t>Puesto</w:t>
+            </w:r>
+          </w:p>
+          <w:p>
+            <w:pPr>
+              <w:rPr>
+                <w:rFonts w:ascii="Arial" w:hAnsi="Arial" w:cs="Arial"/>
+                <w:bCs/>
+                <w:sz w:val="18"/>
+                <w:szCs w:val="18"/>
+                <w:lang w:val="es-MX"/>
+              </w:rPr>
+            </w:pPr>
+            <w:proofErr w:type="gramStart"/>
+            <w:r>
+              <w:rPr>
+                <w:rFonts w:ascii="Arial" w:hAnsi="Arial" w:cs="Arial"/>
+                <w:sz w:val="18"/>
+                <w:szCs w:val="18"/>
+                <w:lang w:val="es-MX"/>
+              </w:rPr>
+              <w:t xml:space="preserve">{{ </w:t>
+            </w:r>
+            <w:proofErr w:type="spellStart"/>
+            <w:r>
+              <w:rPr>
+                <w:rFonts w:ascii="Arial" w:hAnsi="Arial" w:cs="Arial"/>
+                <w:sz w:val="18"/>
+                <w:szCs w:val="18"/>
+                <w:lang w:val="es-MX"/>
+              </w:rPr>
+              <w:t>exp</w:t>
+            </w:r>
+            <w:proofErr w:type="gramEnd"/>
+            <w:r>
+              <w:rPr>
+                <w:rFonts w:ascii="Arial" w:hAnsi="Arial" w:cs="Arial"/>
+                <w:sz w:val="18"/>
+                <w:szCs w:val="18"/>
+                <w:lang w:val="es-MX"/>
+              </w:rPr>
+              <w:t>.puesto</w:t>
+            </w:r>
+            <w:proofErr w:type="spellEnd"/>
+            <w:r>
+              <w:rPr>
+                <w:rFonts w:ascii="Arial" w:hAnsi="Arial" w:cs="Arial"/>
+                <w:sz w:val="18"/>
+                <w:szCs w:val="18"/>
+                <w:lang w:val="es-MX"/>
+              </w:rPr>
+              <w:t xml:space="preserve"> }}</w:t>
+            </w:r>
+          </w:p>
+        </w:tc>
+        <w:tc>
+          <w:tcPr>
+            <w:tcW w:w="2472" w:type="dxa"/>
+          </w:tcPr>
+          <w:p>
+            <w:pPr>
+              <w:rPr>
+                <w:rFonts w:ascii="Arial" w:hAnsi="Arial" w:cs="Arial"/>
+                <w:b/>
+                <w:sz w:val="18"/>
+                <w:szCs w:val="18"/>
+                <w:lang w:val="es-MX"/>
+              </w:rPr>
+            </w:pPr>
+            <w:r>
+              <w:rPr>
+                <w:rFonts w:ascii="Arial" w:hAnsi="Arial" w:cs="Arial"/>
+                <w:b/>
+                <w:sz w:val="18"/>
+                <w:szCs w:val="18"/>
+                <w:lang w:val="es-MX"/>
+              </w:rPr>
+              <w:t>Desde:</w:t>
+            </w:r>
+          </w:p>
+          <w:p>
+            <w:pPr>
+              <w:rPr>
+                <w:rFonts w:ascii="Arial" w:hAnsi="Arial" w:cs="Arial"/>
+                <w:bCs/>
+                <w:sz w:val="18"/>
+                <w:szCs w:val="18"/>
+                <w:lang w:val="es-MX"/>
+              </w:rPr>
+            </w:pPr>
+            <w:proofErr w:type="gramStart"/>
+            <w:r>
+              <w:rPr>
+                <w:rFonts w:ascii="Arial" w:hAnsi="Arial" w:cs="Arial"/>
+                <w:sz w:val="18"/>
+                <w:szCs w:val="18"/>
+                <w:lang w:val="es-MX"/>
+              </w:rPr>
+              <w:t xml:space="preserve">{{ </w:t>
+            </w:r>
+            <w:proofErr w:type="spellStart"/>
+            <w:r>
+              <w:rPr>
+                <w:rFonts w:ascii="Arial" w:hAnsi="Arial" w:cs="Arial"/>
+                <w:sz w:val="18"/>
+                <w:szCs w:val="18"/>
+                <w:lang w:val="es-MX"/>
+              </w:rPr>
+              <w:t>exp</w:t>
+            </w:r>
+            <w:proofErr w:type="gramEnd"/>
+            <w:r>
+              <w:rPr>
+                <w:rFonts w:ascii="Arial" w:hAnsi="Arial" w:cs="Arial"/>
+                <w:sz w:val="18"/>
+                <w:szCs w:val="18"/>
+                <w:lang w:val="es-MX"/>
+              </w:rPr>
+              <w:t>.fecha_inicio</w:t>
+            </w:r>
+            <w:proofErr w:type="spellEnd"/>
+            <w:r>
+              <w:rPr>
+                <w:rFonts w:ascii="Arial" w:hAnsi="Arial" w:cs="Arial"/>
+                <w:sz w:val="18"/>
+                <w:szCs w:val="18"/>
+                <w:lang w:val="es-MX"/>
+              </w:rPr>
+              <w:t xml:space="preserve"> }}</w:t>
+            </w:r>
+          </w:p>
+        </w:tc>
+        <w:tc>
+          <w:tcPr>
+            <w:tcW w:w="2475" w:type="dxa"/>
+          </w:tcPr>
+          <w:p>
+            <w:pPr>
+              <w:pStyle w:val="Heading2"/>
+              <w:rPr>
+                <w:bCs w:val="0"/>
+                <w:szCs w:val="18"/>
+                <w:lang w:val="es-MX"/>
+              </w:rPr>
+            </w:pPr>
+            <w:r>
+              <w:rPr>
+                <w:bCs w:val="0"/>
+                <w:szCs w:val="18"/>
+                <w:lang w:val="es-MX"/>
+              </w:rPr>
+              <w:t xml:space="preserve">Hasta: </w:t>
+            </w:r>
+          </w:p>
+          <w:p>
+            <w:pPr>
+              <w:rPr>
+                <w:rFonts w:ascii="Arial" w:hAnsi="Arial" w:cs="Arial"/>
+                <w:sz w:val="18"/>
+                <w:szCs w:val="18"/>
+                <w:lang w:val="es-MX"/>
+              </w:rPr>
+            </w:pPr>
+            <w:proofErr w:type="gramStart"/>
+            <w:r>
+              <w:rPr>
+                <w:rFonts w:ascii="Arial" w:hAnsi="Arial" w:cs="Arial"/>
+                <w:sz w:val="18"/>
+                <w:szCs w:val="18"/>
+                <w:lang w:val="es-MX"/>
+              </w:rPr>
+              <w:t xml:space="preserve">{{ </w:t>
+            </w:r>
+            <w:proofErr w:type="spellStart"/>
+            <w:r>
+              <w:rPr>
+                <w:rFonts w:ascii="Arial" w:hAnsi="Arial" w:cs="Arial"/>
+                <w:sz w:val="18"/>
+                <w:szCs w:val="18"/>
+                <w:lang w:val="es-MX"/>
+              </w:rPr>
+              <w:t>exp</w:t>
+            </w:r>
+            <w:proofErr w:type="gramEnd"/>
+            <w:r>
+              <w:rPr>
+                <w:rFonts w:ascii="Arial" w:hAnsi="Arial" w:cs="Arial"/>
+                <w:sz w:val="18"/>
+                <w:szCs w:val="18"/>
+                <w:lang w:val="es-MX"/>
+              </w:rPr>
+              <w:t>.fecha_fin</w:t>
+            </w:r>
+            <w:proofErr w:type="spellEnd"/>
+            <w:r>
+              <w:rPr>
+                <w:rFonts w:ascii="Arial" w:hAnsi="Arial" w:cs="Arial"/>
+                <w:sz w:val="18"/>
+                <w:szCs w:val="18"/>
+                <w:lang w:val="es-MX"/>
+              </w:rPr>
+              <w:t xml:space="preserve"> }}</w:t>
+            </w:r>
+          </w:p>
+        </w:tc>
+      </w:tr>
+    </w:tbl>
+    <w:p>
+      <w:pPr>
+        <w:rPr>
+          <w:rFonts w:ascii="Arial" w:hAnsi="Arial" w:cs="Arial"/>
+          <w:bCs/>
+          <w:sz w:val="18"/>
+          <w:szCs w:val="18"/>
+          <w:lang w:val="en-US"/>
+        </w:rPr>
+      </w:pPr>
+    </w:p>
+    <w:tbl>
+      <w:tblPr>
+        <w:tblW w:w="0" w:type="auto"/>
+        <w:tblInd w:w="-75" w:type="dxa"/>
+        <w:tblBorders>
+          <w:top w:val="single" w:sz="4" w:space="0" w:color="auto"/>
+          <w:left w:val="single" w:sz="4" w:space="0" w:color="auto"/>
+          <w:bottom w:val="single" w:sz="4" w:space="0" w:color="auto"/>
+          <w:right w:val="single" w:sz="4" w:space="0" w:color="auto"/>
+          <w:insideH w:val="single" w:sz="4" w:space="0" w:color="auto"/>
+          <w:insideV w:val="single" w:sz="4" w:space="0" w:color="auto"/>
+        </w:tblBorders>
+        <w:tblLayout w:type="fixed"/>
+        <w:tblCellMar>
+          <w:left w:w="105" w:type="dxa"/>
+          <w:right w:w="105" w:type="dxa"/>
+        </w:tblCellMar>
+        <w:tblLook w:val="0000" w:firstRow="0" w:lastRow="0" w:firstColumn="0" w:lastColumn="0" w:noHBand="0" w:noVBand="0"/>
+      </w:tblPr>
+      <w:tblGrid>
+        <w:gridCol w:w="2070"/>
+        <w:gridCol w:w="7821"/>
+      </w:tblGrid>
+      <w:tr>
+        <w:tc>
+          <w:tcPr>
+            <w:tcW w:w="2070" w:type="dxa"/>
+          </w:tcPr>
+          <w:p>
+            <w:pPr>
+              <w:rPr>
+                <w:rFonts w:ascii="Arial" w:hAnsi="Arial" w:cs="Arial"/>
+                <w:b/>
+                <w:bCs/>
+                <w:sz w:val="18"/>
+                <w:szCs w:val="18"/>
+              </w:rPr>
+            </w:pPr>
+            <w:r>
+              <w:rPr>
+                <w:rFonts w:ascii="Arial" w:hAnsi="Arial" w:cs="Arial"/>
+                <w:b/>
+                <w:bCs/>
+                <w:sz w:val="18"/>
+                <w:szCs w:val="18"/>
+                <w:lang w:val="es-MX"/>
+              </w:rPr>
+              <w:t>Actividades Principales</w:t>
+            </w:r>
+          </w:p>
+        </w:tc>
+        <w:tc>
+          <w:tcPr>
+            <w:tcW w:w="7821" w:type="dxa"/>
+          </w:tcPr>
+          <w:p>
+            <w:pPr>
+              <w:pStyle w:val="NoSpacing"/>
+              <w:ind w:left="0"/>
+              <w:jc w:val="both"/>
+              <w:rPr>
+                <w:sz w:val="18"/>
+                <w:szCs w:val="20"/>
+              </w:rPr>
+            </w:pPr>
+            <w:r>
+              <w:rPr>
+                <w:sz w:val="18"/>
+                <w:szCs w:val="20"/>
+              </w:rPr>
+              <w:t xml:space="preserve">{% for act in </w:t>
+            </w:r>
+            <w:proofErr w:type="spellStart"/>
+            <w:proofErr w:type="gramStart"/>
+            <w:r>
+              <w:rPr>
+                <w:sz w:val="18"/>
+                <w:szCs w:val="20"/>
+              </w:rPr>
+              <w:t>exp.actividades</w:t>
+            </w:r>
+            <w:proofErr w:type="spellEnd"/>
+            <w:proofErr w:type="gramEnd"/>
+            <w:r>
+              <w:rPr>
+                <w:sz w:val="18"/>
+                <w:szCs w:val="20"/>
+              </w:rPr>
+              <w:t xml:space="preserve"> </w:t>
+            </w:r>
+            <w:proofErr w:type="gramStart"/>
+            <w:r>
+              <w:rPr>
+                <w:sz w:val="18"/>
+                <w:szCs w:val="20"/>
+              </w:rPr>
+              <w:t>%}•</w:t>
+            </w:r>
+            <w:proofErr w:type="gramEnd"/>
+            <w:r>
+              <w:rPr>
+                <w:sz w:val="18"/>
+                <w:szCs w:val="20"/>
+              </w:rPr>
+              <w:t xml:space="preserve"> </w:t>
+            </w:r>
+            <w:proofErr w:type="gramStart"/>
+            <w:r>
+              <w:rPr>
+                <w:sz w:val="18"/>
+                <w:szCs w:val="20"/>
+              </w:rPr>
+              <w:t>{{ act</w:t>
+            </w:r>
+            <w:proofErr w:type="gramEnd"/>
+            <w:r>
+              <w:rPr>
+                <w:sz w:val="18"/>
+                <w:szCs w:val="20"/>
+              </w:rPr>
+              <w:t xml:space="preserve"> }}</w:t>
+            </w:r>
+          </w:p>
+          <w:p>
+            <w:pPr>
+              <w:pStyle w:val="NoSpacing"/>
+              <w:ind w:left="0"/>
+              <w:jc w:val="both"/>
+              <w:rPr>
+                <w:szCs w:val="22"/>
+              </w:rPr>
+            </w:pPr>
+            <w:r>
+              <w:rPr>
+                <w:sz w:val="18"/>
+                <w:szCs w:val="20"/>
+              </w:rPr>
+              <w:t xml:space="preserve">{% </w:t>
+            </w:r>
+            <w:proofErr w:type="spellStart"/>
+            <w:r>
+              <w:rPr>
+                <w:sz w:val="18"/>
+                <w:szCs w:val="20"/>
+              </w:rPr>
+              <w:t>endfor</w:t>
+            </w:r>
+            <w:proofErr w:type="spellEnd"/>
+            <w:r>
+              <w:rPr>
+                <w:sz w:val="18"/>
+                <w:szCs w:val="20"/>
+              </w:rPr>
+              <w:t xml:space="preserve"> %}</w:t>
+            </w:r>
+          </w:p>
+        </w:tc>
+      </w:tr>
+    </w:tbl>
+    <w:p>
+      <w:pPr>
+        <w:rPr>
+          <w:rFonts w:ascii="Arial" w:hAnsi="Arial" w:cs="Arial"/>
+          <w:bCs/>
+          <w:sz w:val="18"/>
+          <w:szCs w:val="18"/>
+          <w:lang w:val="es-419"/>
+        </w:rPr>
+      </w:pPr>
+      <w:r>
+        <w:rPr>
+          <w:rFonts w:ascii="Arial" w:hAnsi="Arial" w:cs="Arial"/>
+          <w:bCs/>
+          <w:sz w:val="18"/>
+          <w:szCs w:val="18"/>
+          <w:lang w:val="es-419"/>
+        </w:rPr>
+        <w:t xml:space="preserve">{% </w:t>
+      </w:r>
+      <w:proofErr w:type="spellStart"/>
+      <w:r>
+        <w:rPr>
+          <w:rFonts w:ascii="Arial" w:hAnsi="Arial" w:cs="Arial"/>
+          <w:bCs/>
+          <w:sz w:val="18"/>
+          <w:szCs w:val="18"/>
+          <w:lang w:val="es-419"/>
+        </w:rPr>
+        <w:t>endfor</w:t>
+      </w:r>
+      <w:proofErr w:type="spellEnd"/>
+      <w:r>
+        <w:rPr>
+          <w:rFonts w:ascii="Arial" w:hAnsi="Arial" w:cs="Arial"/>
+          <w:bCs/>
+          <w:sz w:val="18"/>
+          <w:szCs w:val="18"/>
+          <w:lang w:val="es-419"/>
+        </w:rPr>
+        <w:t xml:space="preserve"> </w:t>
+      </w:r>
+      <w:proofErr w:type="gramStart"/>
+      <w:r>
+        <w:rPr>
+          <w:rFonts w:ascii="Arial" w:hAnsi="Arial" w:cs="Arial"/>
+          <w:bCs/>
+          <w:sz w:val="18"/>
+          <w:szCs w:val="18"/>
+          <w:lang w:val="es-419"/>
+        </w:rPr>
+        <w:t>%}</w:t>
+      </w:r>
+      <w:r>
+        <w:rPr>
+          <w:rFonts w:ascii="Arial" w:hAnsi="Arial" w:cs="Arial"/>
+          <w:bCs/>
+          <w:sz w:val="18"/>
+          <w:szCs w:val="18"/>
+          <w:lang w:val="es-MX"/>
+        </w:rPr>
+        <w:t>{</w:t>
+      </w:r>
+      <w:proofErr w:type="gramEnd"/>
+      <w:r>
+        <w:rPr>
+          <w:rFonts w:ascii="Arial" w:hAnsi="Arial" w:cs="Arial"/>
+          <w:bCs/>
+          <w:sz w:val="18"/>
+          <w:szCs w:val="18"/>
+          <w:lang w:val="es-MX"/>
+        </w:rPr>
+        <w:t xml:space="preserve">% </w:t>
+      </w:r>
+      <w:proofErr w:type="spellStart"/>
+      <w:r>
+        <w:rPr>
+          <w:rFonts w:ascii="Arial" w:hAnsi="Arial" w:cs="Arial"/>
+          <w:bCs/>
+          <w:sz w:val="18"/>
+          <w:szCs w:val="18"/>
+          <w:lang w:val="es-MX"/>
+        </w:rPr>
+        <w:t>if</w:t>
+      </w:r>
+      <w:proofErr w:type="spellEnd"/>
+      <w:r>
+        <w:rPr>
+          <w:rFonts w:ascii="Arial" w:hAnsi="Arial" w:cs="Arial"/>
+          <w:bCs/>
+          <w:sz w:val="18"/>
+          <w:szCs w:val="18"/>
+          <w:lang w:val="es-MX"/>
+        </w:rPr>
+        <w:t xml:space="preserve"> </w:t>
+      </w:r>
+      <w:proofErr w:type="spellStart"/>
+      <w:r>
+        <w:rPr>
+          <w:rFonts w:ascii="Arial" w:hAnsi="Arial" w:cs="Arial"/>
+          <w:bCs/>
+          <w:sz w:val="18"/>
+          <w:szCs w:val="18"/>
+          <w:lang w:val="es-MX"/>
+        </w:rPr>
+        <w:t>ajuste_puesto_liderazgo</w:t>
+      </w:r>
+      <w:proofErr w:type="spellEnd"/>
+      <w:r>
+        <w:rPr>
+          <w:rFonts w:ascii="Arial" w:hAnsi="Arial" w:cs="Arial"/>
+          <w:bCs/>
+          <w:sz w:val="18"/>
+          <w:szCs w:val="18"/>
+          <w:lang w:val="es-MX"/>
+        </w:rPr>
+        <w:t xml:space="preserve"> and </w:t>
+      </w:r>
+      <w:proofErr w:type="spellStart"/>
+      <w:r>
+        <w:rPr>
+          <w:rFonts w:ascii="Arial" w:hAnsi="Arial" w:cs="Arial"/>
+          <w:bCs/>
+          <w:sz w:val="18"/>
+          <w:szCs w:val="18"/>
+          <w:lang w:val="es-MX"/>
+        </w:rPr>
+        <w:t>ajuste_puesto_</w:t>
+      </w:r>
+      <w:proofErr w:type="gramStart"/>
+      <w:r>
+        <w:rPr>
+          <w:rFonts w:ascii="Arial" w:hAnsi="Arial" w:cs="Arial"/>
+          <w:bCs/>
+          <w:sz w:val="18"/>
+          <w:szCs w:val="18"/>
+          <w:lang w:val="es-MX"/>
+        </w:rPr>
+        <w:t>liderazgo.puesto</w:t>
+      </w:r>
+      <w:proofErr w:type="spellEnd"/>
+      <w:proofErr w:type="gramEnd"/>
+      <w:r>
+        <w:rPr>
+          <w:rFonts w:ascii="Arial" w:hAnsi="Arial" w:cs="Arial"/>
+          <w:bCs/>
+          <w:sz w:val="18"/>
+          <w:szCs w:val="18"/>
+          <w:lang w:val="es-MX"/>
         </w:rPr>
         <w:t xml:space="preserve"> %}</w:t>
       </w:r>
@@ -353,6 +1202,7 @@
                 <w:lang w:val="es-MX"/>
               </w:rPr>
             </w:pPr>
+            <w:proofErr w:type="gramStart"/>
             <w:r>
               <w:rPr>
                 <w:rFonts w:ascii="Arial" w:hAnsi="Arial" w:cs="Arial"/>
@@ -370,9 +1220,30 @@
                 <w:szCs w:val="18"/>
                 <w:lang w:val="es-MX"/>
               </w:rPr>
-              <w:t>exp.empresa</w:t>
+              <w:t>ajuste</w:t>
+            </w:r>
+            <w:proofErr w:type="gramEnd"/>
+            <w:r>
+              <w:rPr>
+                <w:rFonts w:ascii="Arial" w:hAnsi="Arial" w:cs="Arial"/>
+                <w:sz w:val="18"/>
+                <w:szCs w:val="18"/>
+                <w:lang w:val="es-MX"/>
+              </w:rPr>
+              <w:t>_puesto_</w:t>
+            </w:r>
+            <w:proofErr w:type="gramStart"/>
+            <w:r>
+              <w:rPr>
+                <w:rFonts w:ascii="Arial" w:hAnsi="Arial" w:cs="Arial"/>
+                <w:sz w:val="18"/>
+                <w:szCs w:val="18"/>
+                <w:lang w:val="es-MX"/>
+              </w:rPr>
+              <w:t>liderazgo.empresa</w:t>
             </w:r>
             <w:proofErr w:type="spellEnd"/>
+            <w:proofErr w:type="gramEnd"/>
             <w:r>
               <w:rPr>
                 <w:rFonts w:ascii="Arial" w:hAnsi="Arial" w:cs="Arial"/>
@@ -419,6 +1290,7 @@
                 <w:lang w:val="es-MX"/>
               </w:rPr>
             </w:pPr>
+            <w:proofErr w:type="gramStart"/>
             <w:r>
               <w:rPr>
                 <w:rFonts w:ascii="Arial" w:hAnsi="Arial" w:cs="Arial"/>
@@ -436,9 +1308,30 @@
                 <w:szCs w:val="18"/>
                 <w:lang w:val="es-MX"/>
               </w:rPr>
-              <w:t>exp.puesto</w:t>
+              <w:t>ajuste</w:t>
+            </w:r>
+            <w:proofErr w:type="gramEnd"/>
+            <w:r>
+              <w:rPr>
+                <w:rFonts w:ascii="Arial" w:hAnsi="Arial" w:cs="Arial"/>
+                <w:sz w:val="18"/>
+                <w:szCs w:val="18"/>
+                <w:lang w:val="es-MX"/>
+              </w:rPr>
+              <w:t>_puesto_</w:t>
+            </w:r>
+            <w:proofErr w:type="gramStart"/>
+            <w:r>
+              <w:rPr>
+                <w:rFonts w:ascii="Arial" w:hAnsi="Arial" w:cs="Arial"/>
+                <w:sz w:val="18"/>
+                <w:szCs w:val="18"/>
+                <w:lang w:val="es-MX"/>
+              </w:rPr>
+              <w:t>liderazgo.puesto</w:t>
             </w:r>
             <w:proofErr w:type="spellEnd"/>
+            <w:proofErr w:type="gramEnd"/>
             <w:r>
               <w:rPr>
                 <w:rFonts w:ascii="Arial" w:hAnsi="Arial" w:cs="Arial"/>
@@ -485,6 +1378,7 @@
                 <w:lang w:val="es-MX"/>
               </w:rPr>
             </w:pPr>
+            <w:proofErr w:type="gramStart"/>
             <w:r>
               <w:rPr>
                 <w:rFonts w:ascii="Arial" w:hAnsi="Arial" w:cs="Arial"/>
@@ -502,7 +1396,46 @@
                 <w:szCs w:val="18"/>
                 <w:lang w:val="es-MX"/>
               </w:rPr>
-              <w:t>exp.fecha_inicio</w:t>
+              <w:t>ajuste</w:t>
+            </w:r>
+            <w:proofErr w:type="gramEnd"/>
+            <w:r>
+              <w:rPr>
+                <w:rFonts w:ascii="Arial" w:hAnsi="Arial" w:cs="Arial"/>
+                <w:sz w:val="18"/>
+                <w:szCs w:val="18"/>
+                <w:lang w:val="es-MX"/>
+              </w:rPr>
+              <w:t>_puesto_</w:t>
+            </w:r>
+            <w:proofErr w:type="gramStart"/>
+            <w:r>
+              <w:rPr>
+                <w:rFonts w:ascii="Arial" w:hAnsi="Arial" w:cs="Arial"/>
+                <w:sz w:val="18"/>
+                <w:szCs w:val="18"/>
+                <w:lang w:val="es-MX"/>
+              </w:rPr>
+              <w:t>liderazgo.</w:t>
+            </w:r>
+            <w:r>
+              <w:rPr>
+                <w:rFonts w:ascii="Arial" w:hAnsi="Arial" w:cs="Arial"/>
+                <w:sz w:val="18"/>
+                <w:szCs w:val="18"/>
+                <w:lang w:val="es-MX"/>
+              </w:rPr>
+              <w:t>fecha</w:t>
+            </w:r>
+            <w:proofErr w:type="gramEnd"/>
+            <w:r>
+              <w:rPr>
+                <w:rFonts w:ascii="Arial" w:hAnsi="Arial" w:cs="Arial"/>
+                <w:sz w:val="18"/>
+                <w:szCs w:val="18"/>
+                <w:lang w:val="es-MX"/>
+              </w:rPr>
+              <w:t>_inicio</w:t>
             </w:r>
             <w:proofErr w:type="spellEnd"/>
             <w:r>
@@ -547,6 +1480,7 @@
                 <w:lang w:val="es-MX"/>
               </w:rPr>
             </w:pPr>
+            <w:proofErr w:type="gramStart"/>
             <w:r>
               <w:rPr>
                 <w:rFonts w:ascii="Arial" w:hAnsi="Arial" w:cs="Arial"/>
@@ -564,568 +1498,46 @@
                 <w:szCs w:val="18"/>
                 <w:lang w:val="es-MX"/>
               </w:rPr>
-              <w:t>exp.fecha_fin</w:t>
-            </w:r>
-            <w:proofErr w:type="spellEnd"/>
-            <w:r>
-              <w:rPr>
-                <w:rFonts w:ascii="Arial" w:hAnsi="Arial" w:cs="Arial"/>
-                <w:sz w:val="18"/>
-                <w:szCs w:val="18"/>
-                <w:lang w:val="es-MX"/>
-              </w:rPr>
-              <w:t xml:space="preserve"> }}</w:t>
-            </w:r>
-          </w:p>
-        </w:tc>
-      </w:tr>
-    </w:tbl>
-    <w:p>
-      <w:pPr>
-        <w:rPr>
-          <w:rFonts w:ascii="Arial" w:hAnsi="Arial" w:cs="Arial"/>
-          <w:bCs/>
-          <w:sz w:val="18"/>
-          <w:szCs w:val="18"/>
-          <w:lang w:val="en-US"/>
-        </w:rPr>
-      </w:pPr>
-    </w:p>
-    <w:tbl>
-      <w:tblPr>
-        <w:tblW w:w="0" w:type="auto"/>
-        <w:tblInd w:w="-75" w:type="dxa"/>
-        <w:tblBorders>
-          <w:top w:val="single" w:sz="4" w:space="0" w:color="auto"/>
-          <w:left w:val="single" w:sz="4" w:space="0" w:color="auto"/>
-          <w:bottom w:val="single" w:sz="4" w:space="0" w:color="auto"/>
-          <w:right w:val="single" w:sz="4" w:space="0" w:color="auto"/>
-          <w:insideH w:val="single" w:sz="4" w:space="0" w:color="auto"/>
-          <w:insideV w:val="single" w:sz="4" w:space="0" w:color="auto"/>
-        </w:tblBorders>
-        <w:tblLayout w:type="fixed"/>
-        <w:tblCellMar>
-          <w:left w:w="105" w:type="dxa"/>
-          <w:right w:w="105" w:type="dxa"/>
-        </w:tblCellMar>
-        <w:tblLook w:val="0000" w:firstRow="0" w:lastRow="0" w:firstColumn="0" w:lastColumn="0" w:noHBand="0" w:noVBand="0"/>
-      </w:tblPr>
-      <w:tblGrid>
-        <w:gridCol w:w="2070"/>
-        <w:gridCol w:w="7821"/>
-      </w:tblGrid>
-      <w:tr>
-        <w:tc>
-          <w:tcPr>
-            <w:tcW w:w="2070" w:type="dxa"/>
-          </w:tcPr>
-          <w:p>
-            <w:pPr>
-              <w:rPr>
-                <w:rFonts w:ascii="Arial" w:hAnsi="Arial" w:cs="Arial"/>
-                <w:b/>
-                <w:bCs/>
-                <w:sz w:val="18"/>
-                <w:szCs w:val="18"/>
-              </w:rPr>
-            </w:pPr>
-            <w:r>
-              <w:rPr>
-                <w:rFonts w:ascii="Arial" w:hAnsi="Arial" w:cs="Arial"/>
-                <w:b/>
-                <w:bCs/>
-                <w:sz w:val="18"/>
-                <w:szCs w:val="18"/>
-                <w:lang w:val="es-MX"/>
-              </w:rPr>
-              <w:t>Actividades Principales</w:t>
-            </w:r>
-          </w:p>
-        </w:tc>
-        <w:tc>
-          <w:tcPr>
-            <w:tcW w:w="7821" w:type="dxa"/>
-          </w:tcPr>
-          <w:p>
-            <w:pPr>
-              <w:pStyle w:val="NoSpacing"/>
-              <w:ind w:left="0"/>
-              <w:jc w:val="both"/>
-              <w:rPr>
-                <w:sz w:val="18"/>
-                <w:szCs w:val="20"/>
-              </w:rPr>
-            </w:pPr>
-            <w:r>
-              <w:rPr>
-                <w:sz w:val="18"/>
-                <w:szCs w:val="20"/>
-              </w:rPr>
-              <w:t xml:space="preserve">{% for act in </w:t>
-            </w:r>
-            <w:proofErr w:type="spellStart"/>
-            <w:r>
-              <w:rPr>
-                <w:sz w:val="18"/>
-                <w:szCs w:val="20"/>
-              </w:rPr>
-              <w:t>exp.actividades</w:t>
-            </w:r>
-            <w:proofErr w:type="spellEnd"/>
-            <w:r>
-              <w:rPr>
-                <w:sz w:val="18"/>
-                <w:szCs w:val="20"/>
-              </w:rPr>
-              <w:t xml:space="preserve"> %}• {{ act }}</w:t>
-            </w:r>
-          </w:p>
-          <w:p>
-            <w:pPr>
-              <w:pStyle w:val="NoSpacing"/>
-              <w:ind w:left="0"/>
-              <w:jc w:val="both"/>
-              <w:rPr>
-                <w:szCs w:val="22"/>
-              </w:rPr>
-            </w:pPr>
-            <w:r>
-              <w:rPr>
-                <w:sz w:val="18"/>
-                <w:szCs w:val="20"/>
-              </w:rPr>
-              <w:t xml:space="preserve">{% </w:t>
-            </w:r>
-            <w:proofErr w:type="spellStart"/>
-            <w:r>
-              <w:rPr>
-                <w:sz w:val="18"/>
-                <w:szCs w:val="20"/>
-              </w:rPr>
-              <w:t>endfor</w:t>
-            </w:r>
-            <w:proofErr w:type="spellEnd"/>
-            <w:r>
-              <w:rPr>
-                <w:sz w:val="18"/>
-                <w:szCs w:val="20"/>
-              </w:rPr>
-              <w:t xml:space="preserve"> %}</w:t>
-            </w:r>
-          </w:p>
-        </w:tc>
-      </w:tr>
-    </w:tbl>
-    <w:p>
-      <w:pPr>
-        <w:rPr>
-          <w:rFonts w:ascii="Arial" w:hAnsi="Arial" w:cs="Arial"/>
-          <w:bCs/>
-          <w:sz w:val="18"/>
-          <w:szCs w:val="18"/>
-          <w:lang w:val="es-419"/>
-        </w:rPr>
-      </w:pPr>
-      <w:r>
-        <w:rPr>
-          <w:rFonts w:ascii="Arial" w:hAnsi="Arial" w:cs="Arial"/>
-          <w:bCs/>
-          <w:sz w:val="18"/>
-          <w:szCs w:val="18"/>
-          <w:lang w:val="es-419"/>
-        </w:rPr>
-        <w:t xml:space="preserve">{% </w:t>
-      </w:r>
-      <w:proofErr w:type="spellStart"/>
-      <w:r>
-        <w:rPr>
-          <w:rFonts w:ascii="Arial" w:hAnsi="Arial" w:cs="Arial"/>
-          <w:bCs/>
-          <w:sz w:val="18"/>
-          <w:szCs w:val="18"/>
-          <w:lang w:val="es-419"/>
-        </w:rPr>
-        <w:t>endfor</w:t>
-      </w:r>
-      <w:proofErr w:type="spellEnd"/>
-      <w:r>
-        <w:rPr>
-          <w:rFonts w:ascii="Arial" w:hAnsi="Arial" w:cs="Arial"/>
-          <w:bCs/>
-          <w:sz w:val="18"/>
-          <w:szCs w:val="18"/>
-          <w:lang w:val="es-419"/>
-        </w:rPr>
-        <w:t xml:space="preserve"> %}</w:t>
-      </w:r>
-      <w:r>
-        <w:rPr>
-          <w:rFonts w:ascii="Arial" w:hAnsi="Arial" w:cs="Arial"/>
-          <w:bCs/>
-          <w:sz w:val="18"/>
-          <w:szCs w:val="18"/>
-          <w:lang w:val="es-MX"/>
-        </w:rPr>
-        <w:t xml:space="preserve">{% </w:t>
-      </w:r>
-      <w:proofErr w:type="spellStart"/>
-      <w:r>
-        <w:rPr>
-          <w:rFonts w:ascii="Arial" w:hAnsi="Arial" w:cs="Arial"/>
-          <w:bCs/>
-          <w:sz w:val="18"/>
-          <w:szCs w:val="18"/>
-          <w:lang w:val="es-MX"/>
-        </w:rPr>
-        <w:t>if</w:t>
-      </w:r>
-      <w:proofErr w:type="spellEnd"/>
-      <w:r>
-        <w:rPr>
-          <w:rFonts w:ascii="Arial" w:hAnsi="Arial" w:cs="Arial"/>
-          <w:bCs/>
-          <w:sz w:val="18"/>
-          <w:szCs w:val="18"/>
-          <w:lang w:val="es-MX"/>
-        </w:rPr>
-        <w:t xml:space="preserve"> </w:t>
-      </w:r>
-      <w:proofErr w:type="spellStart"/>
-      <w:r>
-        <w:rPr>
-          <w:rFonts w:ascii="Arial" w:hAnsi="Arial" w:cs="Arial"/>
-          <w:bCs/>
-          <w:sz w:val="18"/>
-          <w:szCs w:val="18"/>
-          <w:lang w:val="es-MX"/>
-        </w:rPr>
-        <w:t>ajuste_puesto_liderazgo</w:t>
-      </w:r>
-      <w:proofErr w:type="spellEnd"/>
-      <w:r>
-        <w:rPr>
-          <w:rFonts w:ascii="Arial" w:hAnsi="Arial" w:cs="Arial"/>
-          <w:bCs/>
-          <w:sz w:val="18"/>
-          <w:szCs w:val="18"/>
-          <w:lang w:val="es-MX"/>
-        </w:rPr>
-        <w:t xml:space="preserve"> and </w:t>
-      </w:r>
-      <w:proofErr w:type="spellStart"/>
-      <w:r>
-        <w:rPr>
-          <w:rFonts w:ascii="Arial" w:hAnsi="Arial" w:cs="Arial"/>
-          <w:bCs/>
-          <w:sz w:val="18"/>
-          <w:szCs w:val="18"/>
-          <w:lang w:val="es-MX"/>
-        </w:rPr>
-        <w:t>ajuste_puesto_liderazgo.puesto</w:t>
-      </w:r>
-      <w:proofErr w:type="spellEnd"/>
-      <w:r>
-        <w:rPr>
-          <w:rFonts w:ascii="Arial" w:hAnsi="Arial" w:cs="Arial"/>
-          <w:bCs/>
-          <w:sz w:val="18"/>
-          <w:szCs w:val="18"/>
-          <w:lang w:val="es-MX"/>
-        </w:rPr>
-        <w:t xml:space="preserve"> %}</w:t>
-      </w:r>
-    </w:p>
-    <w:tbl>
-      <w:tblPr>
-        <w:tblW w:w="0" w:type="auto"/>
-        <w:tblInd w:w="-75" w:type="dxa"/>
-        <w:tblBorders>
-          <w:top w:val="single" w:sz="4" w:space="0" w:color="auto"/>
-          <w:left w:val="single" w:sz="4" w:space="0" w:color="auto"/>
-          <w:bottom w:val="single" w:sz="4" w:space="0" w:color="auto"/>
-          <w:right w:val="single" w:sz="4" w:space="0" w:color="auto"/>
-          <w:insideH w:val="single" w:sz="4" w:space="0" w:color="auto"/>
-          <w:insideV w:val="single" w:sz="4" w:space="0" w:color="auto"/>
-        </w:tblBorders>
-        <w:tblLayout w:type="fixed"/>
-        <w:tblCellMar>
-          <w:left w:w="105" w:type="dxa"/>
-          <w:right w:w="105" w:type="dxa"/>
-        </w:tblCellMar>
-        <w:tblLook w:val="0000" w:firstRow="0" w:lastRow="0" w:firstColumn="0" w:lastColumn="0" w:noHBand="0" w:noVBand="0"/>
-      </w:tblPr>
-      <w:tblGrid>
-        <w:gridCol w:w="2472"/>
-        <w:gridCol w:w="2472"/>
-        <w:gridCol w:w="2472"/>
-        <w:gridCol w:w="2475"/>
-      </w:tblGrid>
-      <w:tr>
-        <w:tc>
-          <w:tcPr>
-            <w:tcW w:w="2472" w:type="dxa"/>
-          </w:tcPr>
-          <w:p>
-            <w:pPr>
-              <w:rPr>
-                <w:rFonts w:ascii="Arial" w:hAnsi="Arial" w:cs="Arial"/>
-                <w:b/>
-                <w:sz w:val="18"/>
-                <w:szCs w:val="18"/>
-                <w:lang w:val="es-MX"/>
-              </w:rPr>
-            </w:pPr>
-            <w:r>
-              <w:rPr>
-                <w:rFonts w:ascii="Arial" w:hAnsi="Arial" w:cs="Arial"/>
-                <w:b/>
-                <w:sz w:val="18"/>
-                <w:szCs w:val="18"/>
-                <w:lang w:val="es-MX"/>
-              </w:rPr>
-              <w:t>Empresa</w:t>
-            </w:r>
-          </w:p>
-          <w:p>
-            <w:pPr>
-              <w:rPr>
-                <w:rFonts w:ascii="Arial" w:hAnsi="Arial" w:cs="Arial"/>
-                <w:color w:val="0070C0"/>
-                <w:sz w:val="18"/>
-                <w:szCs w:val="18"/>
-                <w:lang w:val="es-MX"/>
-              </w:rPr>
-            </w:pPr>
-            <w:r>
-              <w:rPr>
-                <w:rFonts w:ascii="Arial" w:hAnsi="Arial" w:cs="Arial"/>
-                <w:sz w:val="18"/>
-                <w:szCs w:val="18"/>
-                <w:lang w:val="es-MX"/>
-              </w:rPr>
-              <w:t xml:space="preserve">{{ </w:t>
-            </w:r>
-            <w:proofErr w:type="spellStart"/>
-            <w:r>
-              <w:rPr>
-                <w:rFonts w:ascii="Arial" w:hAnsi="Arial" w:cs="Arial"/>
-                <w:sz w:val="18"/>
-                <w:szCs w:val="18"/>
-                <w:lang w:val="es-MX"/>
-              </w:rPr>
-              <w:t>ajuste_puesto_liderazgo.empresa</w:t>
-            </w:r>
-            <w:proofErr w:type="spellEnd"/>
-            <w:r>
-              <w:rPr>
-                <w:rFonts w:ascii="Arial" w:hAnsi="Arial" w:cs="Arial"/>
-                <w:sz w:val="18"/>
-                <w:szCs w:val="18"/>
-                <w:lang w:val="es-MX"/>
-              </w:rPr>
-              <w:t xml:space="preserve"> }}</w:t>
-            </w:r>
-          </w:p>
-        </w:tc>
-        <w:tc>
-          <w:tcPr>
-            <w:tcW w:w="2472" w:type="dxa"/>
-          </w:tcPr>
-          <w:p>
-            <w:pPr>
-              <w:rPr>
-                <w:rFonts w:ascii="Arial" w:hAnsi="Arial" w:cs="Arial"/>
-                <w:b/>
-                <w:sz w:val="18"/>
-                <w:szCs w:val="18"/>
-                <w:lang w:val="es-MX"/>
-              </w:rPr>
-            </w:pPr>
-            <w:r>
-              <w:rPr>
-                <w:rFonts w:ascii="Arial" w:hAnsi="Arial" w:cs="Arial"/>
-                <w:b/>
-                <w:sz w:val="18"/>
-                <w:szCs w:val="18"/>
-                <w:lang w:val="es-MX"/>
-              </w:rPr>
-              <w:t>Puesto</w:t>
-            </w:r>
-          </w:p>
-          <w:p>
-            <w:pPr>
-              <w:rPr>
-                <w:rFonts w:ascii="Arial" w:hAnsi="Arial" w:cs="Arial"/>
-                <w:bCs/>
-                <w:sz w:val="18"/>
-                <w:szCs w:val="18"/>
-                <w:lang w:val="es-MX"/>
-              </w:rPr>
-            </w:pPr>
-            <w:r>
-              <w:rPr>
-                <w:rFonts w:ascii="Arial" w:hAnsi="Arial" w:cs="Arial"/>
-                <w:sz w:val="18"/>
-                <w:szCs w:val="18"/>
-                <w:lang w:val="es-MX"/>
-              </w:rPr>
-              <w:t xml:space="preserve">{{ </w:t>
-            </w:r>
-            <w:proofErr w:type="spellStart"/>
-            <w:r>
-              <w:rPr>
-                <w:rFonts w:ascii="Arial" w:hAnsi="Arial" w:cs="Arial"/>
-                <w:sz w:val="18"/>
-                <w:szCs w:val="18"/>
-                <w:lang w:val="es-MX"/>
-              </w:rPr>
-              <w:t>ajuste_puesto_liderazgo.puesto</w:t>
-            </w:r>
-            <w:proofErr w:type="spellEnd"/>
-            <w:r>
-              <w:rPr>
-                <w:rFonts w:ascii="Arial" w:hAnsi="Arial" w:cs="Arial"/>
-                <w:sz w:val="18"/>
-                <w:szCs w:val="18"/>
-                <w:lang w:val="es-MX"/>
-              </w:rPr>
-              <w:t xml:space="preserve"> }}</w:t>
-            </w:r>
-          </w:p>
-        </w:tc>
-        <w:tc>
-          <w:tcPr>
-            <w:tcW w:w="2472" w:type="dxa"/>
-          </w:tcPr>
-          <w:p>
-            <w:pPr>
-              <w:rPr>
-                <w:rFonts w:ascii="Arial" w:hAnsi="Arial" w:cs="Arial"/>
-                <w:b/>
-                <w:sz w:val="18"/>
-                <w:szCs w:val="18"/>
-                <w:lang w:val="es-MX"/>
-              </w:rPr>
-            </w:pPr>
-            <w:r>
-              <w:rPr>
-                <w:rFonts w:ascii="Arial" w:hAnsi="Arial" w:cs="Arial"/>
-                <w:b/>
-                <w:sz w:val="18"/>
-                <w:szCs w:val="18"/>
-                <w:lang w:val="es-MX"/>
-              </w:rPr>
-              <w:t>Desde:</w:t>
-            </w:r>
-          </w:p>
-          <w:p>
-            <w:pPr>
-              <w:rPr>
-                <w:rFonts w:ascii="Arial" w:hAnsi="Arial" w:cs="Arial"/>
-                <w:bCs/>
-                <w:sz w:val="18"/>
-                <w:szCs w:val="18"/>
-                <w:lang w:val="es-MX"/>
-              </w:rPr>
-            </w:pPr>
-            <w:r>
-              <w:rPr>
-                <w:rFonts w:ascii="Arial" w:hAnsi="Arial" w:cs="Arial"/>
-                <w:sz w:val="18"/>
-                <w:szCs w:val="18"/>
-                <w:lang w:val="es-MX"/>
-              </w:rPr>
-              <w:t xml:space="preserve">{{ </w:t>
-            </w:r>
-            <w:proofErr w:type="spellStart"/>
-            <w:r>
-              <w:rPr>
-                <w:rFonts w:ascii="Arial" w:hAnsi="Arial" w:cs="Arial"/>
-                <w:sz w:val="18"/>
-                <w:szCs w:val="18"/>
-                <w:lang w:val="es-MX"/>
-              </w:rPr>
-              <w:t>ajuste_puesto_liderazgo.</w:t>
-            </w:r>
-            <w:r>
-              <w:rPr>
-                <w:rFonts w:ascii="Arial" w:hAnsi="Arial" w:cs="Arial"/>
-                <w:sz w:val="18"/>
-                <w:szCs w:val="18"/>
-                <w:lang w:val="es-MX"/>
-              </w:rPr>
-              <w:t>fecha_inicio</w:t>
-            </w:r>
-            <w:proofErr w:type="spellEnd"/>
-            <w:r>
-              <w:rPr>
-                <w:rFonts w:ascii="Arial" w:hAnsi="Arial" w:cs="Arial"/>
-                <w:sz w:val="18"/>
-                <w:szCs w:val="18"/>
-                <w:lang w:val="es-MX"/>
-              </w:rPr>
-              <w:t xml:space="preserve"> }}</w:t>
-            </w:r>
-          </w:p>
-        </w:tc>
-        <w:tc>
-          <w:tcPr>
-            <w:tcW w:w="2475" w:type="dxa"/>
-          </w:tcPr>
-          <w:p>
-            <w:pPr>
-              <w:pStyle w:val="Heading2"/>
-              <w:rPr>
-                <w:bCs w:val="0"/>
-                <w:szCs w:val="18"/>
-                <w:lang w:val="es-MX"/>
-              </w:rPr>
-            </w:pPr>
-            <w:r>
-              <w:rPr>
-                <w:bCs w:val="0"/>
-                <w:szCs w:val="18"/>
-                <w:lang w:val="es-MX"/>
-              </w:rPr>
-              <w:t xml:space="preserve">Hasta: </w:t>
-            </w:r>
-          </w:p>
-          <w:p>
-            <w:pPr>
-              <w:rPr>
-                <w:rFonts w:ascii="Arial" w:hAnsi="Arial" w:cs="Arial"/>
-                <w:sz w:val="18"/>
-                <w:szCs w:val="18"/>
-                <w:lang w:val="es-MX"/>
-              </w:rPr>
-            </w:pPr>
-            <w:r>
-              <w:rPr>
-                <w:rFonts w:ascii="Arial" w:hAnsi="Arial" w:cs="Arial"/>
-                <w:sz w:val="18"/>
-                <w:szCs w:val="18"/>
-                <w:lang w:val="es-MX"/>
-              </w:rPr>
-              <w:t xml:space="preserve">{{ </w:t>
-            </w:r>
-            <w:proofErr w:type="spellStart"/>
-            <w:r>
-              <w:rPr>
-                <w:rFonts w:ascii="Arial" w:hAnsi="Arial" w:cs="Arial"/>
-                <w:sz w:val="18"/>
-                <w:szCs w:val="18"/>
-                <w:lang w:val="es-MX"/>
-              </w:rPr>
-              <w:t>ajuste_puesto_liderazgo.</w:t>
-            </w:r>
-            <w:r>
-              <w:rPr>
-                <w:rFonts w:ascii="Arial" w:hAnsi="Arial" w:cs="Arial"/>
-                <w:sz w:val="18"/>
-                <w:szCs w:val="18"/>
-                <w:lang w:val="es-MX"/>
-              </w:rPr>
-              <w:t>fecha_fin</w:t>
+              <w:t>ajuste</w:t>
+            </w:r>
+            <w:proofErr w:type="gramEnd"/>
+            <w:r>
+              <w:rPr>
+                <w:rFonts w:ascii="Arial" w:hAnsi="Arial" w:cs="Arial"/>
+                <w:sz w:val="18"/>
+                <w:szCs w:val="18"/>
+                <w:lang w:val="es-MX"/>
+              </w:rPr>
+              <w:t>_puesto_</w:t>
+            </w:r>
+            <w:proofErr w:type="gramStart"/>
+            <w:r>
+              <w:rPr>
+                <w:rFonts w:ascii="Arial" w:hAnsi="Arial" w:cs="Arial"/>
+                <w:sz w:val="18"/>
+                <w:szCs w:val="18"/>
+                <w:lang w:val="es-MX"/>
+              </w:rPr>
+              <w:t>liderazgo.</w:t>
+            </w:r>
+            <w:r>
+              <w:rPr>
+                <w:rFonts w:ascii="Arial" w:hAnsi="Arial" w:cs="Arial"/>
+                <w:sz w:val="18"/>
+                <w:szCs w:val="18"/>
+                <w:lang w:val="es-MX"/>
+              </w:rPr>
+              <w:t>fecha</w:t>
+            </w:r>
+            <w:proofErr w:type="gramEnd"/>
+            <w:r>
+              <w:rPr>
+                <w:rFonts w:ascii="Arial" w:hAnsi="Arial" w:cs="Arial"/>
+                <w:sz w:val="18"/>
+                <w:szCs w:val="18"/>
+                <w:lang w:val="es-MX"/>
+              </w:rPr>
+              <w:t>_fin</w:t>
             </w:r>
             <w:proofErr w:type="spellEnd"/>
             <w:r>
@@ -1230,22 +1642,63 @@
                 <w:sz w:val="18"/>
                 <w:szCs w:val="20"/>
               </w:rPr>
-              <w:t>ajuste_puesto_liderazgo.actividades</w:t>
+              <w:t>ajuste_puesto_</w:t>
+            </w:r>
+            <w:proofErr w:type="gramStart"/>
+            <w:r>
+              <w:rPr>
+                <w:sz w:val="18"/>
+                <w:szCs w:val="20"/>
+              </w:rPr>
+              <w:t>liderazgo.actividades</w:t>
             </w:r>
             <w:proofErr w:type="spellEnd"/>
+            <w:proofErr w:type="gramEnd"/>
             <w:r>
               <w:rPr>
                 <w:sz w:val="18"/>
                 <w:szCs w:val="20"/>
               </w:rPr>
-              <w:t xml:space="preserve"> %}</w:t>
-            </w:r>
+              <w:t xml:space="preserve"> </w:t>
+            </w:r>
+            <w:proofErr w:type="gramStart"/>
             <w:r>
               <w:rPr>
                 <w:sz w:val="18"/>
                 <w:szCs w:val="20"/>
               </w:rPr>
-              <w:t>• {{ act }}</w:t>
+              <w:t>%}</w:t>
+            </w:r>
+            <w:r>
+              <w:rPr>
+                <w:sz w:val="18"/>
+                <w:szCs w:val="20"/>
+              </w:rPr>
+              <w:t>•</w:t>
+            </w:r>
+            <w:proofErr w:type="gramEnd"/>
+            <w:r>
+              <w:rPr>
+                <w:sz w:val="18"/>
+                <w:szCs w:val="20"/>
+              </w:rPr>
+              <w:t xml:space="preserve"> </w:t>
+            </w:r>
+            <w:proofErr w:type="gramStart"/>
+            <w:r>
+              <w:rPr>
+                <w:sz w:val="18"/>
+                <w:szCs w:val="20"/>
+              </w:rPr>
+              <w:t>{{ act</w:t>
+            </w:r>
+            <w:proofErr w:type="gramEnd"/>
+            <w:r>
+              <w:rPr>
+                <w:sz w:val="18"/>
+                <w:szCs w:val="20"/>
+              </w:rPr>
+              <w:t xml:space="preserve"> }}</w:t>
             </w:r>
           </w:p>
           <w:p>
@@ -1328,6 +1781,922 @@
     </w:p>
     <w:p>
       <w:pPr>
+        <w:jc w:val="both"/>
+        <w:rPr>
+          <w:rFonts w:ascii="Arial" w:hAnsi="Arial" w:cs="Arial"/>
+          <w:bCs/>
+          <w:sz w:val="18"/>
+          <w:szCs w:val="18"/>
+          <w:lang w:val="en-US"/>
+        </w:rPr>
+      </w:pPr>
+    </w:p>
+    <w:p>
+      <w:pPr>
+        <w:rPr>
+          <w:rFonts w:ascii="Arial" w:hAnsi="Arial" w:cs="Arial"/>
+          <w:b/>
+          <w:sz w:val="18"/>
+          <w:szCs w:val="18"/>
+          <w:u w:val="single"/>
+        </w:rPr>
+      </w:pPr>
+      <w:r>
+        <w:rPr>
+          <w:rFonts w:ascii="Arial" w:hAnsi="Arial" w:cs="Arial"/>
+          <w:b/>
+          <w:sz w:val="18"/>
+          <w:szCs w:val="18"/>
+          <w:u w:val="single"/>
+        </w:rPr>
+        <w:t xml:space="preserve">HERRAMIENTAS </w:t>
+      </w:r>
+      <w:r>
+        <w:rPr>
+          <w:rFonts w:ascii="Arial" w:hAnsi="Arial" w:cs="Arial"/>
+          <w:b/>
+          <w:sz w:val="18"/>
+          <w:szCs w:val="18"/>
+          <w:u w:val="single"/>
+        </w:rPr>
+        <w:t>UTILIZADAS EN EL DESEMPEÑO DE SUS FUNCIONES</w:t>
+      </w:r>
+    </w:p>
+    <w:p>
+      <w:pPr>
+        <w:rPr>
+          <w:rFonts w:ascii="Arial" w:hAnsi="Arial" w:cs="Arial"/>
+          <w:b/>
+          <w:sz w:val="18"/>
+          <w:szCs w:val="18"/>
+          <w:u w:val="single"/>
+        </w:rPr>
+      </w:pPr>
+    </w:p>
+    <w:tbl>
+      <w:tblPr>
+        <w:tblW w:w="0" w:type="auto"/>
+        <w:tblInd w:w="-72" w:type="dxa"/>
+        <w:tblBorders>
+          <w:top w:val="single" w:sz="4" w:space="0" w:color="auto"/>
+          <w:left w:val="single" w:sz="4" w:space="0" w:color="auto"/>
+          <w:bottom w:val="single" w:sz="4" w:space="0" w:color="auto"/>
+          <w:right w:val="single" w:sz="4" w:space="0" w:color="auto"/>
+          <w:insideH w:val="single" w:sz="4" w:space="0" w:color="auto"/>
+          <w:insideV w:val="single" w:sz="4" w:space="0" w:color="auto"/>
+        </w:tblBorders>
+        <w:tblLook w:val="0000" w:firstRow="0" w:lastRow="0" w:firstColumn="0" w:lastColumn="0" w:noHBand="0" w:noVBand="0"/>
+      </w:tblPr>
+      <w:tblGrid>
+        <w:gridCol w:w="9850"/>
+      </w:tblGrid>
+      <w:tr>
+        <w:trPr>
+          <w:trHeight w:val="300"/>
+        </w:trPr>
+        <w:tc>
+          <w:tcPr>
+            <w:tcW w:w="9850" w:type="dxa"/>
+          </w:tcPr>
+          <w:p>
+            <w:pPr>
+              <w:rPr>
+                <w:rFonts w:ascii="Arial" w:hAnsi="Arial" w:cs="Arial"/>
+                <w:sz w:val="18"/>
+                <w:szCs w:val="18"/>
+                <w:lang w:val="en-US"/>
+              </w:rPr>
+            </w:pPr>
+            <w:r>
+              <w:rPr>
+                <w:rFonts w:ascii="Arial" w:hAnsi="Arial" w:cs="Arial"/>
+                <w:bCs/>
+                <w:sz w:val="18"/>
+                <w:szCs w:val="18"/>
+                <w:lang w:val="es-MX"/>
+              </w:rPr>
+              <w:t xml:space="preserve">{% </w:t>
+            </w:r>
+            <w:proofErr w:type="spellStart"/>
+            <w:r>
+              <w:rPr>
+                <w:rFonts w:ascii="Arial" w:hAnsi="Arial" w:cs="Arial"/>
+                <w:bCs/>
+                <w:sz w:val="18"/>
+                <w:szCs w:val="18"/>
+                <w:lang w:val="es-MX"/>
+              </w:rPr>
+              <w:t>if</w:t>
+            </w:r>
+            <w:proofErr w:type="spellEnd"/>
+            <w:r>
+              <w:rPr>
+                <w:rFonts w:ascii="Arial" w:hAnsi="Arial" w:cs="Arial"/>
+                <w:bCs/>
+                <w:sz w:val="18"/>
+                <w:szCs w:val="18"/>
+                <w:lang w:val="es-MX"/>
+              </w:rPr>
+              <w:t xml:space="preserve"> </w:t>
+            </w:r>
+            <w:r>
+              <w:rPr>
+                <w:rFonts w:ascii="Arial" w:hAnsi="Arial" w:cs="Arial"/>
+                <w:bCs/>
+                <w:sz w:val="18"/>
+                <w:szCs w:val="18"/>
+                <w:lang w:val="es-MX"/>
+              </w:rPr>
+              <w:t>certificaciones</w:t>
+            </w:r>
+            <w:r>
+              <w:rPr>
+                <w:rFonts w:ascii="Arial" w:hAnsi="Arial" w:cs="Arial"/>
+                <w:bCs/>
+                <w:sz w:val="18"/>
+                <w:szCs w:val="18"/>
+                <w:lang w:val="es-MX"/>
+              </w:rPr>
+              <w:t xml:space="preserve"> </w:t>
+            </w:r>
+            <w:proofErr w:type="gramStart"/>
+            <w:r>
+              <w:rPr>
+                <w:rFonts w:ascii="Arial" w:hAnsi="Arial" w:cs="Arial"/>
+                <w:bCs/>
+                <w:sz w:val="18"/>
+                <w:szCs w:val="18"/>
+                <w:lang w:val="es-MX"/>
+              </w:rPr>
+              <w:t>%}</w:t>
+            </w:r>
+            <w:r>
+              <w:rPr>
+                <w:rFonts w:ascii="Arial" w:hAnsi="Arial" w:cs="Arial"/>
+                <w:bCs/>
+                <w:sz w:val="18"/>
+                <w:szCs w:val="18"/>
+                <w:lang w:val="en-US"/>
+              </w:rPr>
+              <w:t>{</w:t>
+            </w:r>
+            <w:proofErr w:type="gramEnd"/>
+            <w:r>
+              <w:rPr>
+                <w:rFonts w:ascii="Arial" w:hAnsi="Arial" w:cs="Arial"/>
+                <w:bCs/>
+                <w:sz w:val="18"/>
+                <w:szCs w:val="18"/>
+                <w:lang w:val="en-US"/>
+              </w:rPr>
+              <w:t xml:space="preserve">%tr for cert in </w:t>
+            </w:r>
+            <w:proofErr w:type="spellStart"/>
+            <w:r>
+              <w:rPr>
+                <w:rFonts w:ascii="Arial" w:hAnsi="Arial" w:cs="Arial"/>
+                <w:bCs/>
+                <w:sz w:val="18"/>
+                <w:szCs w:val="18"/>
+                <w:lang w:val="en-US"/>
+              </w:rPr>
+              <w:t>certificaciones</w:t>
+            </w:r>
+            <w:proofErr w:type="spellEnd"/>
+            <w:r>
+              <w:rPr>
+                <w:rFonts w:ascii="Arial" w:hAnsi="Arial" w:cs="Arial"/>
+                <w:bCs/>
+                <w:sz w:val="18"/>
+                <w:szCs w:val="18"/>
+                <w:lang w:val="en-US"/>
+              </w:rPr>
+              <w:t xml:space="preserve"> %}</w:t>
+            </w:r>
+          </w:p>
+        </w:tc>
+      </w:tr>
+      <w:tr>
+        <w:trPr>
+          <w:trHeight w:val="300"/>
+        </w:trPr>
+        <w:tc>
+          <w:tcPr>
+            <w:tcW w:w="9850" w:type="dxa"/>
+          </w:tcPr>
+          <w:p>
+            <w:pPr>
+              <w:rPr>
+                <w:rFonts w:ascii="Arial" w:hAnsi="Arial" w:cs="Arial"/>
+                <w:bCs/>
+                <w:sz w:val="18"/>
+                <w:szCs w:val="18"/>
+                <w:lang w:val="en-US"/>
+              </w:rPr>
+            </w:pPr>
+            <w:r>
+              <w:rPr>
+                <w:rFonts w:ascii="Arial" w:hAnsi="Arial" w:cs="Arial"/>
+                <w:bCs/>
+                <w:sz w:val="18"/>
+                <w:szCs w:val="18"/>
+                <w:lang w:val="es-MX"/>
+              </w:rPr>
+              <w:t xml:space="preserve">- </w:t>
+            </w:r>
+            <w:proofErr w:type="gramStart"/>
+            <w:r>
+              <w:rPr>
+                <w:rFonts w:ascii="Arial" w:hAnsi="Arial" w:cs="Arial"/>
+                <w:bCs/>
+                <w:sz w:val="18"/>
+                <w:szCs w:val="18"/>
+                <w:lang w:val="es-MX"/>
+              </w:rPr>
+              <w:t xml:space="preserve">{{ </w:t>
+            </w:r>
+            <w:proofErr w:type="spellStart"/>
+            <w:r>
+              <w:rPr>
+                <w:rFonts w:ascii="Arial" w:hAnsi="Arial" w:cs="Arial"/>
+                <w:bCs/>
+                <w:sz w:val="18"/>
+                <w:szCs w:val="18"/>
+                <w:lang w:val="es-MX"/>
+              </w:rPr>
+              <w:t>cert</w:t>
+            </w:r>
+            <w:proofErr w:type="gramEnd"/>
+            <w:r>
+              <w:rPr>
+                <w:rFonts w:ascii="Arial" w:hAnsi="Arial" w:cs="Arial"/>
+                <w:bCs/>
+                <w:sz w:val="18"/>
+                <w:szCs w:val="18"/>
+                <w:lang w:val="es-MX"/>
+              </w:rPr>
+              <w:t>.nombre</w:t>
+            </w:r>
+            <w:proofErr w:type="spellEnd"/>
+            <w:r>
+              <w:rPr>
+                <w:rFonts w:ascii="Arial" w:hAnsi="Arial" w:cs="Arial"/>
+                <w:bCs/>
+                <w:sz w:val="18"/>
+                <w:szCs w:val="18"/>
+                <w:lang w:val="es-MX"/>
+              </w:rPr>
+              <w:t xml:space="preserve"> }}</w:t>
+            </w:r>
+          </w:p>
+        </w:tc>
+      </w:tr>
+      <w:tr>
+        <w:trPr>
+          <w:trHeight w:val="300"/>
+        </w:trPr>
+        <w:tc>
+          <w:tcPr>
+            <w:tcW w:w="9850" w:type="dxa"/>
+          </w:tcPr>
+          <w:p>
+            <w:pPr>
+              <w:rPr>
+                <w:rFonts w:ascii="Arial" w:hAnsi="Arial" w:cs="Arial"/>
+                <w:bCs/>
+                <w:sz w:val="18"/>
+                <w:szCs w:val="18"/>
+              </w:rPr>
+            </w:pPr>
+            <w:r>
+              <w:rPr>
+                <w:rFonts w:ascii="Arial" w:hAnsi="Arial" w:cs="Arial"/>
+                <w:sz w:val="18"/>
+                <w:szCs w:val="18"/>
+              </w:rPr>
+              <w:t>{%</w:t>
+            </w:r>
+            <w:proofErr w:type="spellStart"/>
+            <w:r>
+              <w:rPr>
+                <w:rFonts w:ascii="Arial" w:hAnsi="Arial" w:cs="Arial"/>
+                <w:sz w:val="18"/>
+                <w:szCs w:val="18"/>
+              </w:rPr>
+              <w:t>tr</w:t>
+            </w:r>
+            <w:proofErr w:type="spellEnd"/>
+            <w:r>
+              <w:rPr>
+                <w:rFonts w:ascii="Arial" w:hAnsi="Arial" w:cs="Arial"/>
+                <w:sz w:val="18"/>
+                <w:szCs w:val="18"/>
+              </w:rPr>
+              <w:t xml:space="preserve"> </w:t>
+            </w:r>
+            <w:proofErr w:type="spellStart"/>
+            <w:r>
+              <w:rPr>
+                <w:rFonts w:ascii="Arial" w:hAnsi="Arial" w:cs="Arial"/>
+                <w:sz w:val="18"/>
+                <w:szCs w:val="18"/>
+              </w:rPr>
+              <w:t>endfor</w:t>
+            </w:r>
+            <w:proofErr w:type="spellEnd"/>
+            <w:r>
+              <w:rPr>
+                <w:rFonts w:ascii="Arial" w:hAnsi="Arial" w:cs="Arial"/>
+                <w:sz w:val="18"/>
+                <w:szCs w:val="18"/>
+              </w:rPr>
+              <w:t xml:space="preserve"> </w:t>
+            </w:r>
+            <w:proofErr w:type="gramStart"/>
+            <w:r>
+              <w:rPr>
+                <w:rFonts w:ascii="Arial" w:hAnsi="Arial" w:cs="Arial"/>
+                <w:sz w:val="18"/>
+                <w:szCs w:val="18"/>
+              </w:rPr>
+              <w:t>%}</w:t>
+            </w:r>
+            <w:r>
+              <w:rPr>
+                <w:rFonts w:ascii="Arial" w:hAnsi="Arial" w:cs="Arial"/>
+                <w:bCs/>
+                <w:sz w:val="18"/>
+                <w:szCs w:val="18"/>
+              </w:rPr>
+              <w:t>{</w:t>
+            </w:r>
+            <w:proofErr w:type="gramEnd"/>
+            <w:r>
+              <w:rPr>
+                <w:rFonts w:ascii="Arial" w:hAnsi="Arial" w:cs="Arial"/>
+                <w:bCs/>
+                <w:sz w:val="18"/>
+                <w:szCs w:val="18"/>
+              </w:rPr>
+              <w:t xml:space="preserve">% </w:t>
+            </w:r>
+            <w:proofErr w:type="spellStart"/>
+            <w:r>
+              <w:rPr>
+                <w:rFonts w:ascii="Arial" w:hAnsi="Arial" w:cs="Arial"/>
+                <w:bCs/>
+                <w:sz w:val="18"/>
+                <w:szCs w:val="18"/>
+              </w:rPr>
+              <w:t>endif</w:t>
+            </w:r>
+            <w:proofErr w:type="spellEnd"/>
+            <w:r>
+              <w:rPr>
+                <w:rFonts w:ascii="Arial" w:hAnsi="Arial" w:cs="Arial"/>
+                <w:bCs/>
+                <w:sz w:val="18"/>
+                <w:szCs w:val="18"/>
+              </w:rPr>
+              <w:t xml:space="preserve"> </w:t>
+            </w:r>
+            <w:proofErr w:type="gramStart"/>
+            <w:r>
+              <w:rPr>
+                <w:rFonts w:ascii="Arial" w:hAnsi="Arial" w:cs="Arial"/>
+                <w:bCs/>
+                <w:sz w:val="18"/>
+                <w:szCs w:val="18"/>
+              </w:rPr>
+              <w:t>%}{</w:t>
+            </w:r>
+            <w:proofErr w:type="gramEnd"/>
+            <w:r>
+              <w:rPr>
+                <w:rFonts w:ascii="Arial" w:hAnsi="Arial" w:cs="Arial"/>
+                <w:bCs/>
+                <w:sz w:val="18"/>
+                <w:szCs w:val="18"/>
+              </w:rPr>
+              <w:t xml:space="preserve">% </w:t>
+            </w:r>
+            <w:proofErr w:type="spellStart"/>
+            <w:r>
+              <w:rPr>
+                <w:rFonts w:ascii="Arial" w:hAnsi="Arial" w:cs="Arial"/>
+                <w:bCs/>
+                <w:sz w:val="18"/>
+                <w:szCs w:val="18"/>
+              </w:rPr>
+              <w:t>if</w:t>
+            </w:r>
+            <w:proofErr w:type="spellEnd"/>
+            <w:r>
+              <w:rPr>
+                <w:rFonts w:ascii="Arial" w:hAnsi="Arial" w:cs="Arial"/>
+                <w:bCs/>
+                <w:sz w:val="18"/>
+                <w:szCs w:val="18"/>
+              </w:rPr>
+              <w:t xml:space="preserve"> cursos %}</w:t>
+            </w:r>
+          </w:p>
+        </w:tc>
+      </w:tr>
+      <w:tr>
+        <w:trPr>
+          <w:trHeight w:val="300"/>
+        </w:trPr>
+        <w:tc>
+          <w:tcPr>
+            <w:tcW w:w="9850" w:type="dxa"/>
+          </w:tcPr>
+          <w:p>
+            <w:pPr>
+              <w:rPr>
+                <w:rFonts w:ascii="Arial" w:hAnsi="Arial" w:cs="Arial"/>
+                <w:bCs/>
+                <w:sz w:val="18"/>
+                <w:szCs w:val="18"/>
+                <w:lang w:val="en-US"/>
+              </w:rPr>
+            </w:pPr>
+            <w:r>
+              <w:rPr>
+                <w:rFonts w:ascii="Arial" w:hAnsi="Arial" w:cs="Arial"/>
+                <w:bCs/>
+                <w:sz w:val="18"/>
+                <w:szCs w:val="18"/>
+                <w:lang w:val="en-US"/>
+              </w:rPr>
+              <w:t xml:space="preserve">{%tr for cur in </w:t>
+            </w:r>
+            <w:proofErr w:type="spellStart"/>
+            <w:r>
+              <w:rPr>
+                <w:rFonts w:ascii="Arial" w:hAnsi="Arial" w:cs="Arial"/>
+                <w:bCs/>
+                <w:sz w:val="18"/>
+                <w:szCs w:val="18"/>
+                <w:lang w:val="en-US"/>
+              </w:rPr>
+              <w:t>cursos</w:t>
+            </w:r>
+            <w:proofErr w:type="spellEnd"/>
+            <w:r>
+              <w:rPr>
+                <w:rFonts w:ascii="Arial" w:hAnsi="Arial" w:cs="Arial"/>
+                <w:bCs/>
+                <w:sz w:val="18"/>
+                <w:szCs w:val="18"/>
+                <w:lang w:val="en-US"/>
+              </w:rPr>
+              <w:t xml:space="preserve"> %}</w:t>
+            </w:r>
+          </w:p>
+        </w:tc>
+      </w:tr>
+      <w:tr>
+        <w:trPr>
+          <w:trHeight w:val="300"/>
+        </w:trPr>
+        <w:tc>
+          <w:tcPr>
+            <w:tcW w:w="9850" w:type="dxa"/>
+          </w:tcPr>
+          <w:p>
+            <w:pPr>
+              <w:rPr>
+                <w:rFonts w:ascii="Arial" w:hAnsi="Arial" w:cs="Arial"/>
+                <w:bCs/>
+                <w:sz w:val="18"/>
+                <w:szCs w:val="18"/>
+                <w:lang w:val="en-US"/>
+              </w:rPr>
+            </w:pPr>
+            <w:r>
+              <w:rPr>
+                <w:rFonts w:ascii="Arial" w:hAnsi="Arial" w:cs="Arial"/>
+                <w:bCs/>
+                <w:sz w:val="18"/>
+                <w:szCs w:val="18"/>
+                <w:lang w:val="es-MX"/>
+              </w:rPr>
+              <w:t xml:space="preserve">- </w:t>
+            </w:r>
+            <w:proofErr w:type="gramStart"/>
+            <w:r>
+              <w:rPr>
+                <w:rFonts w:ascii="Arial" w:hAnsi="Arial" w:cs="Arial"/>
+                <w:bCs/>
+                <w:sz w:val="18"/>
+                <w:szCs w:val="18"/>
+                <w:lang w:val="es-MX"/>
+              </w:rPr>
+              <w:t xml:space="preserve">{{ </w:t>
+            </w:r>
+            <w:proofErr w:type="spellStart"/>
+            <w:r>
+              <w:rPr>
+                <w:rFonts w:ascii="Arial" w:hAnsi="Arial" w:cs="Arial"/>
+                <w:bCs/>
+                <w:sz w:val="18"/>
+                <w:szCs w:val="18"/>
+                <w:lang w:val="es-MX"/>
+              </w:rPr>
+              <w:t>cur</w:t>
+            </w:r>
+            <w:proofErr w:type="gramEnd"/>
+            <w:r>
+              <w:rPr>
+                <w:rFonts w:ascii="Arial" w:hAnsi="Arial" w:cs="Arial"/>
+                <w:bCs/>
+                <w:sz w:val="18"/>
+                <w:szCs w:val="18"/>
+                <w:lang w:val="es-MX"/>
+              </w:rPr>
+              <w:t>.nombre</w:t>
+            </w:r>
+            <w:proofErr w:type="spellEnd"/>
+            <w:r>
+              <w:rPr>
+                <w:rFonts w:ascii="Arial" w:hAnsi="Arial" w:cs="Arial"/>
+                <w:bCs/>
+                <w:sz w:val="18"/>
+                <w:szCs w:val="18"/>
+                <w:lang w:val="es-MX"/>
+              </w:rPr>
+              <w:t xml:space="preserve"> }}</w:t>
+            </w:r>
+          </w:p>
+        </w:tc>
+      </w:tr>
+      <w:tr>
+        <w:trPr>
+          <w:trHeight w:val="300"/>
+        </w:trPr>
+        <w:tc>
+          <w:tcPr>
+            <w:tcW w:w="9850" w:type="dxa"/>
+          </w:tcPr>
+          <w:p>
+            <w:pPr>
+              <w:jc w:val="both"/>
+              <w:rPr>
+                <w:rFonts w:ascii="Arial" w:hAnsi="Arial" w:cs="Arial"/>
+                <w:bCs/>
+                <w:sz w:val="18"/>
+                <w:szCs w:val="18"/>
+                <w:lang w:val="en-US"/>
+              </w:rPr>
+            </w:pPr>
+            <w:r>
+              <w:rPr>
+                <w:rFonts w:ascii="Arial" w:hAnsi="Arial" w:cs="Arial"/>
+                <w:sz w:val="18"/>
+                <w:szCs w:val="18"/>
+                <w:lang w:val="es-MX"/>
+              </w:rPr>
+              <w:t>{%</w:t>
+            </w:r>
+            <w:proofErr w:type="spellStart"/>
+            <w:r>
+              <w:rPr>
+                <w:rFonts w:ascii="Arial" w:hAnsi="Arial" w:cs="Arial"/>
+                <w:sz w:val="18"/>
+                <w:szCs w:val="18"/>
+                <w:lang w:val="es-MX"/>
+              </w:rPr>
+              <w:t>tr</w:t>
+            </w:r>
+            <w:proofErr w:type="spellEnd"/>
+            <w:r>
+              <w:rPr>
+                <w:rFonts w:ascii="Arial" w:hAnsi="Arial" w:cs="Arial"/>
+                <w:sz w:val="18"/>
+                <w:szCs w:val="18"/>
+                <w:lang w:val="es-MX"/>
+              </w:rPr>
+              <w:t xml:space="preserve"> </w:t>
+            </w:r>
+            <w:proofErr w:type="spellStart"/>
+            <w:r>
+              <w:rPr>
+                <w:rFonts w:ascii="Arial" w:hAnsi="Arial" w:cs="Arial"/>
+                <w:sz w:val="18"/>
+                <w:szCs w:val="18"/>
+                <w:lang w:val="es-MX"/>
+              </w:rPr>
+              <w:t>endfor</w:t>
+            </w:r>
+            <w:proofErr w:type="spellEnd"/>
+            <w:r>
+              <w:rPr>
+                <w:rFonts w:ascii="Arial" w:hAnsi="Arial" w:cs="Arial"/>
+                <w:sz w:val="18"/>
+                <w:szCs w:val="18"/>
+                <w:lang w:val="es-MX"/>
+              </w:rPr>
+              <w:t xml:space="preserve"> </w:t>
+            </w:r>
+            <w:proofErr w:type="gramStart"/>
+            <w:r>
+              <w:rPr>
+                <w:rFonts w:ascii="Arial" w:hAnsi="Arial" w:cs="Arial"/>
+                <w:sz w:val="18"/>
+                <w:szCs w:val="18"/>
+                <w:lang w:val="es-MX"/>
+              </w:rPr>
+              <w:t>%}</w:t>
+            </w:r>
+            <w:r>
+              <w:rPr>
+                <w:rFonts w:ascii="Arial" w:hAnsi="Arial" w:cs="Arial"/>
+                <w:bCs/>
+                <w:sz w:val="18"/>
+                <w:szCs w:val="18"/>
+                <w:lang w:val="en-US"/>
+              </w:rPr>
+              <w:t>{</w:t>
+            </w:r>
+            <w:proofErr w:type="gramEnd"/>
+            <w:r>
+              <w:rPr>
+                <w:rFonts w:ascii="Arial" w:hAnsi="Arial" w:cs="Arial"/>
+                <w:bCs/>
+                <w:sz w:val="18"/>
+                <w:szCs w:val="18"/>
+                <w:lang w:val="en-US"/>
+              </w:rPr>
+              <w:t xml:space="preserve">% </w:t>
+            </w:r>
+            <w:r>
+              <w:rPr>
+                <w:rFonts w:ascii="Arial" w:hAnsi="Arial" w:cs="Arial"/>
+                <w:bCs/>
+                <w:sz w:val="18"/>
+                <w:szCs w:val="18"/>
+                <w:lang w:val="en-US"/>
+              </w:rPr>
+              <w:t>endif</w:t>
+            </w:r>
+            <w:r>
+              <w:rPr>
+                <w:rFonts w:ascii="Arial" w:hAnsi="Arial" w:cs="Arial"/>
+                <w:bCs/>
+                <w:sz w:val="18"/>
+                <w:szCs w:val="18"/>
+                <w:lang w:val="en-US"/>
+              </w:rPr>
+              <w:t xml:space="preserve"> %}</w:t>
+            </w:r>
+          </w:p>
+        </w:tc>
+      </w:tr>
+      <w:tr>
+        <w:trPr>
+          <w:trHeight w:val="300"/>
+        </w:trPr>
+        <w:tc>
+          <w:tcPr>
+            <w:tcW w:w="9850" w:type="dxa"/>
+          </w:tcPr>
+          <w:p>
+            <w:pPr>
+              <w:rPr>
+                <w:rFonts w:ascii="Arial" w:hAnsi="Arial" w:cs="Arial"/>
+                <w:bCs/>
+                <w:sz w:val="18"/>
+                <w:szCs w:val="18"/>
+                <w:lang w:val="en-US"/>
+              </w:rPr>
+            </w:pPr>
+            <w:r>
+              <w:rPr>
+                <w:rFonts w:ascii="Arial" w:hAnsi="Arial" w:cs="Arial"/>
+                <w:bCs/>
+                <w:sz w:val="18"/>
+                <w:szCs w:val="18"/>
+                <w:lang w:val="en-US"/>
+              </w:rPr>
+              <w:t xml:space="preserve">{%tr for </w:t>
+            </w:r>
+            <w:proofErr w:type="spellStart"/>
+            <w:r>
+              <w:rPr>
+                <w:rFonts w:ascii="Arial" w:hAnsi="Arial" w:cs="Arial"/>
+                <w:bCs/>
+                <w:sz w:val="18"/>
+                <w:szCs w:val="18"/>
+                <w:lang w:val="en-US"/>
+              </w:rPr>
+              <w:t>hc</w:t>
+            </w:r>
+            <w:proofErr w:type="spellEnd"/>
+            <w:r>
+              <w:rPr>
+                <w:rFonts w:ascii="Arial" w:hAnsi="Arial" w:cs="Arial"/>
+                <w:bCs/>
+                <w:sz w:val="18"/>
+                <w:szCs w:val="18"/>
+                <w:lang w:val="en-US"/>
+              </w:rPr>
+              <w:t xml:space="preserve"> in </w:t>
+            </w:r>
+            <w:proofErr w:type="spellStart"/>
+            <w:r>
+              <w:rPr>
+                <w:rFonts w:ascii="Arial" w:hAnsi="Arial" w:cs="Arial"/>
+                <w:bCs/>
+                <w:sz w:val="18"/>
+                <w:szCs w:val="18"/>
+                <w:lang w:val="en-US"/>
+              </w:rPr>
+              <w:t>herramientas</w:t>
+            </w:r>
+            <w:proofErr w:type="spellEnd"/>
+            <w:r>
+              <w:rPr>
+                <w:rFonts w:ascii="Arial" w:hAnsi="Arial" w:cs="Arial"/>
+                <w:bCs/>
+                <w:sz w:val="18"/>
+                <w:szCs w:val="18"/>
+                <w:lang w:val="en-US"/>
+              </w:rPr>
+              <w:t xml:space="preserve"> %}</w:t>
+            </w:r>
+          </w:p>
+        </w:tc>
+      </w:tr>
+      <w:tr>
+        <w:trPr>
+          <w:trHeight w:val="300"/>
+        </w:trPr>
+        <w:tc>
+          <w:tcPr>
+            <w:tcW w:w="9850" w:type="dxa"/>
+          </w:tcPr>
+          <w:p>
+            <w:pPr>
+              <w:rPr>
+                <w:rFonts w:ascii="Arial" w:hAnsi="Arial" w:cs="Arial"/>
+                <w:sz w:val="18"/>
+                <w:szCs w:val="18"/>
+                <w:lang w:val="es-MX"/>
+              </w:rPr>
+            </w:pPr>
+            <w:r>
+              <w:rPr>
+                <w:rFonts w:ascii="Arial" w:hAnsi="Arial" w:cs="Arial"/>
+                <w:bCs/>
+                <w:sz w:val="18"/>
+                <w:szCs w:val="18"/>
+                <w:lang w:val="es-MX"/>
+              </w:rPr>
+              <w:t xml:space="preserve">- </w:t>
+            </w:r>
+            <w:proofErr w:type="gramStart"/>
+            <w:r>
+              <w:rPr>
+                <w:rFonts w:ascii="Arial" w:hAnsi="Arial" w:cs="Arial"/>
+                <w:bCs/>
+                <w:sz w:val="18"/>
+                <w:szCs w:val="18"/>
+                <w:lang w:val="es-MX"/>
+              </w:rPr>
+              <w:t xml:space="preserve">{{ </w:t>
+            </w:r>
+            <w:proofErr w:type="spellStart"/>
+            <w:r>
+              <w:rPr>
+                <w:rFonts w:ascii="Arial" w:hAnsi="Arial" w:cs="Arial"/>
+                <w:bCs/>
+                <w:sz w:val="18"/>
+                <w:szCs w:val="18"/>
+                <w:lang w:val="es-MX"/>
+              </w:rPr>
+              <w:t>hc</w:t>
+            </w:r>
+            <w:proofErr w:type="gramEnd"/>
+            <w:r>
+              <w:rPr>
+                <w:rFonts w:ascii="Arial" w:hAnsi="Arial" w:cs="Arial"/>
+                <w:bCs/>
+                <w:sz w:val="18"/>
+                <w:szCs w:val="18"/>
+                <w:lang w:val="es-MX"/>
+              </w:rPr>
+              <w:t>.nombre</w:t>
+            </w:r>
+            <w:proofErr w:type="spellEnd"/>
+            <w:r>
+              <w:rPr>
+                <w:rFonts w:ascii="Arial" w:hAnsi="Arial" w:cs="Arial"/>
+                <w:bCs/>
+                <w:sz w:val="18"/>
+                <w:szCs w:val="18"/>
+                <w:lang w:val="es-MX"/>
+              </w:rPr>
+              <w:t xml:space="preserve"> }}</w:t>
+            </w:r>
+          </w:p>
+        </w:tc>
+      </w:tr>
+      <w:tr>
+        <w:trPr>
+          <w:trHeight w:val="300"/>
+        </w:trPr>
+        <w:tc>
+          <w:tcPr>
+            <w:tcW w:w="9850" w:type="dxa"/>
+          </w:tcPr>
+          <w:p>
+            <w:pPr>
+              <w:rPr>
+                <w:rFonts w:ascii="Arial" w:hAnsi="Arial" w:cs="Arial"/>
+                <w:sz w:val="18"/>
+                <w:szCs w:val="18"/>
+                <w:lang w:val="es-MX"/>
+              </w:rPr>
+            </w:pPr>
+            <w:r>
+              <w:rPr>
+                <w:rFonts w:ascii="Arial" w:hAnsi="Arial" w:cs="Arial"/>
+                <w:sz w:val="18"/>
+                <w:szCs w:val="18"/>
+                <w:lang w:val="es-MX"/>
+              </w:rPr>
+              <w:t>{%</w:t>
+            </w:r>
+            <w:proofErr w:type="spellStart"/>
+            <w:r>
+              <w:rPr>
+                <w:rFonts w:ascii="Arial" w:hAnsi="Arial" w:cs="Arial"/>
+                <w:sz w:val="18"/>
+                <w:szCs w:val="18"/>
+                <w:lang w:val="es-MX"/>
+              </w:rPr>
+              <w:t>tr</w:t>
+            </w:r>
+            <w:proofErr w:type="spellEnd"/>
+            <w:r>
+              <w:rPr>
+                <w:rFonts w:ascii="Arial" w:hAnsi="Arial" w:cs="Arial"/>
+                <w:sz w:val="18"/>
+                <w:szCs w:val="18"/>
+                <w:lang w:val="es-MX"/>
+              </w:rPr>
+              <w:t xml:space="preserve"> </w:t>
+            </w:r>
+            <w:proofErr w:type="spellStart"/>
+            <w:r>
+              <w:rPr>
+                <w:rFonts w:ascii="Arial" w:hAnsi="Arial" w:cs="Arial"/>
+                <w:sz w:val="18"/>
+                <w:szCs w:val="18"/>
+                <w:lang w:val="es-MX"/>
+              </w:rPr>
+              <w:t>endfor</w:t>
+            </w:r>
+            <w:proofErr w:type="spellEnd"/>
+            <w:r>
+              <w:rPr>
+                <w:rFonts w:ascii="Arial" w:hAnsi="Arial" w:cs="Arial"/>
+                <w:sz w:val="18"/>
+                <w:szCs w:val="18"/>
+                <w:lang w:val="es-MX"/>
+              </w:rPr>
+              <w:t xml:space="preserve"> %}</w:t>
+            </w:r>
+          </w:p>
+        </w:tc>
+      </w:tr>
+    </w:tbl>
+    <w:p>
+      <w:pPr>
+        <w:rPr>
+          <w:rFonts w:ascii="Arial" w:hAnsi="Arial" w:cs="Arial"/>
+          <w:b/>
+          <w:sz w:val="18"/>
+          <w:szCs w:val="18"/>
+          <w:u w:val="single"/>
+        </w:rPr>
+      </w:pPr>
+    </w:p>
+    <w:p>
+      <w:pPr>
+        <w:jc w:val="both"/>
+        <w:rPr>
+          <w:rFonts w:ascii="Arial" w:hAnsi="Arial" w:cs="Arial"/>
+          <w:bCs/>
+          <w:sz w:val="18"/>
+          <w:szCs w:val="18"/>
+          <w:lang w:val="es-MX"/>
+        </w:rPr>
+      </w:pPr>
+    </w:p>
+    <w:p>
+      <w:pPr>
         <w:rPr>
           <w:rFonts w:ascii="Arial" w:hAnsi="Arial" w:cs="Arial"/>
           <w:b/>
@@ -1378,7 +2747,18 @@
           <w:szCs w:val="18"/>
           <w:lang w:val="es-MX"/>
         </w:rPr>
-        <w:t>resumen_laboral_text|default</w:t>
+        <w:t>resumen_laboral_text|</w:t>
+      </w:r>
+      <w:proofErr w:type="gramStart"/>
+      <w:r>
+        <w:rPr>
+          <w:rFonts w:ascii="Arial" w:hAnsi="Arial" w:cs="Arial"/>
+          <w:bCs/>
+          <w:sz w:val="18"/>
+          <w:szCs w:val="18"/>
+          <w:lang w:val="es-MX"/>
+        </w:rPr>
+        <w:t>default</w:t>
       </w:r>
       <w:proofErr w:type="spellEnd"/>
       <w:r>
@@ -1389,9 +2769,32 @@
           <w:szCs w:val="18"/>
           <w:lang w:val="es-MX"/>
         </w:rPr>
-        <w:t>('')|</w:t>
+        <w:t>(</w:t>
+      </w:r>
+      <w:proofErr w:type="gramEnd"/>
+      <w:r>
+        <w:rPr>
+          <w:rFonts w:ascii="Arial" w:hAnsi="Arial" w:cs="Arial"/>
+          <w:bCs/>
+          <w:sz w:val="18"/>
+          <w:szCs w:val="18"/>
+          <w:lang w:val="es-MX"/>
+        </w:rPr>
+        <w:t>'</w:t>
+      </w:r>
+      <w:proofErr w:type="gramStart"/>
+      <w:r>
+        <w:rPr>
+          <w:rFonts w:ascii="Arial" w:hAnsi="Arial" w:cs="Arial"/>
+          <w:bCs/>
+          <w:sz w:val="18"/>
+          <w:szCs w:val="18"/>
+          <w:lang w:val="es-MX"/>
+        </w:rPr>
+        <w:t>')|</w:t>
       </w:r>
       <w:proofErr w:type="spellStart"/>
+      <w:proofErr w:type="gramEnd"/>
       <w:r>
         <w:rPr>
           <w:rFonts w:ascii="Arial" w:hAnsi="Arial" w:cs="Arial"/>
@@ -1411,7 +2814,18 @@
           <w:szCs w:val="18"/>
           <w:lang w:val="es-MX"/>
         </w:rPr>
-        <w:t xml:space="preserve"> %}</w:t>
+        <w:t xml:space="preserve"> </w:t>
+      </w:r>
+      <w:proofErr w:type="gramStart"/>
+      <w:r>
+        <w:rPr>
+          <w:rFonts w:ascii="Arial" w:hAnsi="Arial" w:cs="Arial"/>
+          <w:bCs/>
+          <w:sz w:val="18"/>
+          <w:szCs w:val="18"/>
+          <w:lang w:val="es-MX"/>
+        </w:rPr>
+        <w:t>%}</w:t>
       </w:r>
       <w:r>
         <w:rPr>
@@ -1422,7 +2836,19 @@
           <w:u w:val="single"/>
           <w:lang w:val="es-MX"/>
         </w:rPr>
-        <w:t>HISTORIAL PROFESIONAL ADICIONAL</w:t>
+        <w:t>HISTORIAL</w:t>
+      </w:r>
+      <w:proofErr w:type="gramEnd"/>
+      <w:r>
+        <w:rPr>
+          <w:rFonts w:ascii="Arial" w:hAnsi="Arial" w:cs="Arial"/>
+          <w:b/>
+          <w:sz w:val="18"/>
+          <w:szCs w:val="18"/>
+          <w:u w:val="single"/>
+          <w:lang w:val="es-MX"/>
+        </w:rPr>
+        <w:t xml:space="preserve"> PROFESIONAL ADICIONAL</w:t>
       </w:r>
     </w:p>
     <w:p>
@@ -1446,6 +2872,7 @@
           <w:lang w:val="es-MX"/>
         </w:rPr>
       </w:pPr>
+      <w:proofErr w:type="gramStart"/>
       <w:r>
         <w:rPr>
           <w:rFonts w:ascii="Arial" w:hAnsi="Arial" w:cs="Arial"/>
@@ -1465,7 +2892,29 @@
           <w:szCs w:val="18"/>
           <w:lang w:val="es-MX"/>
         </w:rPr>
-        <w:t>periodo_resumen_laboral</w:t>
+        <w:t>periodo</w:t>
+      </w:r>
+      <w:proofErr w:type="gramEnd"/>
+      <w:r>
+        <w:rPr>
+          <w:rFonts w:ascii="Arial" w:hAnsi="Arial" w:cs="Arial"/>
+          <w:bCs/>
+          <w:sz w:val="18"/>
+          <w:szCs w:val="18"/>
+          <w:lang w:val="es-MX"/>
+        </w:rPr>
+        <w:t>_resumen_</w:t>
+      </w:r>
+      <w:proofErr w:type="gramStart"/>
+      <w:r>
+        <w:rPr>
+          <w:rFonts w:ascii="Arial" w:hAnsi="Arial" w:cs="Arial"/>
+          <w:bCs/>
+          <w:sz w:val="18"/>
+          <w:szCs w:val="18"/>
+          <w:lang w:val="es-MX"/>
+        </w:rPr>
+        <w:t>laboral</w:t>
       </w:r>
       <w:proofErr w:type="spellEnd"/>
       <w:r>
@@ -1476,7 +2925,18 @@
           <w:szCs w:val="18"/>
           <w:lang w:val="es-MX"/>
         </w:rPr>
-        <w:t xml:space="preserve"> }}</w:t>
+        <w:t xml:space="preserve"> }</w:t>
+      </w:r>
+      <w:proofErr w:type="gramEnd"/>
+      <w:r>
+        <w:rPr>
+          <w:rFonts w:ascii="Arial" w:hAnsi="Arial" w:cs="Arial"/>
+          <w:bCs/>
+          <w:sz w:val="18"/>
+          <w:szCs w:val="18"/>
+          <w:lang w:val="es-MX"/>
+        </w:rPr>
+        <w:t>}</w:t>
       </w:r>
     </w:p>
     <w:p>
@@ -1501,6 +2961,7 @@
           <w:lang w:val="es-MX"/>
         </w:rPr>
       </w:pPr>
+      <w:proofErr w:type="gramStart"/>
       <w:r>
         <w:rPr>
           <w:rFonts w:ascii="Arial" w:hAnsi="Arial" w:cs="Arial"/>
@@ -1520,7 +2981,29 @@
           <w:szCs w:val="18"/>
           <w:lang w:val="es-MX"/>
         </w:rPr>
-        <w:t>resumen_laboral_text</w:t>
+        <w:t>resumen</w:t>
+      </w:r>
+      <w:proofErr w:type="gramEnd"/>
+      <w:r>
+        <w:rPr>
+          <w:rFonts w:ascii="Arial" w:hAnsi="Arial" w:cs="Arial"/>
+          <w:bCs/>
+          <w:sz w:val="18"/>
+          <w:szCs w:val="18"/>
+          <w:lang w:val="es-MX"/>
+        </w:rPr>
+        <w:t>_laboral_</w:t>
+      </w:r>
+      <w:proofErr w:type="gramStart"/>
+      <w:r>
+        <w:rPr>
+          <w:rFonts w:ascii="Arial" w:hAnsi="Arial" w:cs="Arial"/>
+          <w:bCs/>
+          <w:sz w:val="18"/>
+          <w:szCs w:val="18"/>
+          <w:lang w:val="es-MX"/>
+        </w:rPr>
+        <w:t>text</w:t>
       </w:r>
       <w:proofErr w:type="spellEnd"/>
       <w:r>
@@ -1531,7 +3014,18 @@
           <w:szCs w:val="18"/>
           <w:lang w:val="es-MX"/>
         </w:rPr>
-        <w:t xml:space="preserve"> }}</w:t>
+        <w:t xml:space="preserve"> }</w:t>
+      </w:r>
+      <w:proofErr w:type="gramEnd"/>
+      <w:r>
+        <w:rPr>
+          <w:rFonts w:ascii="Arial" w:hAnsi="Arial" w:cs="Arial"/>
+          <w:bCs/>
+          <w:sz w:val="18"/>
+          <w:szCs w:val="18"/>
+          <w:lang w:val="es-MX"/>
+        </w:rPr>
+        <w:t>}</w:t>
       </w:r>
     </w:p>
     <w:p>
@@ -1644,6 +3138,17 @@
           <w:lang w:val="es-MX"/>
         </w:rPr>
         <w:t>FORMACIÓN ACADÉMICA</w:t>
+      </w:r>
+      <w:r>
+        <w:rPr>
+          <w:rFonts w:ascii="Arial" w:hAnsi="Arial" w:cs="Arial"/>
+          <w:b/>
+          <w:sz w:val="18"/>
+          <w:szCs w:val="18"/>
+          <w:u w:val="single"/>
+          <w:lang w:val="es-MX"/>
+        </w:rPr>
+        <w:t xml:space="preserve"> (COMPETENCIA)</w:t>
       </w:r>
       <w:r>
         <w:rPr>
@@ -1703,6 +3208,7 @@
                 <w:lang w:val="es-MX"/>
               </w:rPr>
             </w:pPr>
+            <w:proofErr w:type="gramStart"/>
             <w:r>
               <w:rPr>
                 <w:rFonts w:ascii="Arial" w:hAnsi="Arial" w:cs="Arial"/>
@@ -1722,7 +3228,29 @@
                 <w:szCs w:val="18"/>
                 <w:lang w:val="es-MX"/>
               </w:rPr>
-              <w:t>estudios_titulo</w:t>
+              <w:t>estudios</w:t>
+            </w:r>
+            <w:proofErr w:type="gramEnd"/>
+            <w:r>
+              <w:rPr>
+                <w:rFonts w:ascii="Arial" w:hAnsi="Arial" w:cs="Arial"/>
+                <w:bCs/>
+                <w:sz w:val="18"/>
+                <w:szCs w:val="18"/>
+                <w:lang w:val="es-MX"/>
+              </w:rPr>
+              <w:t>_</w:t>
+            </w:r>
+            <w:proofErr w:type="gramStart"/>
+            <w:r>
+              <w:rPr>
+                <w:rFonts w:ascii="Arial" w:hAnsi="Arial" w:cs="Arial"/>
+                <w:bCs/>
+                <w:sz w:val="18"/>
+                <w:szCs w:val="18"/>
+                <w:lang w:val="es-MX"/>
+              </w:rPr>
+              <w:t>titulo</w:t>
             </w:r>
             <w:proofErr w:type="spellEnd"/>
             <w:r>
@@ -1733,7 +3261,18 @@
                 <w:szCs w:val="18"/>
                 <w:lang w:val="es-MX"/>
               </w:rPr>
-              <w:t xml:space="preserve"> }}</w:t>
+              <w:t xml:space="preserve"> }</w:t>
+            </w:r>
+            <w:proofErr w:type="gramEnd"/>
+            <w:r>
+              <w:rPr>
+                <w:rFonts w:ascii="Arial" w:hAnsi="Arial" w:cs="Arial"/>
+                <w:bCs/>
+                <w:sz w:val="18"/>
+                <w:szCs w:val="18"/>
+                <w:lang w:val="es-MX"/>
+              </w:rPr>
+              <w:t>}</w:t>
             </w:r>
             <w:r>
               <w:rPr>
@@ -1745,6 +3284,7 @@
               </w:rPr>
               <w:t xml:space="preserve"> - </w:t>
             </w:r>
+            <w:proofErr w:type="gramStart"/>
             <w:r>
               <w:rPr>
                 <w:rFonts w:ascii="Arial" w:hAnsi="Arial" w:cs="Arial"/>
@@ -1764,7 +3304,29 @@
                 <w:szCs w:val="18"/>
                 <w:lang w:val="es-MX"/>
               </w:rPr>
-              <w:t>estudios_periodo</w:t>
+              <w:t>estudios</w:t>
+            </w:r>
+            <w:proofErr w:type="gramEnd"/>
+            <w:r>
+              <w:rPr>
+                <w:rFonts w:ascii="Arial" w:hAnsi="Arial" w:cs="Arial"/>
+                <w:bCs/>
+                <w:sz w:val="18"/>
+                <w:szCs w:val="18"/>
+                <w:lang w:val="es-MX"/>
+              </w:rPr>
+              <w:t>_</w:t>
+            </w:r>
+            <w:proofErr w:type="gramStart"/>
+            <w:r>
+              <w:rPr>
+                <w:rFonts w:ascii="Arial" w:hAnsi="Arial" w:cs="Arial"/>
+                <w:bCs/>
+                <w:sz w:val="18"/>
+                <w:szCs w:val="18"/>
+                <w:lang w:val="es-MX"/>
+              </w:rPr>
+              <w:t>periodo</w:t>
             </w:r>
             <w:proofErr w:type="spellEnd"/>
             <w:r>
@@ -1775,7 +3337,18 @@
                 <w:szCs w:val="18"/>
                 <w:lang w:val="es-MX"/>
               </w:rPr>
-              <w:t xml:space="preserve"> }}</w:t>
+              <w:t xml:space="preserve"> }</w:t>
+            </w:r>
+            <w:proofErr w:type="gramEnd"/>
+            <w:r>
+              <w:rPr>
+                <w:rFonts w:ascii="Arial" w:hAnsi="Arial" w:cs="Arial"/>
+                <w:bCs/>
+                <w:sz w:val="18"/>
+                <w:szCs w:val="18"/>
+                <w:lang w:val="es-MX"/>
+              </w:rPr>
+              <w:t>}</w:t>
             </w:r>
           </w:p>
           <w:p>
@@ -1802,6 +3375,7 @@
                 <w:lang w:val="es-MX"/>
               </w:rPr>
             </w:pPr>
+            <w:proofErr w:type="gramStart"/>
             <w:r>
               <w:rPr>
                 <w:rFonts w:ascii="Arial" w:hAnsi="Arial" w:cs="Arial"/>
@@ -1821,7 +3395,29 @@
                 <w:szCs w:val="18"/>
                 <w:lang w:val="es-MX"/>
               </w:rPr>
-              <w:t>estudios_lugar</w:t>
+              <w:t>estudios</w:t>
+            </w:r>
+            <w:proofErr w:type="gramEnd"/>
+            <w:r>
+              <w:rPr>
+                <w:rFonts w:ascii="Arial" w:hAnsi="Arial" w:cs="Arial"/>
+                <w:bCs/>
+                <w:sz w:val="18"/>
+                <w:szCs w:val="18"/>
+                <w:lang w:val="es-MX"/>
+              </w:rPr>
+              <w:t>_</w:t>
+            </w:r>
+            <w:proofErr w:type="gramStart"/>
+            <w:r>
+              <w:rPr>
+                <w:rFonts w:ascii="Arial" w:hAnsi="Arial" w:cs="Arial"/>
+                <w:bCs/>
+                <w:sz w:val="18"/>
+                <w:szCs w:val="18"/>
+                <w:lang w:val="es-MX"/>
+              </w:rPr>
+              <w:t>lugar</w:t>
             </w:r>
             <w:proofErr w:type="spellEnd"/>
             <w:r>
@@ -1832,7 +3428,18 @@
                 <w:szCs w:val="18"/>
                 <w:lang w:val="es-MX"/>
               </w:rPr>
-              <w:t xml:space="preserve"> }}</w:t>
+              <w:t xml:space="preserve"> }</w:t>
+            </w:r>
+            <w:proofErr w:type="gramEnd"/>
+            <w:r>
+              <w:rPr>
+                <w:rFonts w:ascii="Arial" w:hAnsi="Arial" w:cs="Arial"/>
+                <w:bCs/>
+                <w:sz w:val="18"/>
+                <w:szCs w:val="18"/>
+                <w:lang w:val="es-MX"/>
+              </w:rPr>
+              <w:t>}</w:t>
             </w:r>
           </w:p>
           <w:p>
@@ -1882,6 +3489,7 @@
                 <w:lang w:val="es-MX"/>
               </w:rPr>
             </w:pPr>
+            <w:proofErr w:type="gramStart"/>
             <w:r>
               <w:rPr>
                 <w:rFonts w:ascii="Arial" w:hAnsi="Arial" w:cs="Arial"/>
@@ -1901,7 +3509,29 @@
                 <w:szCs w:val="18"/>
                 <w:lang w:val="es-MX"/>
               </w:rPr>
-              <w:t>no_cedula</w:t>
+              <w:t>no</w:t>
+            </w:r>
+            <w:proofErr w:type="gramEnd"/>
+            <w:r>
+              <w:rPr>
+                <w:rFonts w:ascii="Arial" w:hAnsi="Arial" w:cs="Arial"/>
+                <w:bCs/>
+                <w:sz w:val="18"/>
+                <w:szCs w:val="18"/>
+                <w:lang w:val="es-MX"/>
+              </w:rPr>
+              <w:t>_</w:t>
+            </w:r>
+            <w:proofErr w:type="gramStart"/>
+            <w:r>
+              <w:rPr>
+                <w:rFonts w:ascii="Arial" w:hAnsi="Arial" w:cs="Arial"/>
+                <w:bCs/>
+                <w:sz w:val="18"/>
+                <w:szCs w:val="18"/>
+                <w:lang w:val="es-MX"/>
+              </w:rPr>
+              <w:t>cedula</w:t>
             </w:r>
             <w:proofErr w:type="spellEnd"/>
             <w:r>
@@ -1912,7 +3542,18 @@
                 <w:szCs w:val="18"/>
                 <w:lang w:val="es-MX"/>
               </w:rPr>
-              <w:t xml:space="preserve"> }}</w:t>
+              <w:t xml:space="preserve"> }</w:t>
+            </w:r>
+            <w:proofErr w:type="gramEnd"/>
+            <w:r>
+              <w:rPr>
+                <w:rFonts w:ascii="Arial" w:hAnsi="Arial" w:cs="Arial"/>
+                <w:bCs/>
+                <w:sz w:val="18"/>
+                <w:szCs w:val="18"/>
+                <w:lang w:val="es-MX"/>
+              </w:rPr>
+              <w:t>}</w:t>
             </w:r>
           </w:p>
           <w:p>
@@ -1925,6 +3566,7 @@
                 <w:lang w:val="es-MX"/>
               </w:rPr>
             </w:pPr>
+            <w:proofErr w:type="gramStart"/>
             <w:r>
               <w:rPr>
                 <w:rFonts w:ascii="Arial" w:hAnsi="Arial" w:cs="Arial"/>
@@ -1944,7 +3586,18 @@
                 <w:szCs w:val="18"/>
                 <w:lang w:val="es-MX"/>
               </w:rPr>
-              <w:t>fecha_cedula</w:t>
+              <w:t>fecha</w:t>
+            </w:r>
+            <w:proofErr w:type="gramEnd"/>
+            <w:r>
+              <w:rPr>
+                <w:rFonts w:ascii="Arial" w:hAnsi="Arial" w:cs="Arial"/>
+                <w:bCs/>
+                <w:sz w:val="18"/>
+                <w:szCs w:val="18"/>
+                <w:lang w:val="es-MX"/>
+              </w:rPr>
+              <w:t>_cedula</w:t>
             </w:r>
             <w:proofErr w:type="spellEnd"/>
             <w:r>
@@ -1976,6 +3629,48 @@
       <w:pPr>
         <w:rPr>
           <w:rFonts w:ascii="Arial" w:hAnsi="Arial" w:cs="Arial"/>
+          <w:b/>
+          <w:sz w:val="18"/>
+          <w:szCs w:val="18"/>
+          <w:lang w:val="es-MX"/>
+        </w:rPr>
+      </w:pPr>
+      <w:r>
+        <w:rPr>
+          <w:rFonts w:ascii="Arial" w:hAnsi="Arial" w:cs="Arial"/>
+          <w:b/>
+          <w:sz w:val="18"/>
+          <w:szCs w:val="18"/>
+          <w:lang w:val="es-MX"/>
+        </w:rPr>
+        <w:t>DOMINIO DE HERRAMIENTAS (CERTIFICACIONES Y CURSOS)</w:t>
+      </w:r>
+      <w:r>
+        <w:rPr>
+          <w:rFonts w:ascii="Arial" w:hAnsi="Arial" w:cs="Arial"/>
+          <w:b/>
+          <w:sz w:val="18"/>
+          <w:szCs w:val="18"/>
+          <w:lang w:val="es-MX"/>
+        </w:rPr>
+        <w:t>:</w:t>
+      </w:r>
+    </w:p>
+    <w:p>
+      <w:pPr>
+        <w:rPr>
+          <w:rFonts w:ascii="Arial" w:hAnsi="Arial" w:cs="Arial"/>
+          <w:bCs/>
+          <w:sz w:val="18"/>
+          <w:szCs w:val="18"/>
+          <w:lang w:val="es-MX"/>
+        </w:rPr>
+      </w:pPr>
+    </w:p>
+    <w:p>
+      <w:pPr>
+        <w:rPr>
+          <w:rFonts w:ascii="Arial" w:hAnsi="Arial" w:cs="Arial"/>
           <w:bCs/>
           <w:color w:val="00FF00"/>
           <w:sz w:val="18"/>
@@ -2033,7 +3728,18 @@
           <w:szCs w:val="18"/>
           <w:lang w:val="es-MX"/>
         </w:rPr>
-        <w:t xml:space="preserve"> %}</w:t>
+        <w:t xml:space="preserve"> </w:t>
+      </w:r>
+      <w:proofErr w:type="gramStart"/>
+      <w:r>
+        <w:rPr>
+          <w:rFonts w:ascii="Arial" w:hAnsi="Arial" w:cs="Arial"/>
+          <w:bCs/>
+          <w:sz w:val="18"/>
+          <w:szCs w:val="18"/>
+          <w:lang w:val="es-MX"/>
+        </w:rPr>
+        <w:t>%}</w:t>
       </w:r>
       <w:r>
         <w:rPr>
@@ -2047,6 +3753,7 @@
         </w:rPr>
         <w:t>CERTIFICACIONES</w:t>
       </w:r>
+      <w:proofErr w:type="gramEnd"/>
     </w:p>
     <w:p>
       <w:pPr>
@@ -2173,7 +3880,18 @@
                 <w:szCs w:val="18"/>
                 <w:lang w:val="es-MX" w:eastAsia="es-ES"/>
               </w:rPr>
-              <w:t xml:space="preserve">- {{ </w:t>
+              <w:t xml:space="preserve">- </w:t>
+            </w:r>
+            <w:proofErr w:type="gramStart"/>
+            <w:r>
+              <w:rPr>
+                <w:rFonts w:ascii="Arial" w:eastAsia="Times New Roman" w:hAnsi="Arial" w:cs="Arial"/>
+                <w:bCs/>
+                <w:sz w:val="18"/>
+                <w:szCs w:val="18"/>
+                <w:lang w:val="es-MX" w:eastAsia="es-ES"/>
+              </w:rPr>
+              <w:t xml:space="preserve">{{ </w:t>
             </w:r>
             <w:proofErr w:type="spellStart"/>
             <w:r>
@@ -2184,7 +3902,18 @@
                 <w:szCs w:val="18"/>
                 <w:lang w:val="es-MX" w:eastAsia="es-ES"/>
               </w:rPr>
-              <w:t>cert.nombre</w:t>
+              <w:t>cert</w:t>
+            </w:r>
+            <w:proofErr w:type="gramEnd"/>
+            <w:r>
+              <w:rPr>
+                <w:rFonts w:ascii="Arial" w:eastAsia="Times New Roman" w:hAnsi="Arial" w:cs="Arial"/>
+                <w:bCs/>
+                <w:sz w:val="18"/>
+                <w:szCs w:val="18"/>
+                <w:lang w:val="es-MX" w:eastAsia="es-ES"/>
+              </w:rPr>
+              <w:t>.nombre</w:t>
             </w:r>
             <w:proofErr w:type="spellEnd"/>
             <w:r>
@@ -2212,6 +3941,7 @@
                 <w:lang w:val="es-MX"/>
               </w:rPr>
             </w:pPr>
+            <w:proofErr w:type="gramStart"/>
             <w:r>
               <w:rPr>
                 <w:rFonts w:ascii="Arial" w:hAnsi="Arial" w:cs="Arial"/>
@@ -2229,7 +3959,17 @@
                 <w:szCs w:val="18"/>
                 <w:lang w:val="es-MX"/>
               </w:rPr>
-              <w:t>cert.anio</w:t>
+              <w:t>cert</w:t>
+            </w:r>
+            <w:proofErr w:type="gramEnd"/>
+            <w:r>
+              <w:rPr>
+                <w:rFonts w:ascii="Arial" w:hAnsi="Arial" w:cs="Arial"/>
+                <w:sz w:val="18"/>
+                <w:szCs w:val="18"/>
+                <w:lang w:val="es-MX"/>
+              </w:rPr>
+              <w:t>.anio</w:t>
             </w:r>
             <w:proofErr w:type="spellEnd"/>
             <w:r>
@@ -2384,7 +4124,18 @@
           <w:szCs w:val="18"/>
           <w:lang w:val="en-US"/>
         </w:rPr>
-        <w:t xml:space="preserve"> %}</w:t>
+        <w:t xml:space="preserve"> </w:t>
+      </w:r>
+      <w:proofErr w:type="gramStart"/>
+      <w:r>
+        <w:rPr>
+          <w:rFonts w:ascii="Arial" w:hAnsi="Arial" w:cs="Arial"/>
+          <w:bCs/>
+          <w:sz w:val="18"/>
+          <w:szCs w:val="18"/>
+          <w:lang w:val="en-US"/>
+        </w:rPr>
+        <w:t>%}</w:t>
       </w:r>
       <w:r>
         <w:rPr>
@@ -2394,7 +4145,18 @@
           <w:szCs w:val="18"/>
           <w:lang w:val="en-US"/>
         </w:rPr>
-        <w:t xml:space="preserve">{% if </w:t>
+        <w:t>{</w:t>
+      </w:r>
+      <w:proofErr w:type="gramEnd"/>
+      <w:r>
+        <w:rPr>
+          <w:rFonts w:ascii="Arial" w:hAnsi="Arial" w:cs="Arial"/>
+          <w:bCs/>
+          <w:sz w:val="18"/>
+          <w:szCs w:val="18"/>
+          <w:lang w:val="en-US"/>
+        </w:rPr>
+        <w:t xml:space="preserve">% if </w:t>
       </w:r>
       <w:proofErr w:type="spellStart"/>
       <w:r>
@@ -2416,7 +4178,18 @@
           <w:szCs w:val="18"/>
           <w:lang w:val="en-US"/>
         </w:rPr>
-        <w:t xml:space="preserve"> %}</w:t>
+        <w:t xml:space="preserve"> </w:t>
+      </w:r>
+      <w:proofErr w:type="gramStart"/>
+      <w:r>
+        <w:rPr>
+          <w:rFonts w:ascii="Arial" w:hAnsi="Arial" w:cs="Arial"/>
+          <w:bCs/>
+          <w:sz w:val="18"/>
+          <w:szCs w:val="18"/>
+          <w:lang w:val="en-US"/>
+        </w:rPr>
+        <w:t>%}</w:t>
       </w:r>
       <w:r>
         <w:rPr>
@@ -2430,6 +4203,7 @@
         </w:rPr>
         <w:t>CURSOS</w:t>
       </w:r>
+      <w:proofErr w:type="gramEnd"/>
     </w:p>
     <w:p>
       <w:pPr>
@@ -2537,7 +4311,18 @@
                 <w:szCs w:val="18"/>
                 <w:lang w:val="es-MX"/>
               </w:rPr>
-              <w:t xml:space="preserve">- {{ </w:t>
+              <w:t xml:space="preserve">- </w:t>
+            </w:r>
+            <w:proofErr w:type="gramStart"/>
+            <w:r>
+              <w:rPr>
+                <w:rFonts w:ascii="Arial" w:hAnsi="Arial" w:cs="Arial"/>
+                <w:bCs/>
+                <w:sz w:val="18"/>
+                <w:szCs w:val="18"/>
+                <w:lang w:val="es-MX"/>
+              </w:rPr>
+              <w:t xml:space="preserve">{{ </w:t>
             </w:r>
             <w:proofErr w:type="spellStart"/>
             <w:r>
@@ -2550,6 +4335,7 @@
               </w:rPr>
               <w:t>cur</w:t>
             </w:r>
+            <w:proofErr w:type="gramEnd"/>
             <w:r>
               <w:rPr>
                 <w:rFonts w:ascii="Arial" w:hAnsi="Arial" w:cs="Arial"/>
@@ -2808,6 +4594,7 @@
                 <w:lang w:val="es-MX"/>
               </w:rPr>
             </w:pPr>
+            <w:proofErr w:type="gramStart"/>
             <w:r>
               <w:rPr>
                 <w:b/>
@@ -2816,7 +4603,18 @@
                 <w:szCs w:val="18"/>
                 <w:lang w:val="es-MX"/>
               </w:rPr>
-              <w:t>{{ nombre }}</w:t>
+              <w:t>{{ nombre</w:t>
+            </w:r>
+            <w:proofErr w:type="gramEnd"/>
+            <w:r>
+              <w:rPr>
+                <w:b/>
+                <w:bCs/>
+                <w:sz w:val="18"/>
+                <w:szCs w:val="18"/>
+                <w:lang w:val="es-MX"/>
+              </w:rPr>
+              <w:t xml:space="preserve"> }}</w:t>
             </w:r>
           </w:p>
           <w:p>
@@ -2830,6 +4628,7 @@
                 <w:lang w:val="es-MX"/>
               </w:rPr>
             </w:pPr>
+            <w:proofErr w:type="gramStart"/>
             <w:r>
               <w:rPr>
                 <w:b/>
@@ -2849,7 +4648,29 @@
                 <w:szCs w:val="18"/>
                 <w:lang w:val="es-MX"/>
               </w:rPr>
-              <w:t>rol_propuesto</w:t>
+              <w:t>rol</w:t>
+            </w:r>
+            <w:proofErr w:type="gramEnd"/>
+            <w:r>
+              <w:rPr>
+                <w:b/>
+                <w:bCs/>
+                <w:sz w:val="18"/>
+                <w:szCs w:val="18"/>
+                <w:lang w:val="es-MX"/>
+              </w:rPr>
+              <w:t>_</w:t>
+            </w:r>
+            <w:proofErr w:type="gramStart"/>
+            <w:r>
+              <w:rPr>
+                <w:b/>
+                <w:bCs/>
+                <w:sz w:val="18"/>
+                <w:szCs w:val="18"/>
+                <w:lang w:val="es-MX"/>
+              </w:rPr>
+              <w:t>propuesto</w:t>
             </w:r>
             <w:proofErr w:type="spellEnd"/>
             <w:r>
@@ -2860,7 +4681,18 @@
                 <w:szCs w:val="18"/>
                 <w:lang w:val="es-MX"/>
               </w:rPr>
-              <w:t xml:space="preserve"> }}</w:t>
+              <w:t xml:space="preserve"> }</w:t>
+            </w:r>
+            <w:proofErr w:type="gramEnd"/>
+            <w:r>
+              <w:rPr>
+                <w:b/>
+                <w:bCs/>
+                <w:sz w:val="18"/>
+                <w:szCs w:val="18"/>
+                <w:lang w:val="es-MX"/>
+              </w:rPr>
+              <w:t>}</w:t>
             </w:r>
           </w:p>
           <w:p>
@@ -8415,21 +10247,6 @@
 </file>
 
 <file path=customXml/item1.xml><?xml version="1.0" encoding="utf-8"?>
-<b:Sources xmlns:b="http://schemas.openxmlformats.org/officeDocument/2006/bibliography" xmlns="http://schemas.openxmlformats.org/officeDocument/2006/bibliography" SelectedStyle="\APASixthEditionOfficeOnline.xsl" StyleName="APA" Version="6"/>
-</file>
-
-<file path=customXml/item2.xml><?xml version="1.0" encoding="utf-8"?>
-<p:properties xmlns:p="http://schemas.microsoft.com/office/2006/metadata/properties" xmlns:xsi="http://www.w3.org/2001/XMLSchema-instance" xmlns:pc="http://schemas.microsoft.com/office/infopath/2007/PartnerControls">
-  <documentManagement>
-    <lcf76f155ced4ddcb4097134ff3c332f xmlns="458c8650-8b2e-4de5-be2b-3b5e20f9203e">
-      <Terms xmlns="http://schemas.microsoft.com/office/infopath/2007/PartnerControls"/>
-    </lcf76f155ced4ddcb4097134ff3c332f>
-    <TaxCatchAll xmlns="0ec1683b-1f09-407c-8792-a5a8bc579d9d"/>
-  </documentManagement>
-</p:properties>
-</file>
-
-<file path=customXml/item3.xml><?xml version="1.0" encoding="utf-8"?>
 <ct:contentTypeSchema xmlns:ct="http://schemas.microsoft.com/office/2006/metadata/contentType" xmlns:ma="http://schemas.microsoft.com/office/2006/metadata/properties/metaAttributes" ct:_="" ma:_="" ma:contentTypeName="Document" ma:contentTypeID="0x010100AA01E1029091DE488084A5A2D9C24E74" ma:contentTypeVersion="10" ma:contentTypeDescription="Create a new document." ma:contentTypeScope="" ma:versionID="fa224b1e2ea5aaa53b64c3b4b1d435b1">
   <xsd:schema xmlns:xsd="http://www.w3.org/2001/XMLSchema" xmlns:xs="http://www.w3.org/2001/XMLSchema" xmlns:p="http://schemas.microsoft.com/office/2006/metadata/properties" xmlns:ns2="458c8650-8b2e-4de5-be2b-3b5e20f9203e" xmlns:ns3="0ec1683b-1f09-407c-8792-a5a8bc579d9d" targetNamespace="http://schemas.microsoft.com/office/2006/metadata/properties" ma:root="true" ma:fieldsID="3f0568638764530331fbee8047bb9098" ns2:_="" ns3:_="">
     <xsd:import namespace="458c8650-8b2e-4de5-be2b-3b5e20f9203e"/>
@@ -8618,6 +10435,21 @@
 </ct:contentTypeSchema>
 </file>
 
+<file path=customXml/item2.xml><?xml version="1.0" encoding="utf-8"?>
+<p:properties xmlns:p="http://schemas.microsoft.com/office/2006/metadata/properties" xmlns:xsi="http://www.w3.org/2001/XMLSchema-instance" xmlns:pc="http://schemas.microsoft.com/office/infopath/2007/PartnerControls">
+  <documentManagement>
+    <lcf76f155ced4ddcb4097134ff3c332f xmlns="458c8650-8b2e-4de5-be2b-3b5e20f9203e">
+      <Terms xmlns="http://schemas.microsoft.com/office/infopath/2007/PartnerControls"/>
+    </lcf76f155ced4ddcb4097134ff3c332f>
+    <TaxCatchAll xmlns="0ec1683b-1f09-407c-8792-a5a8bc579d9d"/>
+  </documentManagement>
+</p:properties>
+</file>
+
+<file path=customXml/item3.xml><?xml version="1.0" encoding="utf-8"?>
+<b:Sources xmlns:b="http://schemas.openxmlformats.org/officeDocument/2006/bibliography" xmlns="http://schemas.openxmlformats.org/officeDocument/2006/bibliography" SelectedStyle="\APASixthEditionOfficeOnline.xsl" StyleName="APA" Version="6"/>
+</file>
+
 <file path=customXml/item4.xml><?xml version="1.0" encoding="utf-8"?>
 <?mso-contentType ?>
 <FormTemplates xmlns="http://schemas.microsoft.com/sharepoint/v3/contenttype/forms">
@@ -8628,25 +10460,6 @@
 </file>
 
 <file path=customXml/itemProps1.xml><?xml version="1.0" encoding="utf-8"?>
-<ds:datastoreItem xmlns:ds="http://schemas.openxmlformats.org/officeDocument/2006/customXml" ds:itemID="{4BB9A27A-6211-48E6-B3D1-1ED5E2EAD372}">
-  <ds:schemaRefs>
-    <ds:schemaRef ds:uri="http://schemas.openxmlformats.org/officeDocument/2006/bibliography"/>
-  </ds:schemaRefs>
-</ds:datastoreItem>
-</file>
-
-<file path=customXml/itemProps2.xml><?xml version="1.0" encoding="utf-8"?>
-<ds:datastoreItem xmlns:ds="http://schemas.openxmlformats.org/officeDocument/2006/customXml" ds:itemID="{D3A3C24A-BB39-4937-B831-24AA124EAA87}">
-  <ds:schemaRefs>
-    <ds:schemaRef ds:uri="http://schemas.microsoft.com/office/2006/metadata/properties"/>
-    <ds:schemaRef ds:uri="http://schemas.microsoft.com/office/infopath/2007/PartnerControls"/>
-    <ds:schemaRef ds:uri="458c8650-8b2e-4de5-be2b-3b5e20f9203e"/>
-    <ds:schemaRef ds:uri="0ec1683b-1f09-407c-8792-a5a8bc579d9d"/>
-  </ds:schemaRefs>
-</ds:datastoreItem>
-</file>
-
-<file path=customXml/itemProps3.xml><?xml version="1.0" encoding="utf-8"?>
 <ds:datastoreItem xmlns:ds="http://schemas.openxmlformats.org/officeDocument/2006/customXml" ds:itemID="{6EE546D2-1DFA-4BBD-AF1C-4C842A1F8073}">
   <ds:schemaRefs>
     <ds:schemaRef ds:uri="http://schemas.microsoft.com/office/2006/metadata/contentType"/>
@@ -8665,6 +10478,25 @@
 </ds:datastoreItem>
 </file>
 
+<file path=customXml/itemProps2.xml><?xml version="1.0" encoding="utf-8"?>
+<ds:datastoreItem xmlns:ds="http://schemas.openxmlformats.org/officeDocument/2006/customXml" ds:itemID="{D3A3C24A-BB39-4937-B831-24AA124EAA87}">
+  <ds:schemaRefs>
+    <ds:schemaRef ds:uri="http://schemas.microsoft.com/office/2006/metadata/properties"/>
+    <ds:schemaRef ds:uri="http://schemas.microsoft.com/office/infopath/2007/PartnerControls"/>
+    <ds:schemaRef ds:uri="458c8650-8b2e-4de5-be2b-3b5e20f9203e"/>
+    <ds:schemaRef ds:uri="0ec1683b-1f09-407c-8792-a5a8bc579d9d"/>
+  </ds:schemaRefs>
+</ds:datastoreItem>
+</file>
+
+<file path=customXml/itemProps3.xml><?xml version="1.0" encoding="utf-8"?>
+<ds:datastoreItem xmlns:ds="http://schemas.openxmlformats.org/officeDocument/2006/customXml" ds:itemID="{4BB9A27A-6211-48E6-B3D1-1ED5E2EAD372}">
+  <ds:schemaRefs>
+    <ds:schemaRef ds:uri="http://schemas.openxmlformats.org/officeDocument/2006/bibliography"/>
+  </ds:schemaRefs>
+</ds:datastoreItem>
+</file>
+
 <file path=customXml/itemProps4.xml><?xml version="1.0" encoding="utf-8"?>
 <ds:datastoreItem xmlns:ds="http://schemas.openxmlformats.org/officeDocument/2006/customXml" ds:itemID="{51241304-2C43-44E6-B26F-77C42016271C}">
   <ds:schemaRefs>

</xml_diff>